<commit_message>
docs: perbarui nama repositori dan link github di README dan Word docx
</commit_message>
<xml_diff>
--- a/docs/UTS_RekayasaWeb_IlhamPangestu_251011700008.docx
+++ b/docs/UTS_RekayasaWeb_IlhamPangestu_251011700008.docx
@@ -1,6 +1,6 @@
 
 <file path=word/document.xml><?xml version="1.0" encoding="UTF-8" standalone="yes"?>
-<w:document xmlns:ve="http://schemas.openxmlformats.org/markup-compatibility/2006" xmlns:o="urn:schemas-microsoft-com:office:office" xmlns:r="http://schemas.openxmlformats.org/officeDocument/2006/relationships" xmlns:m="http://schemas.openxmlformats.org/officeDocument/2006/math" xmlns:v="urn:schemas-microsoft-com:vml" xmlns:wp="http://schemas.openxmlformats.org/drawingml/2006/wordprocessingDrawing" xmlns:w10="urn:schemas-microsoft-com:office:word" xmlns:w="http://schemas.openxmlformats.org/wordprocessingml/2006/main" xmlns:wne="http://schemas.microsoft.com/office/word/2006/wordml"><w:body><w:p><w:pPr><w:jc w:val="center"/><w:spacing w:after="120"/></w:pPr><w:r><w:rPr><w:rFonts w:ascii="Calibri" w:hAnsi="Calibri" w:eastAsia="Calibri" w:cs="Calibri"/><w:sz w:val="26"/><w:szCs w:val="26"/><w:b w:val="1"/><w:bCs w:val="1"/></w:rPr><w:t xml:space="preserve">YAYASAN SASMITA JAYA</w:t></w:r></w:p><w:p><w:pPr><w:jc w:val="center"/><w:spacing w:after="120"/></w:pPr><w:r><w:rPr><w:rFonts w:ascii="Calibri" w:hAnsi="Calibri" w:eastAsia="Calibri" w:cs="Calibri"/><w:color w:val="003366"/><w:sz w:val="32"/><w:szCs w:val="32"/><w:b w:val="1"/><w:bCs w:val="1"/></w:rPr><w:t xml:space="preserve">UNIVERSITAS PAMULANG</w:t></w:r></w:p><w:p><w:pPr><w:jc w:val="center"/><w:spacing w:after="120"/></w:pPr><w:r><w:rPr><w:rFonts w:ascii="Calibri" w:hAnsi="Calibri" w:eastAsia="Calibri" w:cs="Calibri"/><w:color w:val="555555"/><w:sz w:val="20"/><w:szCs w:val="20"/><w:b w:val="1"/><w:bCs w:val="1"/></w:rPr><w:t xml:space="preserve">FAKULTAS ILMU KOMPUTER - PROGRAM STUDI SISTEM INFORMASI S-1</w:t></w:r></w:p><w:p><w:pPr><w:jc w:val="center"/><w:spacing w:after="120"/></w:pPr><w:r><w:rPr><w:rFonts w:ascii="Calibri" w:hAnsi="Calibri" w:eastAsia="Calibri" w:cs="Calibri"/><w:color w:val="777777"/><w:sz w:val="18"/><w:szCs w:val="18"/></w:rPr><w:t xml:space="preserve">Jl. Puspitek Raya No. 10, Serpong - Tangerang Selatan | www.unpam.ac.id</w:t></w:r></w:p><w:p><w:pPr/><w:r><w:pict><v:shape id="_x0000_s1005" type="#_x0000_t32" style="width:480pt; height:0pt; margin-left:0pt; margin-top:0pt; mso-position-horizontal:left; mso-position-vertical:top; mso-position-horizontal-relative:char; mso-position-vertical-relative:line;"><w10:wrap type="inline"/><v:stroke weight="2pt" color="003366"/></v:shape></w:pict></w:r></w:p><w:p/><w:p><w:pPr><w:jc w:val="center"/><w:spacing w:after="120"/></w:pPr><w:r><w:rPr><w:rFonts w:ascii="Calibri" w:hAnsi="Calibri" w:eastAsia="Calibri" w:cs="Calibri"/><w:color w:val="003366"/><w:sz w:val="30"/><w:szCs w:val="30"/><w:b w:val="1"/><w:bCs w:val="1"/></w:rPr><w:t xml:space="preserve">LAPORAN DOKUMENTASI HASIL APLIKASI WEB</w:t></w:r></w:p><w:p><w:pPr><w:jc w:val="center"/><w:spacing w:after="120"/></w:pPr><w:r><w:rPr><w:rFonts w:ascii="Calibri" w:hAnsi="Calibri" w:eastAsia="Calibri" w:cs="Calibri"/><w:sz w:val="24"/><w:szCs w:val="24"/><w:b w:val="1"/><w:bCs w:val="1"/></w:rPr><w:t xml:space="preserve">UJIAN TENGAH SEMESTER (UTS) SEMESTER GANJIL T.A. 2026/2027</w:t></w:r></w:p><w:p/><w:p><w:pPr><w:pStyle w:val="Heading2"/></w:pPr><w:bookmarkStart w:id="0" w:name="_Toc0"/><w:r><w:t>A. Identitas Mahasiswa & Penugasan</w:t></w:r><w:bookmarkEnd w:id="0"/></w:p><w:tbl><w:tblGrid><w:gridCol w:w="3000" w:type="dxa"/><w:gridCol w:w="5200" w:type="dxa"/></w:tblGrid><w:tblPr><w:tblStyle w:val="IdentityTable"/></w:tblPr><w:tr><w:trPr/><w:tc><w:tcPr><w:tcW w:w="3000" w:type="dxa"/><w:shd w:val="clear" w:fill="F1F5F9"/><w:noWrap/></w:tcPr><w:p><w:pPr/><w:r><w:rPr><w:rFonts w:ascii="Calibri" w:hAnsi="Calibri" w:eastAsia="Calibri" w:cs="Calibri"/><w:color w:val="111111"/><w:sz w:val="22"/><w:szCs w:val="22"/><w:b w:val="1"/><w:bCs w:val="1"/></w:rPr><w:t xml:space="preserve">Nama Lengkap</w:t></w:r></w:p></w:tc><w:tc><w:tcPr><w:tcW w:w="5200" w:type="dxa"/><w:noWrap/></w:tcPr><w:p><w:pPr/><w:r><w:rPr><w:rFonts w:ascii="Calibri" w:hAnsi="Calibri" w:eastAsia="Calibri" w:cs="Calibri"/><w:color w:val="333333"/><w:sz w:val="22"/><w:szCs w:val="22"/></w:rPr><w:t xml:space="preserve">Ilham Pangestu</w:t></w:r></w:p></w:tc></w:tr><w:tr><w:trPr/><w:tc><w:tcPr><w:tcW w:w="3000" w:type="dxa"/><w:shd w:val="clear" w:fill="F1F5F9"/><w:noWrap/></w:tcPr><w:p><w:pPr/><w:r><w:rPr><w:rFonts w:ascii="Calibri" w:hAnsi="Calibri" w:eastAsia="Calibri" w:cs="Calibri"/><w:color w:val="111111"/><w:sz w:val="22"/><w:szCs w:val="22"/><w:b w:val="1"/><w:bCs w:val="1"/></w:rPr><w:t xml:space="preserve">Nomor Induk Mahasiswa (NIM)</w:t></w:r></w:p></w:tc><w:tc><w:tcPr><w:tcW w:w="5200" w:type="dxa"/><w:noWrap/></w:tcPr><w:p><w:pPr/><w:r><w:rPr><w:rFonts w:ascii="Calibri" w:hAnsi="Calibri" w:eastAsia="Calibri" w:cs="Calibri"/><w:color w:val="333333"/><w:sz w:val="22"/><w:szCs w:val="22"/></w:rPr><w:t xml:space="preserve">251011700008</w:t></w:r></w:p></w:tc></w:tr><w:tr><w:trPr/><w:tc><w:tcPr><w:tcW w:w="3000" w:type="dxa"/><w:shd w:val="clear" w:fill="F1F5F9"/><w:noWrap/></w:tcPr><w:p><w:pPr/><w:r><w:rPr><w:rFonts w:ascii="Calibri" w:hAnsi="Calibri" w:eastAsia="Calibri" w:cs="Calibri"/><w:color w:val="111111"/><w:sz w:val="22"/><w:szCs w:val="22"/><w:b w:val="1"/><w:bCs w:val="1"/></w:rPr><w:t xml:space="preserve">1 Digit Terakhir NIM</w:t></w:r></w:p></w:tc><w:tc><w:tcPr><w:tcW w:w="5200" w:type="dxa"/><w:noWrap/></w:tcPr><w:p><w:pPr/><w:r><w:rPr><w:rFonts w:ascii="Calibri" w:hAnsi="Calibri" w:eastAsia="Calibri" w:cs="Calibri"/><w:color w:val="333333"/><w:sz w:val="22"/><w:szCs w:val="22"/></w:rPr><w:t xml:space="preserve">8</w:t></w:r></w:p></w:tc></w:tr><w:tr><w:trPr/><w:tc><w:tcPr><w:tcW w:w="3000" w:type="dxa"/><w:shd w:val="clear" w:fill="F1F5F9"/><w:noWrap/></w:tcPr><w:p><w:pPr/><w:r><w:rPr><w:rFonts w:ascii="Calibri" w:hAnsi="Calibri" w:eastAsia="Calibri" w:cs="Calibri"/><w:color w:val="111111"/><w:sz w:val="22"/><w:szCs w:val="22"/><w:b w:val="1"/><w:bCs w:val="1"/></w:rPr><w:t xml:space="preserve">Kelas</w:t></w:r></w:p></w:tc><w:tc><w:tcPr><w:tcW w:w="5200" w:type="dxa"/><w:noWrap/></w:tcPr><w:p><w:pPr/><w:r><w:rPr><w:rFonts w:ascii="Calibri" w:hAnsi="Calibri" w:eastAsia="Calibri" w:cs="Calibri"/><w:color w:val="333333"/><w:sz w:val="22"/><w:szCs w:val="22"/></w:rPr><w:t xml:space="preserve">03SIFE003</w:t></w:r></w:p></w:tc></w:tr><w:tr><w:trPr/><w:tc><w:tcPr><w:tcW w:w="3000" w:type="dxa"/><w:shd w:val="clear" w:fill="F1F5F9"/><w:noWrap/></w:tcPr><w:p><w:pPr/><w:r><w:rPr><w:rFonts w:ascii="Calibri" w:hAnsi="Calibri" w:eastAsia="Calibri" w:cs="Calibri"/><w:color w:val="111111"/><w:sz w:val="22"/><w:szCs w:val="22"/><w:b w:val="1"/><w:bCs w:val="1"/></w:rPr><w:t xml:space="preserve">Program Studi</w:t></w:r></w:p></w:tc><w:tc><w:tcPr><w:tcW w:w="5200" w:type="dxa"/><w:noWrap/></w:tcPr><w:p><w:pPr/><w:r><w:rPr><w:rFonts w:ascii="Calibri" w:hAnsi="Calibri" w:eastAsia="Calibri" w:cs="Calibri"/><w:color w:val="333333"/><w:sz w:val="22"/><w:szCs w:val="22"/></w:rPr><w:t xml:space="preserve">Sistem Informasi S-1</w:t></w:r></w:p></w:tc></w:tr><w:tr><w:trPr/><w:tc><w:tcPr><w:tcW w:w="3000" w:type="dxa"/><w:shd w:val="clear" w:fill="F1F5F9"/><w:noWrap/></w:tcPr><w:p><w:pPr/><w:r><w:rPr><w:rFonts w:ascii="Calibri" w:hAnsi="Calibri" w:eastAsia="Calibri" w:cs="Calibri"/><w:color w:val="111111"/><w:sz w:val="22"/><w:szCs w:val="22"/><w:b w:val="1"/><w:bCs w:val="1"/></w:rPr><w:t xml:space="preserve">Fakultas</w:t></w:r></w:p></w:tc><w:tc><w:tcPr><w:tcW w:w="5200" w:type="dxa"/><w:noWrap/></w:tcPr><w:p><w:pPr/><w:r><w:rPr><w:rFonts w:ascii="Calibri" w:hAnsi="Calibri" w:eastAsia="Calibri" w:cs="Calibri"/><w:color w:val="333333"/><w:sz w:val="22"/><w:szCs w:val="22"/></w:rPr><w:t xml:space="preserve">Ilmu Komputer</w:t></w:r></w:p></w:tc></w:tr><w:tr><w:trPr/><w:tc><w:tcPr><w:tcW w:w="3000" w:type="dxa"/><w:shd w:val="clear" w:fill="F1F5F9"/><w:noWrap/></w:tcPr><w:p><w:pPr/><w:r><w:rPr><w:rFonts w:ascii="Calibri" w:hAnsi="Calibri" w:eastAsia="Calibri" w:cs="Calibri"/><w:color w:val="111111"/><w:sz w:val="22"/><w:szCs w:val="22"/><w:b w:val="1"/><w:bCs w:val="1"/></w:rPr><w:t xml:space="preserve">Mata Kuliah</w:t></w:r></w:p></w:tc><w:tc><w:tcPr><w:tcW w:w="5200" w:type="dxa"/><w:noWrap/></w:tcPr><w:p><w:pPr/><w:r><w:rPr><w:rFonts w:ascii="Calibri" w:hAnsi="Calibri" w:eastAsia="Calibri" w:cs="Calibri"/><w:color w:val="333333"/><w:sz w:val="22"/><w:szCs w:val="22"/></w:rPr><w:t xml:space="preserve">Rekayasa Web</w:t></w:r></w:p></w:tc></w:tr><w:tr><w:trPr/><w:tc><w:tcPr><w:tcW w:w="3000" w:type="dxa"/><w:shd w:val="clear" w:fill="F1F5F9"/><w:noWrap/></w:tcPr><w:p><w:pPr/><w:r><w:rPr><w:rFonts w:ascii="Calibri" w:hAnsi="Calibri" w:eastAsia="Calibri" w:cs="Calibri"/><w:color w:val="111111"/><w:sz w:val="22"/><w:szCs w:val="22"/><w:b w:val="1"/><w:bCs w:val="1"/></w:rPr><w:t xml:space="preserve">Dosen Pengampu</w:t></w:r></w:p></w:tc><w:tc><w:tcPr><w:tcW w:w="5200" w:type="dxa"/><w:noWrap/></w:tcPr><w:p><w:pPr/><w:r><w:rPr><w:rFonts w:ascii="Calibri" w:hAnsi="Calibri" w:eastAsia="Calibri" w:cs="Calibri"/><w:color w:val="333333"/><w:sz w:val="22"/><w:szCs w:val="22"/></w:rPr><w:t xml:space="preserve">Afif Efendi, M.Kom.</w:t></w:r></w:p></w:tc></w:tr><w:tr><w:trPr/><w:tc><w:tcPr><w:tcW w:w="3000" w:type="dxa"/><w:shd w:val="clear" w:fill="F1F5F9"/><w:noWrap/></w:tcPr><w:p><w:pPr/><w:r><w:rPr><w:rFonts w:ascii="Calibri" w:hAnsi="Calibri" w:eastAsia="Calibri" w:cs="Calibri"/><w:color w:val="111111"/><w:sz w:val="22"/><w:szCs w:val="22"/><w:b w:val="1"/><w:bCs w:val="1"/></w:rPr><w:t xml:space="preserve">Tema Proyek (Sesuai Digit NIM 8)</w:t></w:r></w:p></w:tc><w:tc><w:tcPr><w:tcW w:w="5200" w:type="dxa"/><w:noWrap/></w:tcPr><w:p><w:pPr/><w:r><w:rPr><w:rFonts w:ascii="Calibri" w:hAnsi="Calibri" w:eastAsia="Calibri" w:cs="Calibri"/><w:color w:val="333333"/><w:sz w:val="22"/><w:szCs w:val="22"/></w:rPr><w:t xml:space="preserve">Platform Belajar Online</w:t></w:r></w:p></w:tc></w:tr><w:tr><w:trPr/><w:tc><w:tcPr><w:tcW w:w="3000" w:type="dxa"/><w:shd w:val="clear" w:fill="F1F5F9"/><w:noWrap/></w:tcPr><w:p><w:pPr/><w:r><w:rPr><w:rFonts w:ascii="Calibri" w:hAnsi="Calibri" w:eastAsia="Calibri" w:cs="Calibri"/><w:color w:val="111111"/><w:sz w:val="22"/><w:szCs w:val="22"/><w:b w:val="1"/><w:bCs w:val="1"/></w:rPr><w:t xml:space="preserve">Nama Tabel Database</w:t></w:r></w:p></w:tc><w:tc><w:tcPr><w:tcW w:w="5200" w:type="dxa"/><w:noWrap/></w:tcPr><w:p><w:pPr/><w:r><w:rPr><w:rFonts w:ascii="Calibri" w:hAnsi="Calibri" w:eastAsia="Calibri" w:cs="Calibri"/><w:color w:val="333333"/><w:sz w:val="22"/><w:szCs w:val="22"/></w:rPr><w:t xml:space="preserve">courses</w:t></w:r></w:p></w:tc></w:tr><w:tr><w:trPr/><w:tc><w:tcPr><w:tcW w:w="3000" w:type="dxa"/><w:shd w:val="clear" w:fill="F1F5F9"/><w:noWrap/></w:tcPr><w:p><w:pPr/><w:r><w:rPr><w:rFonts w:ascii="Calibri" w:hAnsi="Calibri" w:eastAsia="Calibri" w:cs="Calibri"/><w:color w:val="111111"/><w:sz w:val="22"/><w:szCs w:val="22"/><w:b w:val="1"/><w:bCs w:val="1"/></w:rPr><w:t xml:space="preserve">Nama Database</w:t></w:r></w:p></w:tc><w:tc><w:tcPr><w:tcW w:w="5200" w:type="dxa"/><w:noWrap/></w:tcPr><w:p><w:pPr/><w:r><w:rPr><w:rFonts w:ascii="Calibri" w:hAnsi="Calibri" w:eastAsia="Calibri" w:cs="Calibri"/><w:color w:val="333333"/><w:sz w:val="22"/><w:szCs w:val="22"/></w:rPr><w:t xml:space="preserve">db_uts_251011700008</w:t></w:r></w:p></w:tc></w:tr><w:tr><w:trPr/><w:tc><w:tcPr><w:tcW w:w="3000" w:type="dxa"/><w:shd w:val="clear" w:fill="F1F5F9"/><w:noWrap/></w:tcPr><w:p><w:pPr/><w:r><w:rPr><w:rFonts w:ascii="Calibri" w:hAnsi="Calibri" w:eastAsia="Calibri" w:cs="Calibri"/><w:color w:val="111111"/><w:sz w:val="22"/><w:szCs w:val="22"/><w:b w:val="1"/><w:bCs w:val="1"/></w:rPr><w:t xml:space="preserve">Framework & Versi</w:t></w:r></w:p></w:tc><w:tc><w:tcPr><w:tcW w:w="5200" w:type="dxa"/><w:noWrap/></w:tcPr><w:p><w:pPr/><w:r><w:rPr><w:rFonts w:ascii="Calibri" w:hAnsi="Calibri" w:eastAsia="Calibri" w:cs="Calibri"/><w:color w:val="333333"/><w:sz w:val="22"/><w:szCs w:val="22"/></w:rPr><w:t xml:space="preserve">Laravel 11 / 12, PHP 8.4, Bootstrap 5.3 (Lokal)</w:t></w:r></w:p></w:tc></w:tr><w:tr><w:trPr/><w:tc><w:tcPr><w:tcW w:w="3000" w:type="dxa"/><w:shd w:val="clear" w:fill="F1F5F9"/><w:noWrap/></w:tcPr><w:p><w:pPr/><w:r><w:rPr><w:rFonts w:ascii="Calibri" w:hAnsi="Calibri" w:eastAsia="Calibri" w:cs="Calibri"/><w:color w:val="111111"/><w:sz w:val="22"/><w:szCs w:val="22"/><w:b w:val="1"/><w:bCs w:val="1"/></w:rPr><w:t xml:space="preserve">Web Server / Database Engine</w:t></w:r></w:p></w:tc><w:tc><w:tcPr><w:tcW w:w="5200" w:type="dxa"/><w:noWrap/></w:tcPr><w:p><w:pPr/><w:r><w:rPr><w:rFonts w:ascii="Calibri" w:hAnsi="Calibri" w:eastAsia="Calibri" w:cs="Calibri"/><w:color w:val="333333"/><w:sz w:val="22"/><w:szCs w:val="22"/></w:rPr><w:t xml:space="preserve">MySQL 8.4 (Docker)</w:t></w:r></w:p></w:tc></w:tr></w:tbl><w:p/><w:p><w:pPr><w:pStyle w:val="Heading2"/></w:pPr><w:bookmarkStart w:id="1" w:name="_Toc1"/><w:r><w:t>B. Tautan Repositori GitHub</w:t></w:r><w:bookmarkEnd w:id="1"/></w:p><w:p><w:pPr><w:jc w:val="both"/><w:spacing w:after="120" w:line="276" w:lineRule="auto"/></w:pPr><w:r><w:rPr><w:rFonts w:ascii="Calibri" w:hAnsi="Calibri" w:eastAsia="Calibri" w:cs="Calibri"/><w:color w:val="333333"/><w:sz w:val="22"/><w:szCs w:val="22"/></w:rPr><w:t xml:space="preserve">Sesuai ketentuan soal pada Poin D.10 ("Upload source code ke GitHub dengan nama project UTS_NAMA_NIM_KODEKELAS"), berikut adalah informasi repositori proyek:</w:t></w:r></w:p><w:tbl><w:tblGrid><w:gridCol w:w="3000" w:type="dxa"/><w:gridCol w:w="5200" w:type="dxa"/></w:tblGrid><w:tblPr><w:tblStyle w:val="IdentityTable"/></w:tblPr><w:tr><w:trPr/><w:tc><w:tcPr><w:tcW w:w="3000" w:type="dxa"/><w:shd w:val="clear" w:fill="F1F5F9"/><w:noWrap/></w:tcPr><w:p><w:pPr/><w:r><w:rPr><w:rFonts w:ascii="Calibri" w:hAnsi="Calibri" w:eastAsia="Calibri" w:cs="Calibri"/><w:color w:val="111111"/><w:sz w:val="22"/><w:szCs w:val="22"/><w:b w:val="1"/><w:bCs w:val="1"/></w:rPr><w:t xml:space="preserve">Nama Repositori</w:t></w:r></w:p></w:tc><w:tc><w:tcPr><w:tcW w:w="5200" w:type="dxa"/><w:noWrap/></w:tcPr><w:p><w:pPr/><w:r><w:rPr><w:color w:val="003366"/><w:b w:val="1"/><w:bCs w:val="1"/></w:rPr><w:t xml:space="preserve">UTS_ILHAMPANGESTU_251011700008_03SIFE003</w:t></w:r></w:p></w:tc></w:tr><w:tr><w:trPr/><w:tc><w:tcPr><w:tcW w:w="3000" w:type="dxa"/><w:shd w:val="clear" w:fill="F1F5F9"/><w:noWrap/></w:tcPr><w:p><w:pPr/><w:r><w:rPr><w:rFonts w:ascii="Calibri" w:hAnsi="Calibri" w:eastAsia="Calibri" w:cs="Calibri"/><w:color w:val="111111"/><w:sz w:val="22"/><w:szCs w:val="22"/><w:b w:val="1"/><w:bCs w:val="1"/></w:rPr><w:t xml:space="preserve">Link URL GitHub</w:t></w:r></w:p></w:tc><w:tc><w:tcPr><w:tcW w:w="5200" w:type="dxa"/><w:noWrap/></w:tcPr><w:p><w:pPr/><w:r><w:rPr><w:color w:val="0D6EFD"/><w:u w:val="single"/></w:rPr><w:t xml:space="preserve">https://github.com/ilhampngstu/UTS_ILHAMPANGESTU_251011700008_03SIFE003</w:t></w:r></w:p></w:tc></w:tr></w:tbl><w:p/><w:p><w:pPr><w:pStyle w:val="Heading2"/></w:pPr><w:bookmarkStart w:id="2" w:name="_Toc2"/><w:r><w:t>C. Struktur Tabel Database (`courses`)</w:t></w:r><w:bookmarkEnd w:id="2"/></w:p><w:p><w:pPr><w:jc w:val="both"/><w:spacing w:after="120" w:line="276" w:lineRule="auto"/></w:pPr><w:r><w:rPr><w:rFonts w:ascii="Calibri" w:hAnsi="Calibri" w:eastAsia="Calibri" w:cs="Calibri"/><w:color w:val="333333"/><w:sz w:val="22"/><w:szCs w:val="22"/></w:rPr><w:t xml:space="preserve">Tabel courses dibuat menggunakan migration Laravel dan diisi dengan data dummy realistis melalui seeder (Database: `db_uts_251011700008`):</w:t></w:r></w:p><w:tbl><w:tblGrid><w:gridCol w:w="800" w:type="dxa"/><w:gridCol w:w="2000" w:type="dxa"/><w:gridCol w:w="2200" w:type="dxa"/><w:gridCol w:w="3200" w:type="dxa"/></w:tblGrid><w:tblPr><w:tblStyle w:val="IdentityTable"/></w:tblPr><w:tr><w:trPr/><w:tc><w:tcPr><w:tcW w:w="800" w:type="dxa"/><w:shd w:val="clear" w:fill="003366"/><w:noWrap/></w:tcPr><w:p><w:pPr/><w:r><w:rPr><w:rFonts w:ascii="Calibri" w:hAnsi="Calibri" w:eastAsia="Calibri" w:cs="Calibri"/><w:color w:val="FFFFFF"/><w:b w:val="1"/><w:bCs w:val="1"/></w:rPr><w:t xml:space="preserve">No</w:t></w:r></w:p></w:tc><w:tc><w:tcPr><w:tcW w:w="2000" w:type="dxa"/><w:shd w:val="clear" w:fill="003366"/><w:noWrap/></w:tcPr><w:p><w:pPr/><w:r><w:rPr><w:rFonts w:ascii="Calibri" w:hAnsi="Calibri" w:eastAsia="Calibri" w:cs="Calibri"/><w:color w:val="FFFFFF"/><w:b w:val="1"/><w:bCs w:val="1"/></w:rPr><w:t xml:space="preserve">Nama Kolom</w:t></w:r></w:p></w:tc><w:tc><w:tcPr><w:tcW w:w="2200" w:type="dxa"/><w:shd w:val="clear" w:fill="003366"/><w:noWrap/></w:tcPr><w:p><w:pPr/><w:r><w:rPr><w:rFonts w:ascii="Calibri" w:hAnsi="Calibri" w:eastAsia="Calibri" w:cs="Calibri"/><w:color w:val="FFFFFF"/><w:b w:val="1"/><w:bCs w:val="1"/></w:rPr><w:t xml:space="preserve">Tipe Data</w:t></w:r></w:p></w:tc><w:tc><w:tcPr><w:tcW w:w="3200" w:type="dxa"/><w:shd w:val="clear" w:fill="003366"/><w:noWrap/></w:tcPr><w:p><w:pPr/><w:r><w:rPr><w:rFonts w:ascii="Calibri" w:hAnsi="Calibri" w:eastAsia="Calibri" w:cs="Calibri"/><w:color w:val="FFFFFF"/><w:b w:val="1"/><w:bCs w:val="1"/></w:rPr><w:t xml:space="preserve">Keterangan</w:t></w:r></w:p></w:tc></w:tr><w:tr><w:trPr/><w:tc><w:tcPr><w:tcW w:w="800" w:type="dxa"/><w:noWrap/></w:tcPr><w:p><w:pPr/><w:r><w:rPr><w:rFonts w:ascii="Calibri" w:hAnsi="Calibri" w:eastAsia="Calibri" w:cs="Calibri"/><w:color w:val="333333"/><w:sz w:val="22"/><w:szCs w:val="22"/></w:rPr><w:t xml:space="preserve">1</w:t></w:r></w:p></w:tc><w:tc><w:tcPr><w:tcW w:w="2000" w:type="dxa"/><w:noWrap/></w:tcPr><w:p><w:pPr/><w:r><w:rPr><w:rFonts w:ascii="Calibri" w:hAnsi="Calibri" w:eastAsia="Calibri" w:cs="Calibri"/><w:color w:val="111111"/><w:sz w:val="22"/><w:szCs w:val="22"/><w:b w:val="1"/><w:bCs w:val="1"/></w:rPr><w:t xml:space="preserve">id</w:t></w:r></w:p></w:tc><w:tc><w:tcPr><w:tcW w:w="2200" w:type="dxa"/><w:noWrap/></w:tcPr><w:p><w:pPr/><w:r><w:rPr><w:rFonts w:ascii="Calibri" w:hAnsi="Calibri" w:eastAsia="Calibri" w:cs="Calibri"/><w:color w:val="333333"/><w:sz w:val="22"/><w:szCs w:val="22"/></w:rPr><w:t xml:space="preserve">BIGINT AUTO_INCREMENT</w:t></w:r></w:p></w:tc><w:tc><w:tcPr><w:tcW w:w="3200" w:type="dxa"/><w:noWrap/></w:tcPr><w:p><w:pPr/><w:r><w:rPr><w:rFonts w:ascii="Calibri" w:hAnsi="Calibri" w:eastAsia="Calibri" w:cs="Calibri"/><w:color w:val="333333"/><w:sz w:val="22"/><w:szCs w:val="22"/></w:rPr><w:t xml:space="preserve">Primary Key</w:t></w:r></w:p></w:tc></w:tr><w:tr><w:trPr/><w:tc><w:tcPr><w:tcW w:w="800" w:type="dxa"/><w:noWrap/></w:tcPr><w:p><w:pPr/><w:r><w:rPr><w:rFonts w:ascii="Calibri" w:hAnsi="Calibri" w:eastAsia="Calibri" w:cs="Calibri"/><w:color w:val="333333"/><w:sz w:val="22"/><w:szCs w:val="22"/></w:rPr><w:t xml:space="preserve">2</w:t></w:r></w:p></w:tc><w:tc><w:tcPr><w:tcW w:w="2000" w:type="dxa"/><w:noWrap/></w:tcPr><w:p><w:pPr/><w:r><w:rPr><w:rFonts w:ascii="Calibri" w:hAnsi="Calibri" w:eastAsia="Calibri" w:cs="Calibri"/><w:color w:val="111111"/><w:sz w:val="22"/><w:szCs w:val="22"/><w:b w:val="1"/><w:bCs w:val="1"/></w:rPr><w:t xml:space="preserve">title</w:t></w:r></w:p></w:tc><w:tc><w:tcPr><w:tcW w:w="2200" w:type="dxa"/><w:noWrap/></w:tcPr><w:p><w:pPr/><w:r><w:rPr><w:rFonts w:ascii="Calibri" w:hAnsi="Calibri" w:eastAsia="Calibri" w:cs="Calibri"/><w:color w:val="333333"/><w:sz w:val="22"/><w:szCs w:val="22"/></w:rPr><w:t xml:space="preserve">VARCHAR(255)</w:t></w:r></w:p></w:tc><w:tc><w:tcPr><w:tcW w:w="3200" w:type="dxa"/><w:noWrap/></w:tcPr><w:p><w:pPr/><w:r><w:rPr><w:rFonts w:ascii="Calibri" w:hAnsi="Calibri" w:eastAsia="Calibri" w:cs="Calibri"/><w:color w:val="333333"/><w:sz w:val="22"/><w:szCs w:val="22"/></w:rPr><w:t xml:space="preserve">Judul kursus online</w:t></w:r></w:p></w:tc></w:tr><w:tr><w:trPr/><w:tc><w:tcPr><w:tcW w:w="800" w:type="dxa"/><w:noWrap/></w:tcPr><w:p><w:pPr/><w:r><w:rPr><w:rFonts w:ascii="Calibri" w:hAnsi="Calibri" w:eastAsia="Calibri" w:cs="Calibri"/><w:color w:val="333333"/><w:sz w:val="22"/><w:szCs w:val="22"/></w:rPr><w:t xml:space="preserve">3</w:t></w:r></w:p></w:tc><w:tc><w:tcPr><w:tcW w:w="2000" w:type="dxa"/><w:noWrap/></w:tcPr><w:p><w:pPr/><w:r><w:rPr><w:rFonts w:ascii="Calibri" w:hAnsi="Calibri" w:eastAsia="Calibri" w:cs="Calibri"/><w:color w:val="111111"/><w:sz w:val="22"/><w:szCs w:val="22"/><w:b w:val="1"/><w:bCs w:val="1"/></w:rPr><w:t xml:space="preserve">instructor</w:t></w:r></w:p></w:tc><w:tc><w:tcPr><w:tcW w:w="2200" w:type="dxa"/><w:noWrap/></w:tcPr><w:p><w:pPr/><w:r><w:rPr><w:rFonts w:ascii="Calibri" w:hAnsi="Calibri" w:eastAsia="Calibri" w:cs="Calibri"/><w:color w:val="333333"/><w:sz w:val="22"/><w:szCs w:val="22"/></w:rPr><w:t xml:space="preserve">VARCHAR(255)</w:t></w:r></w:p></w:tc><w:tc><w:tcPr><w:tcW w:w="3200" w:type="dxa"/><w:noWrap/></w:tcPr><w:p><w:pPr/><w:r><w:rPr><w:rFonts w:ascii="Calibri" w:hAnsi="Calibri" w:eastAsia="Calibri" w:cs="Calibri"/><w:color w:val="333333"/><w:sz w:val="22"/><w:szCs w:val="22"/></w:rPr><w:t xml:space="preserve">Nama instruktur kursus</w:t></w:r></w:p></w:tc></w:tr><w:tr><w:trPr/><w:tc><w:tcPr><w:tcW w:w="800" w:type="dxa"/><w:noWrap/></w:tcPr><w:p><w:pPr/><w:r><w:rPr><w:rFonts w:ascii="Calibri" w:hAnsi="Calibri" w:eastAsia="Calibri" w:cs="Calibri"/><w:color w:val="333333"/><w:sz w:val="22"/><w:szCs w:val="22"/></w:rPr><w:t xml:space="preserve">4</w:t></w:r></w:p></w:tc><w:tc><w:tcPr><w:tcW w:w="2000" w:type="dxa"/><w:noWrap/></w:tcPr><w:p><w:pPr/><w:r><w:rPr><w:rFonts w:ascii="Calibri" w:hAnsi="Calibri" w:eastAsia="Calibri" w:cs="Calibri"/><w:color w:val="111111"/><w:sz w:val="22"/><w:szCs w:val="22"/><w:b w:val="1"/><w:bCs w:val="1"/></w:rPr><w:t xml:space="preserve">duration</w:t></w:r></w:p></w:tc><w:tc><w:tcPr><w:tcW w:w="2200" w:type="dxa"/><w:noWrap/></w:tcPr><w:p><w:pPr/><w:r><w:rPr><w:rFonts w:ascii="Calibri" w:hAnsi="Calibri" w:eastAsia="Calibri" w:cs="Calibri"/><w:color w:val="333333"/><w:sz w:val="22"/><w:szCs w:val="22"/></w:rPr><w:t xml:space="preserve">VARCHAR(255)</w:t></w:r></w:p></w:tc><w:tc><w:tcPr><w:tcW w:w="3200" w:type="dxa"/><w:noWrap/></w:tcPr><w:p><w:pPr/><w:r><w:rPr><w:rFonts w:ascii="Calibri" w:hAnsi="Calibri" w:eastAsia="Calibri" w:cs="Calibri"/><w:color w:val="333333"/><w:sz w:val="22"/><w:szCs w:val="22"/></w:rPr><w:t xml:space="preserve">Durasi materi (misal: "24 Jam Video")</w:t></w:r></w:p></w:tc></w:tr><w:tr><w:trPr/><w:tc><w:tcPr><w:tcW w:w="800" w:type="dxa"/><w:noWrap/></w:tcPr><w:p><w:pPr/><w:r><w:rPr><w:rFonts w:ascii="Calibri" w:hAnsi="Calibri" w:eastAsia="Calibri" w:cs="Calibri"/><w:color w:val="333333"/><w:sz w:val="22"/><w:szCs w:val="22"/></w:rPr><w:t xml:space="preserve">5</w:t></w:r></w:p></w:tc><w:tc><w:tcPr><w:tcW w:w="2000" w:type="dxa"/><w:noWrap/></w:tcPr><w:p><w:pPr/><w:r><w:rPr><w:rFonts w:ascii="Calibri" w:hAnsi="Calibri" w:eastAsia="Calibri" w:cs="Calibri"/><w:color w:val="111111"/><w:sz w:val="22"/><w:szCs w:val="22"/><w:b w:val="1"/><w:bCs w:val="1"/></w:rPr><w:t xml:space="preserve">image</w:t></w:r></w:p></w:tc><w:tc><w:tcPr><w:tcW w:w="2200" w:type="dxa"/><w:noWrap/></w:tcPr><w:p><w:pPr/><w:r><w:rPr><w:rFonts w:ascii="Calibri" w:hAnsi="Calibri" w:eastAsia="Calibri" w:cs="Calibri"/><w:color w:val="333333"/><w:sz w:val="22"/><w:szCs w:val="22"/></w:rPr><w:t xml:space="preserve">VARCHAR(255)</w:t></w:r></w:p></w:tc><w:tc><w:tcPr><w:tcW w:w="3200" w:type="dxa"/><w:noWrap/></w:tcPr><w:p><w:pPr/><w:r><w:rPr><w:rFonts w:ascii="Calibri" w:hAnsi="Calibri" w:eastAsia="Calibri" w:cs="Calibri"/><w:color w:val="333333"/><w:sz w:val="22"/><w:szCs w:val="22"/></w:rPr><w:t xml:space="preserve">Nama file di public/assets/images/</w:t></w:r></w:p></w:tc></w:tr><w:tr><w:trPr/><w:tc><w:tcPr><w:tcW w:w="800" w:type="dxa"/><w:noWrap/></w:tcPr><w:p><w:pPr/><w:r><w:rPr><w:rFonts w:ascii="Calibri" w:hAnsi="Calibri" w:eastAsia="Calibri" w:cs="Calibri"/><w:color w:val="333333"/><w:sz w:val="22"/><w:szCs w:val="22"/></w:rPr><w:t xml:space="preserve">6</w:t></w:r></w:p></w:tc><w:tc><w:tcPr><w:tcW w:w="2000" w:type="dxa"/><w:noWrap/></w:tcPr><w:p><w:pPr/><w:r><w:rPr><w:rFonts w:ascii="Calibri" w:hAnsi="Calibri" w:eastAsia="Calibri" w:cs="Calibri"/><w:color w:val="111111"/><w:sz w:val="22"/><w:szCs w:val="22"/><w:b w:val="1"/><w:bCs w:val="1"/></w:rPr><w:t xml:space="preserve">price</w:t></w:r></w:p></w:tc><w:tc><w:tcPr><w:tcW w:w="2200" w:type="dxa"/><w:noWrap/></w:tcPr><w:p><w:pPr/><w:r><w:rPr><w:rFonts w:ascii="Calibri" w:hAnsi="Calibri" w:eastAsia="Calibri" w:cs="Calibri"/><w:color w:val="333333"/><w:sz w:val="22"/><w:szCs w:val="22"/></w:rPr><w:t xml:space="preserve">DECIMAL(12, 2)</w:t></w:r></w:p></w:tc><w:tc><w:tcPr><w:tcW w:w="3200" w:type="dxa"/><w:noWrap/></w:tcPr><w:p><w:pPr/><w:r><w:rPr><w:rFonts w:ascii="Calibri" w:hAnsi="Calibri" w:eastAsia="Calibri" w:cs="Calibri"/><w:color w:val="333333"/><w:sz w:val="22"/><w:szCs w:val="22"/></w:rPr><w:t xml:space="preserve">Harga kursus dalam Rupiah</w:t></w:r></w:p></w:tc></w:tr><w:tr><w:trPr/><w:tc><w:tcPr><w:tcW w:w="800" w:type="dxa"/><w:noWrap/></w:tcPr><w:p><w:pPr/><w:r><w:rPr><w:rFonts w:ascii="Calibri" w:hAnsi="Calibri" w:eastAsia="Calibri" w:cs="Calibri"/><w:color w:val="333333"/><w:sz w:val="22"/><w:szCs w:val="22"/></w:rPr><w:t xml:space="preserve">7</w:t></w:r></w:p></w:tc><w:tc><w:tcPr><w:tcW w:w="2000" w:type="dxa"/><w:noWrap/></w:tcPr><w:p><w:pPr/><w:r><w:rPr><w:rFonts w:ascii="Calibri" w:hAnsi="Calibri" w:eastAsia="Calibri" w:cs="Calibri"/><w:color w:val="111111"/><w:sz w:val="22"/><w:szCs w:val="22"/><w:b w:val="1"/><w:bCs w:val="1"/></w:rPr><w:t xml:space="preserve">category</w:t></w:r></w:p></w:tc><w:tc><w:tcPr><w:tcW w:w="2200" w:type="dxa"/><w:noWrap/></w:tcPr><w:p><w:pPr/><w:r><w:rPr><w:rFonts w:ascii="Calibri" w:hAnsi="Calibri" w:eastAsia="Calibri" w:cs="Calibri"/><w:color w:val="333333"/><w:sz w:val="22"/><w:szCs w:val="22"/></w:rPr><w:t xml:space="preserve">VARCHAR(255)</w:t></w:r></w:p></w:tc><w:tc><w:tcPr><w:tcW w:w="3200" w:type="dxa"/><w:noWrap/></w:tcPr><w:p><w:pPr/><w:r><w:rPr><w:rFonts w:ascii="Calibri" w:hAnsi="Calibri" w:eastAsia="Calibri" w:cs="Calibri"/><w:color w:val="333333"/><w:sz w:val="22"/><w:szCs w:val="22"/></w:rPr><w:t xml:space="preserve">Kategori materi kursus</w:t></w:r></w:p></w:tc></w:tr><w:tr><w:trPr/><w:tc><w:tcPr><w:tcW w:w="800" w:type="dxa"/><w:noWrap/></w:tcPr><w:p><w:pPr/><w:r><w:rPr><w:rFonts w:ascii="Calibri" w:hAnsi="Calibri" w:eastAsia="Calibri" w:cs="Calibri"/><w:color w:val="333333"/><w:sz w:val="22"/><w:szCs w:val="22"/></w:rPr><w:t xml:space="preserve">8</w:t></w:r></w:p></w:tc><w:tc><w:tcPr><w:tcW w:w="2000" w:type="dxa"/><w:noWrap/></w:tcPr><w:p><w:pPr/><w:r><w:rPr><w:rFonts w:ascii="Calibri" w:hAnsi="Calibri" w:eastAsia="Calibri" w:cs="Calibri"/><w:color w:val="111111"/><w:sz w:val="22"/><w:szCs w:val="22"/><w:b w:val="1"/><w:bCs w:val="1"/></w:rPr><w:t xml:space="preserve">description</w:t></w:r></w:p></w:tc><w:tc><w:tcPr><w:tcW w:w="2200" w:type="dxa"/><w:noWrap/></w:tcPr><w:p><w:pPr/><w:r><w:rPr><w:rFonts w:ascii="Calibri" w:hAnsi="Calibri" w:eastAsia="Calibri" w:cs="Calibri"/><w:color w:val="333333"/><w:sz w:val="22"/><w:szCs w:val="22"/></w:rPr><w:t xml:space="preserve">TEXT (Nullable)</w:t></w:r></w:p></w:tc><w:tc><w:tcPr><w:tcW w:w="3200" w:type="dxa"/><w:noWrap/></w:tcPr><w:p><w:pPr/><w:r><w:rPr><w:rFonts w:ascii="Calibri" w:hAnsi="Calibri" w:eastAsia="Calibri" w:cs="Calibri"/><w:color w:val="333333"/><w:sz w:val="22"/><w:szCs w:val="22"/></w:rPr><w:t xml:space="preserve">Deskripsi lengkap silabus kursus</w:t></w:r></w:p></w:tc></w:tr><w:tr><w:trPr/><w:tc><w:tcPr><w:tcW w:w="800" w:type="dxa"/><w:noWrap/></w:tcPr><w:p><w:pPr/><w:r><w:rPr><w:rFonts w:ascii="Calibri" w:hAnsi="Calibri" w:eastAsia="Calibri" w:cs="Calibri"/><w:color w:val="333333"/><w:sz w:val="22"/><w:szCs w:val="22"/></w:rPr><w:t xml:space="preserve">9</w:t></w:r></w:p></w:tc><w:tc><w:tcPr><w:tcW w:w="2000" w:type="dxa"/><w:noWrap/></w:tcPr><w:p><w:pPr/><w:r><w:rPr><w:rFonts w:ascii="Calibri" w:hAnsi="Calibri" w:eastAsia="Calibri" w:cs="Calibri"/><w:color w:val="111111"/><w:sz w:val="22"/><w:szCs w:val="22"/><w:b w:val="1"/><w:bCs w:val="1"/></w:rPr><w:t xml:space="preserve">created_at</w:t></w:r></w:p></w:tc><w:tc><w:tcPr><w:tcW w:w="2200" w:type="dxa"/><w:noWrap/></w:tcPr><w:p><w:pPr/><w:r><w:rPr><w:rFonts w:ascii="Calibri" w:hAnsi="Calibri" w:eastAsia="Calibri" w:cs="Calibri"/><w:color w:val="333333"/><w:sz w:val="22"/><w:szCs w:val="22"/></w:rPr><w:t xml:space="preserve">TIMESTAMP</w:t></w:r></w:p></w:tc><w:tc><w:tcPr><w:tcW w:w="3200" w:type="dxa"/><w:noWrap/></w:tcPr><w:p><w:pPr/><w:r><w:rPr><w:rFonts w:ascii="Calibri" w:hAnsi="Calibri" w:eastAsia="Calibri" w:cs="Calibri"/><w:color w:val="333333"/><w:sz w:val="22"/><w:szCs w:val="22"/></w:rPr><w:t xml:space="preserve">Waktu pembuatan data</w:t></w:r></w:p></w:tc></w:tr><w:tr><w:trPr/><w:tc><w:tcPr><w:tcW w:w="800" w:type="dxa"/><w:noWrap/></w:tcPr><w:p><w:pPr/><w:r><w:rPr><w:rFonts w:ascii="Calibri" w:hAnsi="Calibri" w:eastAsia="Calibri" w:cs="Calibri"/><w:color w:val="333333"/><w:sz w:val="22"/><w:szCs w:val="22"/></w:rPr><w:t xml:space="preserve">10</w:t></w:r></w:p></w:tc><w:tc><w:tcPr><w:tcW w:w="2000" w:type="dxa"/><w:noWrap/></w:tcPr><w:p><w:pPr/><w:r><w:rPr><w:rFonts w:ascii="Calibri" w:hAnsi="Calibri" w:eastAsia="Calibri" w:cs="Calibri"/><w:color w:val="111111"/><w:sz w:val="22"/><w:szCs w:val="22"/><w:b w:val="1"/><w:bCs w:val="1"/></w:rPr><w:t xml:space="preserve">updated_at</w:t></w:r></w:p></w:tc><w:tc><w:tcPr><w:tcW w:w="2200" w:type="dxa"/><w:noWrap/></w:tcPr><w:p><w:pPr/><w:r><w:rPr><w:rFonts w:ascii="Calibri" w:hAnsi="Calibri" w:eastAsia="Calibri" w:cs="Calibri"/><w:color w:val="333333"/><w:sz w:val="22"/><w:szCs w:val="22"/></w:rPr><w:t xml:space="preserve">TIMESTAMP</w:t></w:r></w:p></w:tc><w:tc><w:tcPr><w:tcW w:w="3200" w:type="dxa"/><w:noWrap/></w:tcPr><w:p><w:pPr/><w:r><w:rPr><w:rFonts w:ascii="Calibri" w:hAnsi="Calibri" w:eastAsia="Calibri" w:cs="Calibri"/><w:color w:val="333333"/><w:sz w:val="22"/><w:szCs w:val="22"/></w:rPr><w:t xml:space="preserve">Waktu perbaruan data</w:t></w:r></w:p></w:tc></w:tr></w:tbl><w:p><w:r><w:br w:type="page"/></w:r></w:p><w:p><w:pPr><w:pStyle w:val="Heading2"/></w:pPr><w:bookmarkStart w:id="3" w:name="_Toc3"/><w:r><w:t>D. Screenshot Hasil Implementasi Aplikasi Web</w:t></w:r><w:bookmarkEnd w:id="3"/></w:p><w:p><w:pPr><w:jc w:val="both"/><w:spacing w:after="120" w:line="276" w:lineRule="auto"/></w:pPr><w:r><w:rPr><w:rFonts w:ascii="Calibri" w:hAnsi="Calibri" w:eastAsia="Calibri" w:cs="Calibri"/><w:color w:val="333333"/><w:sz w:val="22"/><w:szCs w:val="22"/></w:rPr><w:t xml:space="preserve">Berikut adalah tangkapan layar tampilan antarmuka web yang dibangun dengan framework Laravel, Blade Template, dan Bootstrap 5:</w:t></w:r></w:p><w:p><w:pPr><w:pStyle w:val="Heading3"/></w:pPr><w:bookmarkStart w:id="4" w:name="_Toc4"/><w:r><w:t>1. Halaman Katalog Kursus (Card Grid & Header Banner UNPAM)</w:t></w:r><w:bookmarkEnd w:id="4"/></w:p><w:p><w:pPr/><w:r><w:rPr><w:rFonts w:ascii="Calibri" w:hAnsi="Calibri" w:eastAsia="Calibri" w:cs="Calibri"/><w:color w:val="666666"/><w:sz w:val="20"/><w:szCs w:val="20"/><w:i w:val="1"/><w:iCs w:val="1"/></w:rPr><w:t xml:space="preserve">Menampilkan header resmi Yayasan Sasmita Jaya dan UNPAM, identitas mahasiswa, fitur filter kategori, pencarian, dan daftar kartu kursus responsif.</w:t></w:r></w:p><w:p><w:pPr><w:jc w:val="center"/></w:pPr><w:r><w:pict><v:shape type="#_x0000_t75" stroked="f" style="width:470pt; height:376pt; margin-left:0pt; margin-top:0pt; mso-position-horizontal:left; mso-position-vertical:top; mso-position-horizontal-relative:char; mso-position-vertical-relative:line;"><w10:wrap type="inline"/><v:imagedata r:id="rId7" o:title=""/></v:shape></w:pict></w:r></w:p><w:p/><w:p><w:pPr><w:pStyle w:val="Heading3"/></w:pPr><w:bookmarkStart w:id="5" w:name="_Toc5"/><w:r><w:t>2. Halaman Tampilan Tabel Data Kursus (`table` Bootstrap)</w:t></w:r><w:bookmarkEnd w:id="5"/></w:p><w:p><w:pPr/><w:r><w:rPr><w:rFonts w:ascii="Calibri" w:hAnsi="Calibri" w:eastAsia="Calibri" w:cs="Calibri"/><w:color w:val="666666"/><w:sz w:val="20"/><w:szCs w:val="20"/><w:i w:val="1"/><w:iCs w:val="1"/></w:rPr><w:t xml:space="preserve">Menampilkan data tabel courses menggunakan komponen Bootstrap table table-hover table-striped lengkap dengan thumbnail, kategori badge, harga, dan tombol detail.</w:t></w:r></w:p><w:p><w:pPr><w:jc w:val="center"/></w:pPr><w:r><w:pict><v:shape type="#_x0000_t75" stroked="f" style="width:470pt; height:376pt; margin-left:0pt; margin-top:0pt; mso-position-horizontal:left; mso-position-vertical:top; mso-position-horizontal-relative:char; mso-position-vertical-relative:line;"><w10:wrap type="inline"/><v:imagedata r:id="rId8" o:title=""/></v:shape></w:pict></w:r></w:p><w:p><w:r><w:br w:type="page"/></w:r></w:p><w:p><w:pPr><w:pStyle w:val="Heading3"/></w:pPr><w:bookmarkStart w:id="6" w:name="_Toc6"/><w:r><w:t>3. Halaman Detail Kursus (Show View)</w:t></w:r><w:bookmarkEnd w:id="6"/></w:p><w:p><w:pPr/><w:r><w:rPr><w:rFonts w:ascii="Calibri" w:hAnsi="Calibri" w:eastAsia="Calibri" w:cs="Calibri"/><w:color w:val="666666"/><w:sz w:val="20"/><w:szCs w:val="20"/><w:i w:val="1"/><w:iCs w:val="1"/></w:rPr><w:t xml:space="preserve">Menampilkan rincian materi lengkap, breadcrumb navigasi, profil instruktur, silabus modul pembelajaran (Accordion Bootstrap), fasilitas, serta modal pendaftaran.</w:t></w:r></w:p><w:p><w:pPr><w:jc w:val="center"/></w:pPr><w:r><w:pict><v:shape type="#_x0000_t75" stroked="f" style="width:470pt; height:376pt; margin-left:0pt; margin-top:0pt; mso-position-horizontal:left; mso-position-vertical:top; mso-position-horizontal-relative:char; mso-position-vertical-relative:line;"><w10:wrap type="inline"/><v:imagedata r:id="rId9" o:title=""/></v:shape></w:pict></w:r></w:p><w:p/><w:p><w:pPr><w:pStyle w:val="Heading3"/></w:pPr><w:bookmarkStart w:id="7" w:name="_Toc7"/><w:r><w:t>4. Halaman Identitas Mahasiswa & Informasi Penugasan UTS</w:t></w:r><w:bookmarkEnd w:id="7"/></w:p><w:p><w:pPr/><w:r><w:rPr><w:rFonts w:ascii="Calibri" w:hAnsi="Calibri" w:eastAsia="Calibri" w:cs="Calibri"/><w:color w:val="666666"/><w:sz w:val="20"/><w:szCs w:val="20"/><w:i w:val="1"/><w:iCs w:val="1"/></w:rPr><w:t xml:space="preserve">Menampilkan identitas lengkap mahasiswa pengembang, rincian teknis penugasan UTS, checklist pemenuhan seluruh butir soal, dan ringkasan statistik database.</w:t></w:r></w:p><w:p><w:pPr><w:jc w:val="center"/></w:pPr><w:r><w:pict><v:shape type="#_x0000_t75" stroked="f" style="width:470pt; height:376pt; margin-left:0pt; margin-top:0pt; mso-position-horizontal:left; mso-position-vertical:top; mso-position-horizontal-relative:char; mso-position-vertical-relative:line;"><w10:wrap type="inline"/><v:imagedata r:id="rId10" o:title=""/></v:shape></w:pict></w:r></w:p><w:p/><w:p><w:pPr><w:pStyle w:val="Heading2"/></w:pPr><w:bookmarkStart w:id="8" w:name="_Toc8"/><w:r><w:t>E. Kesimpulan</w:t></w:r><w:bookmarkEnd w:id="8"/></w:p><w:p><w:pPr><w:jc w:val="both"/><w:spacing w:after="120" w:line="276" w:lineRule="auto"/></w:pPr><w:r><w:rPr><w:rFonts w:ascii="Calibri" w:hAnsi="Calibri" w:eastAsia="Calibri" w:cs="Calibri"/><w:color w:val="333333"/><w:sz w:val="22"/><w:szCs w:val="22"/></w:rPr><w:t xml:space="preserve">Seluruh instruksi dan ketentuan pada soal Ujian Tengah Semester (UTS) mata kuliah Rekayasa Web telah berhasil diimplementasikan dengan baik:</w:t></w:r></w:p><w:p><w:pPr><w:numPr><w:ilvl w:val="0"/><w:numId w:val="5"/></w:numPr></w:pPr><w:r><w:rPr><w:rFonts w:ascii="Calibri" w:hAnsi="Calibri" w:eastAsia="Calibri" w:cs="Calibri"/><w:color w:val="333333"/><w:sz w:val="22"/><w:szCs w:val="22"/></w:rPr><w:t xml:space="preserve">Proyek dibuat menggunakan framework Laravel dengan arsitektur MVC terstruktur.</w:t></w:r></w:p><w:p><w:pPr><w:numPr><w:ilvl w:val="0"/><w:numId w:val="5"/></w:numPr></w:pPr><w:r><w:rPr><w:rFonts w:ascii="Calibri" w:hAnsi="Calibri" w:eastAsia="Calibri" w:cs="Calibri"/><w:color w:val="333333"/><w:sz w:val="22"/><w:szCs w:val="22"/></w:rPr><w:t xml:space="preserve">Tabel courses dan database db_uts_251011700008 berhasil dimigrasikan serta diisi data dummy realistis via Seeder.</w:t></w:r></w:p><w:p><w:pPr><w:numPr><w:ilvl w:val="0"/><w:numId w:val="5"/></w:numPr></w:pPr><w:r><w:rPr><w:rFonts w:ascii="Calibri" w:hAnsi="Calibri" w:eastAsia="Calibri" w:cs="Calibri"/><w:color w:val="333333"/><w:sz w:val="22"/><w:szCs w:val="22"/></w:rPr><w:t xml:space="preserve">Asset Bootstrap 5.3 dan gambar thumbnail tersimpan secara mandiri di folder public aplikasi.</w:t></w:r></w:p><w:p><w:pPr><w:numPr><w:ilvl w:val="0"/><w:numId w:val="5"/></w:numPr></w:pPr><w:r><w:rPr><w:rFonts w:ascii="Calibri" w:hAnsi="Calibri" w:eastAsia="Calibri" w:cs="Calibri"/><w:color w:val="333333"/><w:sz w:val="22"/><w:szCs w:val="22"/></w:rPr><w:t xml:space="preserve">Layout utama Blade Template berhasil diterapkan dengan rapi menggunakan @extends dan @section tanpa perulangan kode.</w:t></w:r></w:p><w:p><w:pPr><w:numPr><w:ilvl w:val="0"/><w:numId w:val="5"/></w:numPr></w:pPr><w:r><w:rPr><w:rFonts w:ascii="Calibri" w:hAnsi="Calibri" w:eastAsia="Calibri" w:cs="Calibri"/><w:color w:val="333333"/><w:sz w:val="22"/><w:szCs w:val="22"/></w:rPr><w:t xml:space="preserve">Tampilan katalog Card Grid, Tampilan Tabel, Halaman Detail Kursus, serta navigasi antar halaman berfungsi dengan lancar dan responsif.</w:t></w:r></w:p><w:sectPr><w:pgSz w:orient="portrait" w:w="11905.511811023622" w:h="16837.79527559055"/><w:pgMar w:top="1200" w:right="1400" w:bottom="1200" w:left="1400" w:header="720" w:footer="720" w:gutter="0"/><w:cols w:num="1" w:space="720"/></w:sectPr></w:body></w:document>
+<w:document xmlns:ve="http://schemas.openxmlformats.org/markup-compatibility/2006" xmlns:o="urn:schemas-microsoft-com:office:office" xmlns:r="http://schemas.openxmlformats.org/officeDocument/2006/relationships" xmlns:m="http://schemas.openxmlformats.org/officeDocument/2006/math" xmlns:v="urn:schemas-microsoft-com:vml" xmlns:wp="http://schemas.openxmlformats.org/drawingml/2006/wordprocessingDrawing" xmlns:w10="urn:schemas-microsoft-com:office:word" xmlns:w="http://schemas.openxmlformats.org/wordprocessingml/2006/main" xmlns:wne="http://schemas.microsoft.com/office/word/2006/wordml"><w:body><w:p><w:pPr><w:jc w:val="center"/><w:spacing w:after="120"/></w:pPr><w:r><w:rPr><w:rFonts w:ascii="Calibri" w:hAnsi="Calibri" w:eastAsia="Calibri" w:cs="Calibri"/><w:sz w:val="26"/><w:szCs w:val="26"/><w:b w:val="1"/><w:bCs w:val="1"/></w:rPr><w:t xml:space="preserve">YAYASAN SASMITA JAYA</w:t></w:r></w:p><w:p><w:pPr><w:jc w:val="center"/><w:spacing w:after="120"/></w:pPr><w:r><w:rPr><w:rFonts w:ascii="Calibri" w:hAnsi="Calibri" w:eastAsia="Calibri" w:cs="Calibri"/><w:color w:val="003366"/><w:sz w:val="32"/><w:szCs w:val="32"/><w:b w:val="1"/><w:bCs w:val="1"/></w:rPr><w:t xml:space="preserve">UNIVERSITAS PAMULANG</w:t></w:r></w:p><w:p><w:pPr><w:jc w:val="center"/><w:spacing w:after="120"/></w:pPr><w:r><w:rPr><w:rFonts w:ascii="Calibri" w:hAnsi="Calibri" w:eastAsia="Calibri" w:cs="Calibri"/><w:color w:val="555555"/><w:sz w:val="20"/><w:szCs w:val="20"/><w:b w:val="1"/><w:bCs w:val="1"/></w:rPr><w:t xml:space="preserve">FAKULTAS ILMU KOMPUTER - PROGRAM STUDI SISTEM INFORMASI S-1</w:t></w:r></w:p><w:p><w:pPr><w:jc w:val="center"/><w:spacing w:after="120"/></w:pPr><w:r><w:rPr><w:rFonts w:ascii="Calibri" w:hAnsi="Calibri" w:eastAsia="Calibri" w:cs="Calibri"/><w:color w:val="777777"/><w:sz w:val="18"/><w:szCs w:val="18"/></w:rPr><w:t xml:space="preserve">Jl. Puspitek Raya No. 10, Serpong - Tangerang Selatan | www.unpam.ac.id</w:t></w:r></w:p><w:p><w:pPr/><w:r><w:pict><v:shape id="_x0000_s1005" type="#_x0000_t32" style="width:480pt; height:0pt; margin-left:0pt; margin-top:0pt; mso-position-horizontal:left; mso-position-vertical:top; mso-position-horizontal-relative:char; mso-position-vertical-relative:line;"><w10:wrap type="inline"/><v:stroke weight="2pt" color="003366"/></v:shape></w:pict></w:r></w:p><w:p/><w:p><w:pPr><w:jc w:val="center"/><w:spacing w:after="120"/></w:pPr><w:r><w:rPr><w:rFonts w:ascii="Calibri" w:hAnsi="Calibri" w:eastAsia="Calibri" w:cs="Calibri"/><w:color w:val="003366"/><w:sz w:val="30"/><w:szCs w:val="30"/><w:b w:val="1"/><w:bCs w:val="1"/></w:rPr><w:t xml:space="preserve">LAPORAN DOKUMENTASI HASIL APLIKASI WEB</w:t></w:r></w:p><w:p><w:pPr><w:jc w:val="center"/><w:spacing w:after="120"/></w:pPr><w:r><w:rPr><w:rFonts w:ascii="Calibri" w:hAnsi="Calibri" w:eastAsia="Calibri" w:cs="Calibri"/><w:sz w:val="24"/><w:szCs w:val="24"/><w:b w:val="1"/><w:bCs w:val="1"/></w:rPr><w:t xml:space="preserve">UJIAN TENGAH SEMESTER (UTS) SEMESTER GANJIL T.A. 2026/2027</w:t></w:r></w:p><w:p/><w:p><w:pPr><w:pStyle w:val="Heading2"/></w:pPr><w:bookmarkStart w:id="0" w:name="_Toc0"/><w:r><w:t>A. Identitas Mahasiswa & Penugasan</w:t></w:r><w:bookmarkEnd w:id="0"/></w:p><w:tbl><w:tblGrid><w:gridCol w:w="3000" w:type="dxa"/><w:gridCol w:w="5200" w:type="dxa"/></w:tblGrid><w:tblPr><w:tblStyle w:val="IdentityTable"/></w:tblPr><w:tr><w:trPr/><w:tc><w:tcPr><w:tcW w:w="3000" w:type="dxa"/><w:shd w:val="clear" w:fill="F1F5F9"/><w:noWrap/></w:tcPr><w:p><w:pPr/><w:r><w:rPr><w:rFonts w:ascii="Calibri" w:hAnsi="Calibri" w:eastAsia="Calibri" w:cs="Calibri"/><w:color w:val="111111"/><w:sz w:val="22"/><w:szCs w:val="22"/><w:b w:val="1"/><w:bCs w:val="1"/></w:rPr><w:t xml:space="preserve">Nama Lengkap</w:t></w:r></w:p></w:tc><w:tc><w:tcPr><w:tcW w:w="5200" w:type="dxa"/><w:noWrap/></w:tcPr><w:p><w:pPr/><w:r><w:rPr><w:rFonts w:ascii="Calibri" w:hAnsi="Calibri" w:eastAsia="Calibri" w:cs="Calibri"/><w:color w:val="333333"/><w:sz w:val="22"/><w:szCs w:val="22"/></w:rPr><w:t xml:space="preserve">Ilham Pangestu</w:t></w:r></w:p></w:tc></w:tr><w:tr><w:trPr/><w:tc><w:tcPr><w:tcW w:w="3000" w:type="dxa"/><w:shd w:val="clear" w:fill="F1F5F9"/><w:noWrap/></w:tcPr><w:p><w:pPr/><w:r><w:rPr><w:rFonts w:ascii="Calibri" w:hAnsi="Calibri" w:eastAsia="Calibri" w:cs="Calibri"/><w:color w:val="111111"/><w:sz w:val="22"/><w:szCs w:val="22"/><w:b w:val="1"/><w:bCs w:val="1"/></w:rPr><w:t xml:space="preserve">Nomor Induk Mahasiswa (NIM)</w:t></w:r></w:p></w:tc><w:tc><w:tcPr><w:tcW w:w="5200" w:type="dxa"/><w:noWrap/></w:tcPr><w:p><w:pPr/><w:r><w:rPr><w:rFonts w:ascii="Calibri" w:hAnsi="Calibri" w:eastAsia="Calibri" w:cs="Calibri"/><w:color w:val="333333"/><w:sz w:val="22"/><w:szCs w:val="22"/></w:rPr><w:t xml:space="preserve">251011700008</w:t></w:r></w:p></w:tc></w:tr><w:tr><w:trPr/><w:tc><w:tcPr><w:tcW w:w="3000" w:type="dxa"/><w:shd w:val="clear" w:fill="F1F5F9"/><w:noWrap/></w:tcPr><w:p><w:pPr/><w:r><w:rPr><w:rFonts w:ascii="Calibri" w:hAnsi="Calibri" w:eastAsia="Calibri" w:cs="Calibri"/><w:color w:val="111111"/><w:sz w:val="22"/><w:szCs w:val="22"/><w:b w:val="1"/><w:bCs w:val="1"/></w:rPr><w:t xml:space="preserve">1 Digit Terakhir NIM</w:t></w:r></w:p></w:tc><w:tc><w:tcPr><w:tcW w:w="5200" w:type="dxa"/><w:noWrap/></w:tcPr><w:p><w:pPr/><w:r><w:rPr><w:rFonts w:ascii="Calibri" w:hAnsi="Calibri" w:eastAsia="Calibri" w:cs="Calibri"/><w:color w:val="333333"/><w:sz w:val="22"/><w:szCs w:val="22"/></w:rPr><w:t xml:space="preserve">8</w:t></w:r></w:p></w:tc></w:tr><w:tr><w:trPr/><w:tc><w:tcPr><w:tcW w:w="3000" w:type="dxa"/><w:shd w:val="clear" w:fill="F1F5F9"/><w:noWrap/></w:tcPr><w:p><w:pPr/><w:r><w:rPr><w:rFonts w:ascii="Calibri" w:hAnsi="Calibri" w:eastAsia="Calibri" w:cs="Calibri"/><w:color w:val="111111"/><w:sz w:val="22"/><w:szCs w:val="22"/><w:b w:val="1"/><w:bCs w:val="1"/></w:rPr><w:t xml:space="preserve">Kelas</w:t></w:r></w:p></w:tc><w:tc><w:tcPr><w:tcW w:w="5200" w:type="dxa"/><w:noWrap/></w:tcPr><w:p><w:pPr/><w:r><w:rPr><w:rFonts w:ascii="Calibri" w:hAnsi="Calibri" w:eastAsia="Calibri" w:cs="Calibri"/><w:color w:val="333333"/><w:sz w:val="22"/><w:szCs w:val="22"/></w:rPr><w:t xml:space="preserve">03SIFE003</w:t></w:r></w:p></w:tc></w:tr><w:tr><w:trPr/><w:tc><w:tcPr><w:tcW w:w="3000" w:type="dxa"/><w:shd w:val="clear" w:fill="F1F5F9"/><w:noWrap/></w:tcPr><w:p><w:pPr/><w:r><w:rPr><w:rFonts w:ascii="Calibri" w:hAnsi="Calibri" w:eastAsia="Calibri" w:cs="Calibri"/><w:color w:val="111111"/><w:sz w:val="22"/><w:szCs w:val="22"/><w:b w:val="1"/><w:bCs w:val="1"/></w:rPr><w:t xml:space="preserve">Program Studi</w:t></w:r></w:p></w:tc><w:tc><w:tcPr><w:tcW w:w="5200" w:type="dxa"/><w:noWrap/></w:tcPr><w:p><w:pPr/><w:r><w:rPr><w:rFonts w:ascii="Calibri" w:hAnsi="Calibri" w:eastAsia="Calibri" w:cs="Calibri"/><w:color w:val="333333"/><w:sz w:val="22"/><w:szCs w:val="22"/></w:rPr><w:t xml:space="preserve">Sistem Informasi S-1</w:t></w:r></w:p></w:tc></w:tr><w:tr><w:trPr/><w:tc><w:tcPr><w:tcW w:w="3000" w:type="dxa"/><w:shd w:val="clear" w:fill="F1F5F9"/><w:noWrap/></w:tcPr><w:p><w:pPr/><w:r><w:rPr><w:rFonts w:ascii="Calibri" w:hAnsi="Calibri" w:eastAsia="Calibri" w:cs="Calibri"/><w:color w:val="111111"/><w:sz w:val="22"/><w:szCs w:val="22"/><w:b w:val="1"/><w:bCs w:val="1"/></w:rPr><w:t xml:space="preserve">Fakultas</w:t></w:r></w:p></w:tc><w:tc><w:tcPr><w:tcW w:w="5200" w:type="dxa"/><w:noWrap/></w:tcPr><w:p><w:pPr/><w:r><w:rPr><w:rFonts w:ascii="Calibri" w:hAnsi="Calibri" w:eastAsia="Calibri" w:cs="Calibri"/><w:color w:val="333333"/><w:sz w:val="22"/><w:szCs w:val="22"/></w:rPr><w:t xml:space="preserve">Ilmu Komputer</w:t></w:r></w:p></w:tc></w:tr><w:tr><w:trPr/><w:tc><w:tcPr><w:tcW w:w="3000" w:type="dxa"/><w:shd w:val="clear" w:fill="F1F5F9"/><w:noWrap/></w:tcPr><w:p><w:pPr/><w:r><w:rPr><w:rFonts w:ascii="Calibri" w:hAnsi="Calibri" w:eastAsia="Calibri" w:cs="Calibri"/><w:color w:val="111111"/><w:sz w:val="22"/><w:szCs w:val="22"/><w:b w:val="1"/><w:bCs w:val="1"/></w:rPr><w:t xml:space="preserve">Mata Kuliah</w:t></w:r></w:p></w:tc><w:tc><w:tcPr><w:tcW w:w="5200" w:type="dxa"/><w:noWrap/></w:tcPr><w:p><w:pPr/><w:r><w:rPr><w:rFonts w:ascii="Calibri" w:hAnsi="Calibri" w:eastAsia="Calibri" w:cs="Calibri"/><w:color w:val="333333"/><w:sz w:val="22"/><w:szCs w:val="22"/></w:rPr><w:t xml:space="preserve">Rekayasa Web</w:t></w:r></w:p></w:tc></w:tr><w:tr><w:trPr/><w:tc><w:tcPr><w:tcW w:w="3000" w:type="dxa"/><w:shd w:val="clear" w:fill="F1F5F9"/><w:noWrap/></w:tcPr><w:p><w:pPr/><w:r><w:rPr><w:rFonts w:ascii="Calibri" w:hAnsi="Calibri" w:eastAsia="Calibri" w:cs="Calibri"/><w:color w:val="111111"/><w:sz w:val="22"/><w:szCs w:val="22"/><w:b w:val="1"/><w:bCs w:val="1"/></w:rPr><w:t xml:space="preserve">Dosen Pengampu</w:t></w:r></w:p></w:tc><w:tc><w:tcPr><w:tcW w:w="5200" w:type="dxa"/><w:noWrap/></w:tcPr><w:p><w:pPr/><w:r><w:rPr><w:rFonts w:ascii="Calibri" w:hAnsi="Calibri" w:eastAsia="Calibri" w:cs="Calibri"/><w:color w:val="333333"/><w:sz w:val="22"/><w:szCs w:val="22"/></w:rPr><w:t xml:space="preserve">Afif Efendi, M.Kom.</w:t></w:r></w:p></w:tc></w:tr><w:tr><w:trPr/><w:tc><w:tcPr><w:tcW w:w="3000" w:type="dxa"/><w:shd w:val="clear" w:fill="F1F5F9"/><w:noWrap/></w:tcPr><w:p><w:pPr/><w:r><w:rPr><w:rFonts w:ascii="Calibri" w:hAnsi="Calibri" w:eastAsia="Calibri" w:cs="Calibri"/><w:color w:val="111111"/><w:sz w:val="22"/><w:szCs w:val="22"/><w:b w:val="1"/><w:bCs w:val="1"/></w:rPr><w:t xml:space="preserve">Tema Proyek (Sesuai Digit NIM 8)</w:t></w:r></w:p></w:tc><w:tc><w:tcPr><w:tcW w:w="5200" w:type="dxa"/><w:noWrap/></w:tcPr><w:p><w:pPr/><w:r><w:rPr><w:rFonts w:ascii="Calibri" w:hAnsi="Calibri" w:eastAsia="Calibri" w:cs="Calibri"/><w:color w:val="333333"/><w:sz w:val="22"/><w:szCs w:val="22"/></w:rPr><w:t xml:space="preserve">Platform Belajar Online</w:t></w:r></w:p></w:tc></w:tr><w:tr><w:trPr/><w:tc><w:tcPr><w:tcW w:w="3000" w:type="dxa"/><w:shd w:val="clear" w:fill="F1F5F9"/><w:noWrap/></w:tcPr><w:p><w:pPr/><w:r><w:rPr><w:rFonts w:ascii="Calibri" w:hAnsi="Calibri" w:eastAsia="Calibri" w:cs="Calibri"/><w:color w:val="111111"/><w:sz w:val="22"/><w:szCs w:val="22"/><w:b w:val="1"/><w:bCs w:val="1"/></w:rPr><w:t xml:space="preserve">Nama Tabel Database</w:t></w:r></w:p></w:tc><w:tc><w:tcPr><w:tcW w:w="5200" w:type="dxa"/><w:noWrap/></w:tcPr><w:p><w:pPr/><w:r><w:rPr><w:rFonts w:ascii="Calibri" w:hAnsi="Calibri" w:eastAsia="Calibri" w:cs="Calibri"/><w:color w:val="333333"/><w:sz w:val="22"/><w:szCs w:val="22"/></w:rPr><w:t xml:space="preserve">courses</w:t></w:r></w:p></w:tc></w:tr><w:tr><w:trPr/><w:tc><w:tcPr><w:tcW w:w="3000" w:type="dxa"/><w:shd w:val="clear" w:fill="F1F5F9"/><w:noWrap/></w:tcPr><w:p><w:pPr/><w:r><w:rPr><w:rFonts w:ascii="Calibri" w:hAnsi="Calibri" w:eastAsia="Calibri" w:cs="Calibri"/><w:color w:val="111111"/><w:sz w:val="22"/><w:szCs w:val="22"/><w:b w:val="1"/><w:bCs w:val="1"/></w:rPr><w:t xml:space="preserve">Nama Database</w:t></w:r></w:p></w:tc><w:tc><w:tcPr><w:tcW w:w="5200" w:type="dxa"/><w:noWrap/></w:tcPr><w:p><w:pPr/><w:r><w:rPr><w:rFonts w:ascii="Calibri" w:hAnsi="Calibri" w:eastAsia="Calibri" w:cs="Calibri"/><w:color w:val="333333"/><w:sz w:val="22"/><w:szCs w:val="22"/></w:rPr><w:t xml:space="preserve">db_uts_251011700008</w:t></w:r></w:p></w:tc></w:tr><w:tr><w:trPr/><w:tc><w:tcPr><w:tcW w:w="3000" w:type="dxa"/><w:shd w:val="clear" w:fill="F1F5F9"/><w:noWrap/></w:tcPr><w:p><w:pPr/><w:r><w:rPr><w:rFonts w:ascii="Calibri" w:hAnsi="Calibri" w:eastAsia="Calibri" w:cs="Calibri"/><w:color w:val="111111"/><w:sz w:val="22"/><w:szCs w:val="22"/><w:b w:val="1"/><w:bCs w:val="1"/></w:rPr><w:t xml:space="preserve">Framework & Versi</w:t></w:r></w:p></w:tc><w:tc><w:tcPr><w:tcW w:w="5200" w:type="dxa"/><w:noWrap/></w:tcPr><w:p><w:pPr/><w:r><w:rPr><w:rFonts w:ascii="Calibri" w:hAnsi="Calibri" w:eastAsia="Calibri" w:cs="Calibri"/><w:color w:val="333333"/><w:sz w:val="22"/><w:szCs w:val="22"/></w:rPr><w:t xml:space="preserve">Laravel 11 / 12, PHP 8.4, Bootstrap 5.3 (Lokal)</w:t></w:r></w:p></w:tc></w:tr><w:tr><w:trPr/><w:tc><w:tcPr><w:tcW w:w="3000" w:type="dxa"/><w:shd w:val="clear" w:fill="F1F5F9"/><w:noWrap/></w:tcPr><w:p><w:pPr/><w:r><w:rPr><w:rFonts w:ascii="Calibri" w:hAnsi="Calibri" w:eastAsia="Calibri" w:cs="Calibri"/><w:color w:val="111111"/><w:sz w:val="22"/><w:szCs w:val="22"/><w:b w:val="1"/><w:bCs w:val="1"/></w:rPr><w:t xml:space="preserve">Web Server / Database Engine</w:t></w:r></w:p></w:tc><w:tc><w:tcPr><w:tcW w:w="5200" w:type="dxa"/><w:noWrap/></w:tcPr><w:p><w:pPr/><w:r><w:rPr><w:rFonts w:ascii="Calibri" w:hAnsi="Calibri" w:eastAsia="Calibri" w:cs="Calibri"/><w:color w:val="333333"/><w:sz w:val="22"/><w:szCs w:val="22"/></w:rPr><w:t xml:space="preserve">MySQL 8.4 (Docker)</w:t></w:r></w:p></w:tc></w:tr></w:tbl><w:p/><w:p><w:pPr><w:pStyle w:val="Heading2"/></w:pPr><w:bookmarkStart w:id="1" w:name="_Toc1"/><w:r><w:t>B. Tautan Repositori GitHub</w:t></w:r><w:bookmarkEnd w:id="1"/></w:p><w:p><w:pPr><w:jc w:val="both"/><w:spacing w:after="120" w:line="276" w:lineRule="auto"/></w:pPr><w:r><w:rPr><w:rFonts w:ascii="Calibri" w:hAnsi="Calibri" w:eastAsia="Calibri" w:cs="Calibri"/><w:color w:val="333333"/><w:sz w:val="22"/><w:szCs w:val="22"/></w:rPr><w:t xml:space="preserve">Sesuai ketentuan soal pada Poin D.10 ("Upload source code ke GitHub dengan nama project UTS_NAMA_NIM_KODEKELAS"), berikut adalah informasi repositori proyek:</w:t></w:r></w:p><w:tbl><w:tblGrid><w:gridCol w:w="3000" w:type="dxa"/><w:gridCol w:w="5200" w:type="dxa"/></w:tblGrid><w:tblPr><w:tblStyle w:val="IdentityTable"/></w:tblPr><w:tr><w:trPr/><w:tc><w:tcPr><w:tcW w:w="3000" w:type="dxa"/><w:shd w:val="clear" w:fill="F1F5F9"/><w:noWrap/></w:tcPr><w:p><w:pPr/><w:r><w:rPr><w:rFonts w:ascii="Calibri" w:hAnsi="Calibri" w:eastAsia="Calibri" w:cs="Calibri"/><w:color w:val="111111"/><w:sz w:val="22"/><w:szCs w:val="22"/><w:b w:val="1"/><w:bCs w:val="1"/></w:rPr><w:t xml:space="preserve">Nama Repositori</w:t></w:r></w:p></w:tc><w:tc><w:tcPr><w:tcW w:w="5200" w:type="dxa"/><w:noWrap/></w:tcPr><w:p><w:pPr/><w:r><w:rPr><w:color w:val="003366"/><w:b w:val="1"/><w:bCs w:val="1"/></w:rPr><w:t xml:space="preserve">UTS_RekayasaWeb_251011700008</w:t></w:r></w:p></w:tc></w:tr><w:tr><w:trPr/><w:tc><w:tcPr><w:tcW w:w="3000" w:type="dxa"/><w:shd w:val="clear" w:fill="F1F5F9"/><w:noWrap/></w:tcPr><w:p><w:pPr/><w:r><w:rPr><w:rFonts w:ascii="Calibri" w:hAnsi="Calibri" w:eastAsia="Calibri" w:cs="Calibri"/><w:color w:val="111111"/><w:sz w:val="22"/><w:szCs w:val="22"/><w:b w:val="1"/><w:bCs w:val="1"/></w:rPr><w:t xml:space="preserve">Link URL GitHub</w:t></w:r></w:p></w:tc><w:tc><w:tcPr><w:tcW w:w="5200" w:type="dxa"/><w:noWrap/></w:tcPr><w:p><w:pPr/><w:r><w:rPr><w:color w:val="0D6EFD"/><w:u w:val="single"/></w:rPr><w:t xml:space="preserve">https://github.com/ilhmpngstu/UTS_RekayasaWeb_251011700008</w:t></w:r></w:p></w:tc></w:tr></w:tbl><w:p/><w:p><w:pPr><w:pStyle w:val="Heading2"/></w:pPr><w:bookmarkStart w:id="2" w:name="_Toc2"/><w:r><w:t>C. Struktur Tabel Database (`courses`)</w:t></w:r><w:bookmarkEnd w:id="2"/></w:p><w:p><w:pPr><w:jc w:val="both"/><w:spacing w:after="120" w:line="276" w:lineRule="auto"/></w:pPr><w:r><w:rPr><w:rFonts w:ascii="Calibri" w:hAnsi="Calibri" w:eastAsia="Calibri" w:cs="Calibri"/><w:color w:val="333333"/><w:sz w:val="22"/><w:szCs w:val="22"/></w:rPr><w:t xml:space="preserve">Tabel courses dibuat menggunakan migration Laravel dan diisi dengan data dummy realistis melalui seeder (Database: `db_uts_251011700008`):</w:t></w:r></w:p><w:tbl><w:tblGrid><w:gridCol w:w="800" w:type="dxa"/><w:gridCol w:w="2000" w:type="dxa"/><w:gridCol w:w="2200" w:type="dxa"/><w:gridCol w:w="3200" w:type="dxa"/></w:tblGrid><w:tblPr><w:tblStyle w:val="IdentityTable"/></w:tblPr><w:tr><w:trPr/><w:tc><w:tcPr><w:tcW w:w="800" w:type="dxa"/><w:shd w:val="clear" w:fill="003366"/><w:noWrap/></w:tcPr><w:p><w:pPr/><w:r><w:rPr><w:rFonts w:ascii="Calibri" w:hAnsi="Calibri" w:eastAsia="Calibri" w:cs="Calibri"/><w:color w:val="FFFFFF"/><w:b w:val="1"/><w:bCs w:val="1"/></w:rPr><w:t xml:space="preserve">No</w:t></w:r></w:p></w:tc><w:tc><w:tcPr><w:tcW w:w="2000" w:type="dxa"/><w:shd w:val="clear" w:fill="003366"/><w:noWrap/></w:tcPr><w:p><w:pPr/><w:r><w:rPr><w:rFonts w:ascii="Calibri" w:hAnsi="Calibri" w:eastAsia="Calibri" w:cs="Calibri"/><w:color w:val="FFFFFF"/><w:b w:val="1"/><w:bCs w:val="1"/></w:rPr><w:t xml:space="preserve">Nama Kolom</w:t></w:r></w:p></w:tc><w:tc><w:tcPr><w:tcW w:w="2200" w:type="dxa"/><w:shd w:val="clear" w:fill="003366"/><w:noWrap/></w:tcPr><w:p><w:pPr/><w:r><w:rPr><w:rFonts w:ascii="Calibri" w:hAnsi="Calibri" w:eastAsia="Calibri" w:cs="Calibri"/><w:color w:val="FFFFFF"/><w:b w:val="1"/><w:bCs w:val="1"/></w:rPr><w:t xml:space="preserve">Tipe Data</w:t></w:r></w:p></w:tc><w:tc><w:tcPr><w:tcW w:w="3200" w:type="dxa"/><w:shd w:val="clear" w:fill="003366"/><w:noWrap/></w:tcPr><w:p><w:pPr/><w:r><w:rPr><w:rFonts w:ascii="Calibri" w:hAnsi="Calibri" w:eastAsia="Calibri" w:cs="Calibri"/><w:color w:val="FFFFFF"/><w:b w:val="1"/><w:bCs w:val="1"/></w:rPr><w:t xml:space="preserve">Keterangan</w:t></w:r></w:p></w:tc></w:tr><w:tr><w:trPr/><w:tc><w:tcPr><w:tcW w:w="800" w:type="dxa"/><w:noWrap/></w:tcPr><w:p><w:pPr/><w:r><w:rPr><w:rFonts w:ascii="Calibri" w:hAnsi="Calibri" w:eastAsia="Calibri" w:cs="Calibri"/><w:color w:val="333333"/><w:sz w:val="22"/><w:szCs w:val="22"/></w:rPr><w:t xml:space="preserve">1</w:t></w:r></w:p></w:tc><w:tc><w:tcPr><w:tcW w:w="2000" w:type="dxa"/><w:noWrap/></w:tcPr><w:p><w:pPr/><w:r><w:rPr><w:rFonts w:ascii="Calibri" w:hAnsi="Calibri" w:eastAsia="Calibri" w:cs="Calibri"/><w:color w:val="111111"/><w:sz w:val="22"/><w:szCs w:val="22"/><w:b w:val="1"/><w:bCs w:val="1"/></w:rPr><w:t xml:space="preserve">id</w:t></w:r></w:p></w:tc><w:tc><w:tcPr><w:tcW w:w="2200" w:type="dxa"/><w:noWrap/></w:tcPr><w:p><w:pPr/><w:r><w:rPr><w:rFonts w:ascii="Calibri" w:hAnsi="Calibri" w:eastAsia="Calibri" w:cs="Calibri"/><w:color w:val="333333"/><w:sz w:val="22"/><w:szCs w:val="22"/></w:rPr><w:t xml:space="preserve">BIGINT AUTO_INCREMENT</w:t></w:r></w:p></w:tc><w:tc><w:tcPr><w:tcW w:w="3200" w:type="dxa"/><w:noWrap/></w:tcPr><w:p><w:pPr/><w:r><w:rPr><w:rFonts w:ascii="Calibri" w:hAnsi="Calibri" w:eastAsia="Calibri" w:cs="Calibri"/><w:color w:val="333333"/><w:sz w:val="22"/><w:szCs w:val="22"/></w:rPr><w:t xml:space="preserve">Primary Key</w:t></w:r></w:p></w:tc></w:tr><w:tr><w:trPr/><w:tc><w:tcPr><w:tcW w:w="800" w:type="dxa"/><w:noWrap/></w:tcPr><w:p><w:pPr/><w:r><w:rPr><w:rFonts w:ascii="Calibri" w:hAnsi="Calibri" w:eastAsia="Calibri" w:cs="Calibri"/><w:color w:val="333333"/><w:sz w:val="22"/><w:szCs w:val="22"/></w:rPr><w:t xml:space="preserve">2</w:t></w:r></w:p></w:tc><w:tc><w:tcPr><w:tcW w:w="2000" w:type="dxa"/><w:noWrap/></w:tcPr><w:p><w:pPr/><w:r><w:rPr><w:rFonts w:ascii="Calibri" w:hAnsi="Calibri" w:eastAsia="Calibri" w:cs="Calibri"/><w:color w:val="111111"/><w:sz w:val="22"/><w:szCs w:val="22"/><w:b w:val="1"/><w:bCs w:val="1"/></w:rPr><w:t xml:space="preserve">title</w:t></w:r></w:p></w:tc><w:tc><w:tcPr><w:tcW w:w="2200" w:type="dxa"/><w:noWrap/></w:tcPr><w:p><w:pPr/><w:r><w:rPr><w:rFonts w:ascii="Calibri" w:hAnsi="Calibri" w:eastAsia="Calibri" w:cs="Calibri"/><w:color w:val="333333"/><w:sz w:val="22"/><w:szCs w:val="22"/></w:rPr><w:t xml:space="preserve">VARCHAR(255)</w:t></w:r></w:p></w:tc><w:tc><w:tcPr><w:tcW w:w="3200" w:type="dxa"/><w:noWrap/></w:tcPr><w:p><w:pPr/><w:r><w:rPr><w:rFonts w:ascii="Calibri" w:hAnsi="Calibri" w:eastAsia="Calibri" w:cs="Calibri"/><w:color w:val="333333"/><w:sz w:val="22"/><w:szCs w:val="22"/></w:rPr><w:t xml:space="preserve">Judul kursus online</w:t></w:r></w:p></w:tc></w:tr><w:tr><w:trPr/><w:tc><w:tcPr><w:tcW w:w="800" w:type="dxa"/><w:noWrap/></w:tcPr><w:p><w:pPr/><w:r><w:rPr><w:rFonts w:ascii="Calibri" w:hAnsi="Calibri" w:eastAsia="Calibri" w:cs="Calibri"/><w:color w:val="333333"/><w:sz w:val="22"/><w:szCs w:val="22"/></w:rPr><w:t xml:space="preserve">3</w:t></w:r></w:p></w:tc><w:tc><w:tcPr><w:tcW w:w="2000" w:type="dxa"/><w:noWrap/></w:tcPr><w:p><w:pPr/><w:r><w:rPr><w:rFonts w:ascii="Calibri" w:hAnsi="Calibri" w:eastAsia="Calibri" w:cs="Calibri"/><w:color w:val="111111"/><w:sz w:val="22"/><w:szCs w:val="22"/><w:b w:val="1"/><w:bCs w:val="1"/></w:rPr><w:t xml:space="preserve">instructor</w:t></w:r></w:p></w:tc><w:tc><w:tcPr><w:tcW w:w="2200" w:type="dxa"/><w:noWrap/></w:tcPr><w:p><w:pPr/><w:r><w:rPr><w:rFonts w:ascii="Calibri" w:hAnsi="Calibri" w:eastAsia="Calibri" w:cs="Calibri"/><w:color w:val="333333"/><w:sz w:val="22"/><w:szCs w:val="22"/></w:rPr><w:t xml:space="preserve">VARCHAR(255)</w:t></w:r></w:p></w:tc><w:tc><w:tcPr><w:tcW w:w="3200" w:type="dxa"/><w:noWrap/></w:tcPr><w:p><w:pPr/><w:r><w:rPr><w:rFonts w:ascii="Calibri" w:hAnsi="Calibri" w:eastAsia="Calibri" w:cs="Calibri"/><w:color w:val="333333"/><w:sz w:val="22"/><w:szCs w:val="22"/></w:rPr><w:t xml:space="preserve">Nama instruktur kursus</w:t></w:r></w:p></w:tc></w:tr><w:tr><w:trPr/><w:tc><w:tcPr><w:tcW w:w="800" w:type="dxa"/><w:noWrap/></w:tcPr><w:p><w:pPr/><w:r><w:rPr><w:rFonts w:ascii="Calibri" w:hAnsi="Calibri" w:eastAsia="Calibri" w:cs="Calibri"/><w:color w:val="333333"/><w:sz w:val="22"/><w:szCs w:val="22"/></w:rPr><w:t xml:space="preserve">4</w:t></w:r></w:p></w:tc><w:tc><w:tcPr><w:tcW w:w="2000" w:type="dxa"/><w:noWrap/></w:tcPr><w:p><w:pPr/><w:r><w:rPr><w:rFonts w:ascii="Calibri" w:hAnsi="Calibri" w:eastAsia="Calibri" w:cs="Calibri"/><w:color w:val="111111"/><w:sz w:val="22"/><w:szCs w:val="22"/><w:b w:val="1"/><w:bCs w:val="1"/></w:rPr><w:t xml:space="preserve">duration</w:t></w:r></w:p></w:tc><w:tc><w:tcPr><w:tcW w:w="2200" w:type="dxa"/><w:noWrap/></w:tcPr><w:p><w:pPr/><w:r><w:rPr><w:rFonts w:ascii="Calibri" w:hAnsi="Calibri" w:eastAsia="Calibri" w:cs="Calibri"/><w:color w:val="333333"/><w:sz w:val="22"/><w:szCs w:val="22"/></w:rPr><w:t xml:space="preserve">VARCHAR(255)</w:t></w:r></w:p></w:tc><w:tc><w:tcPr><w:tcW w:w="3200" w:type="dxa"/><w:noWrap/></w:tcPr><w:p><w:pPr/><w:r><w:rPr><w:rFonts w:ascii="Calibri" w:hAnsi="Calibri" w:eastAsia="Calibri" w:cs="Calibri"/><w:color w:val="333333"/><w:sz w:val="22"/><w:szCs w:val="22"/></w:rPr><w:t xml:space="preserve">Durasi materi (misal: "24 Jam Video")</w:t></w:r></w:p></w:tc></w:tr><w:tr><w:trPr/><w:tc><w:tcPr><w:tcW w:w="800" w:type="dxa"/><w:noWrap/></w:tcPr><w:p><w:pPr/><w:r><w:rPr><w:rFonts w:ascii="Calibri" w:hAnsi="Calibri" w:eastAsia="Calibri" w:cs="Calibri"/><w:color w:val="333333"/><w:sz w:val="22"/><w:szCs w:val="22"/></w:rPr><w:t xml:space="preserve">5</w:t></w:r></w:p></w:tc><w:tc><w:tcPr><w:tcW w:w="2000" w:type="dxa"/><w:noWrap/></w:tcPr><w:p><w:pPr/><w:r><w:rPr><w:rFonts w:ascii="Calibri" w:hAnsi="Calibri" w:eastAsia="Calibri" w:cs="Calibri"/><w:color w:val="111111"/><w:sz w:val="22"/><w:szCs w:val="22"/><w:b w:val="1"/><w:bCs w:val="1"/></w:rPr><w:t xml:space="preserve">image</w:t></w:r></w:p></w:tc><w:tc><w:tcPr><w:tcW w:w="2200" w:type="dxa"/><w:noWrap/></w:tcPr><w:p><w:pPr/><w:r><w:rPr><w:rFonts w:ascii="Calibri" w:hAnsi="Calibri" w:eastAsia="Calibri" w:cs="Calibri"/><w:color w:val="333333"/><w:sz w:val="22"/><w:szCs w:val="22"/></w:rPr><w:t xml:space="preserve">VARCHAR(255)</w:t></w:r></w:p></w:tc><w:tc><w:tcPr><w:tcW w:w="3200" w:type="dxa"/><w:noWrap/></w:tcPr><w:p><w:pPr/><w:r><w:rPr><w:rFonts w:ascii="Calibri" w:hAnsi="Calibri" w:eastAsia="Calibri" w:cs="Calibri"/><w:color w:val="333333"/><w:sz w:val="22"/><w:szCs w:val="22"/></w:rPr><w:t xml:space="preserve">Nama file di public/assets/images/</w:t></w:r></w:p></w:tc></w:tr><w:tr><w:trPr/><w:tc><w:tcPr><w:tcW w:w="800" w:type="dxa"/><w:noWrap/></w:tcPr><w:p><w:pPr/><w:r><w:rPr><w:rFonts w:ascii="Calibri" w:hAnsi="Calibri" w:eastAsia="Calibri" w:cs="Calibri"/><w:color w:val="333333"/><w:sz w:val="22"/><w:szCs w:val="22"/></w:rPr><w:t xml:space="preserve">6</w:t></w:r></w:p></w:tc><w:tc><w:tcPr><w:tcW w:w="2000" w:type="dxa"/><w:noWrap/></w:tcPr><w:p><w:pPr/><w:r><w:rPr><w:rFonts w:ascii="Calibri" w:hAnsi="Calibri" w:eastAsia="Calibri" w:cs="Calibri"/><w:color w:val="111111"/><w:sz w:val="22"/><w:szCs w:val="22"/><w:b w:val="1"/><w:bCs w:val="1"/></w:rPr><w:t xml:space="preserve">price</w:t></w:r></w:p></w:tc><w:tc><w:tcPr><w:tcW w:w="2200" w:type="dxa"/><w:noWrap/></w:tcPr><w:p><w:pPr/><w:r><w:rPr><w:rFonts w:ascii="Calibri" w:hAnsi="Calibri" w:eastAsia="Calibri" w:cs="Calibri"/><w:color w:val="333333"/><w:sz w:val="22"/><w:szCs w:val="22"/></w:rPr><w:t xml:space="preserve">DECIMAL(12, 2)</w:t></w:r></w:p></w:tc><w:tc><w:tcPr><w:tcW w:w="3200" w:type="dxa"/><w:noWrap/></w:tcPr><w:p><w:pPr/><w:r><w:rPr><w:rFonts w:ascii="Calibri" w:hAnsi="Calibri" w:eastAsia="Calibri" w:cs="Calibri"/><w:color w:val="333333"/><w:sz w:val="22"/><w:szCs w:val="22"/></w:rPr><w:t xml:space="preserve">Harga kursus dalam Rupiah</w:t></w:r></w:p></w:tc></w:tr><w:tr><w:trPr/><w:tc><w:tcPr><w:tcW w:w="800" w:type="dxa"/><w:noWrap/></w:tcPr><w:p><w:pPr/><w:r><w:rPr><w:rFonts w:ascii="Calibri" w:hAnsi="Calibri" w:eastAsia="Calibri" w:cs="Calibri"/><w:color w:val="333333"/><w:sz w:val="22"/><w:szCs w:val="22"/></w:rPr><w:t xml:space="preserve">7</w:t></w:r></w:p></w:tc><w:tc><w:tcPr><w:tcW w:w="2000" w:type="dxa"/><w:noWrap/></w:tcPr><w:p><w:pPr/><w:r><w:rPr><w:rFonts w:ascii="Calibri" w:hAnsi="Calibri" w:eastAsia="Calibri" w:cs="Calibri"/><w:color w:val="111111"/><w:sz w:val="22"/><w:szCs w:val="22"/><w:b w:val="1"/><w:bCs w:val="1"/></w:rPr><w:t xml:space="preserve">category</w:t></w:r></w:p></w:tc><w:tc><w:tcPr><w:tcW w:w="2200" w:type="dxa"/><w:noWrap/></w:tcPr><w:p><w:pPr/><w:r><w:rPr><w:rFonts w:ascii="Calibri" w:hAnsi="Calibri" w:eastAsia="Calibri" w:cs="Calibri"/><w:color w:val="333333"/><w:sz w:val="22"/><w:szCs w:val="22"/></w:rPr><w:t xml:space="preserve">VARCHAR(255)</w:t></w:r></w:p></w:tc><w:tc><w:tcPr><w:tcW w:w="3200" w:type="dxa"/><w:noWrap/></w:tcPr><w:p><w:pPr/><w:r><w:rPr><w:rFonts w:ascii="Calibri" w:hAnsi="Calibri" w:eastAsia="Calibri" w:cs="Calibri"/><w:color w:val="333333"/><w:sz w:val="22"/><w:szCs w:val="22"/></w:rPr><w:t xml:space="preserve">Kategori materi kursus</w:t></w:r></w:p></w:tc></w:tr><w:tr><w:trPr/><w:tc><w:tcPr><w:tcW w:w="800" w:type="dxa"/><w:noWrap/></w:tcPr><w:p><w:pPr/><w:r><w:rPr><w:rFonts w:ascii="Calibri" w:hAnsi="Calibri" w:eastAsia="Calibri" w:cs="Calibri"/><w:color w:val="333333"/><w:sz w:val="22"/><w:szCs w:val="22"/></w:rPr><w:t xml:space="preserve">8</w:t></w:r></w:p></w:tc><w:tc><w:tcPr><w:tcW w:w="2000" w:type="dxa"/><w:noWrap/></w:tcPr><w:p><w:pPr/><w:r><w:rPr><w:rFonts w:ascii="Calibri" w:hAnsi="Calibri" w:eastAsia="Calibri" w:cs="Calibri"/><w:color w:val="111111"/><w:sz w:val="22"/><w:szCs w:val="22"/><w:b w:val="1"/><w:bCs w:val="1"/></w:rPr><w:t xml:space="preserve">description</w:t></w:r></w:p></w:tc><w:tc><w:tcPr><w:tcW w:w="2200" w:type="dxa"/><w:noWrap/></w:tcPr><w:p><w:pPr/><w:r><w:rPr><w:rFonts w:ascii="Calibri" w:hAnsi="Calibri" w:eastAsia="Calibri" w:cs="Calibri"/><w:color w:val="333333"/><w:sz w:val="22"/><w:szCs w:val="22"/></w:rPr><w:t xml:space="preserve">TEXT (Nullable)</w:t></w:r></w:p></w:tc><w:tc><w:tcPr><w:tcW w:w="3200" w:type="dxa"/><w:noWrap/></w:tcPr><w:p><w:pPr/><w:r><w:rPr><w:rFonts w:ascii="Calibri" w:hAnsi="Calibri" w:eastAsia="Calibri" w:cs="Calibri"/><w:color w:val="333333"/><w:sz w:val="22"/><w:szCs w:val="22"/></w:rPr><w:t xml:space="preserve">Deskripsi lengkap silabus kursus</w:t></w:r></w:p></w:tc></w:tr><w:tr><w:trPr/><w:tc><w:tcPr><w:tcW w:w="800" w:type="dxa"/><w:noWrap/></w:tcPr><w:p><w:pPr/><w:r><w:rPr><w:rFonts w:ascii="Calibri" w:hAnsi="Calibri" w:eastAsia="Calibri" w:cs="Calibri"/><w:color w:val="333333"/><w:sz w:val="22"/><w:szCs w:val="22"/></w:rPr><w:t xml:space="preserve">9</w:t></w:r></w:p></w:tc><w:tc><w:tcPr><w:tcW w:w="2000" w:type="dxa"/><w:noWrap/></w:tcPr><w:p><w:pPr/><w:r><w:rPr><w:rFonts w:ascii="Calibri" w:hAnsi="Calibri" w:eastAsia="Calibri" w:cs="Calibri"/><w:color w:val="111111"/><w:sz w:val="22"/><w:szCs w:val="22"/><w:b w:val="1"/><w:bCs w:val="1"/></w:rPr><w:t xml:space="preserve">created_at</w:t></w:r></w:p></w:tc><w:tc><w:tcPr><w:tcW w:w="2200" w:type="dxa"/><w:noWrap/></w:tcPr><w:p><w:pPr/><w:r><w:rPr><w:rFonts w:ascii="Calibri" w:hAnsi="Calibri" w:eastAsia="Calibri" w:cs="Calibri"/><w:color w:val="333333"/><w:sz w:val="22"/><w:szCs w:val="22"/></w:rPr><w:t xml:space="preserve">TIMESTAMP</w:t></w:r></w:p></w:tc><w:tc><w:tcPr><w:tcW w:w="3200" w:type="dxa"/><w:noWrap/></w:tcPr><w:p><w:pPr/><w:r><w:rPr><w:rFonts w:ascii="Calibri" w:hAnsi="Calibri" w:eastAsia="Calibri" w:cs="Calibri"/><w:color w:val="333333"/><w:sz w:val="22"/><w:szCs w:val="22"/></w:rPr><w:t xml:space="preserve">Waktu pembuatan data</w:t></w:r></w:p></w:tc></w:tr><w:tr><w:trPr/><w:tc><w:tcPr><w:tcW w:w="800" w:type="dxa"/><w:noWrap/></w:tcPr><w:p><w:pPr/><w:r><w:rPr><w:rFonts w:ascii="Calibri" w:hAnsi="Calibri" w:eastAsia="Calibri" w:cs="Calibri"/><w:color w:val="333333"/><w:sz w:val="22"/><w:szCs w:val="22"/></w:rPr><w:t xml:space="preserve">10</w:t></w:r></w:p></w:tc><w:tc><w:tcPr><w:tcW w:w="2000" w:type="dxa"/><w:noWrap/></w:tcPr><w:p><w:pPr/><w:r><w:rPr><w:rFonts w:ascii="Calibri" w:hAnsi="Calibri" w:eastAsia="Calibri" w:cs="Calibri"/><w:color w:val="111111"/><w:sz w:val="22"/><w:szCs w:val="22"/><w:b w:val="1"/><w:bCs w:val="1"/></w:rPr><w:t xml:space="preserve">updated_at</w:t></w:r></w:p></w:tc><w:tc><w:tcPr><w:tcW w:w="2200" w:type="dxa"/><w:noWrap/></w:tcPr><w:p><w:pPr/><w:r><w:rPr><w:rFonts w:ascii="Calibri" w:hAnsi="Calibri" w:eastAsia="Calibri" w:cs="Calibri"/><w:color w:val="333333"/><w:sz w:val="22"/><w:szCs w:val="22"/></w:rPr><w:t xml:space="preserve">TIMESTAMP</w:t></w:r></w:p></w:tc><w:tc><w:tcPr><w:tcW w:w="3200" w:type="dxa"/><w:noWrap/></w:tcPr><w:p><w:pPr/><w:r><w:rPr><w:rFonts w:ascii="Calibri" w:hAnsi="Calibri" w:eastAsia="Calibri" w:cs="Calibri"/><w:color w:val="333333"/><w:sz w:val="22"/><w:szCs w:val="22"/></w:rPr><w:t xml:space="preserve">Waktu perbaruan data</w:t></w:r></w:p></w:tc></w:tr></w:tbl><w:p><w:r><w:br w:type="page"/></w:r></w:p><w:p><w:pPr><w:pStyle w:val="Heading2"/></w:pPr><w:bookmarkStart w:id="3" w:name="_Toc3"/><w:r><w:t>D. Screenshot Hasil Implementasi Aplikasi Web</w:t></w:r><w:bookmarkEnd w:id="3"/></w:p><w:p><w:pPr><w:jc w:val="both"/><w:spacing w:after="120" w:line="276" w:lineRule="auto"/></w:pPr><w:r><w:rPr><w:rFonts w:ascii="Calibri" w:hAnsi="Calibri" w:eastAsia="Calibri" w:cs="Calibri"/><w:color w:val="333333"/><w:sz w:val="22"/><w:szCs w:val="22"/></w:rPr><w:t xml:space="preserve">Berikut adalah tangkapan layar tampilan antarmuka web yang dibangun dengan framework Laravel, Blade Template, dan Bootstrap 5:</w:t></w:r></w:p><w:p><w:pPr><w:pStyle w:val="Heading3"/></w:pPr><w:bookmarkStart w:id="4" w:name="_Toc4"/><w:r><w:t>1. Halaman Katalog Kursus (Card Grid & Header Banner UNPAM)</w:t></w:r><w:bookmarkEnd w:id="4"/></w:p><w:p><w:pPr/><w:r><w:rPr><w:rFonts w:ascii="Calibri" w:hAnsi="Calibri" w:eastAsia="Calibri" w:cs="Calibri"/><w:color w:val="666666"/><w:sz w:val="20"/><w:szCs w:val="20"/><w:i w:val="1"/><w:iCs w:val="1"/></w:rPr><w:t xml:space="preserve">Menampilkan header resmi Yayasan Sasmita Jaya dan UNPAM, identitas mahasiswa, fitur filter kategori, pencarian, dan daftar kartu kursus responsif.</w:t></w:r></w:p><w:p><w:pPr><w:jc w:val="center"/></w:pPr><w:r><w:pict><v:shape type="#_x0000_t75" stroked="f" style="width:470pt; height:376pt; margin-left:0pt; margin-top:0pt; mso-position-horizontal:left; mso-position-vertical:top; mso-position-horizontal-relative:char; mso-position-vertical-relative:line;"><w10:wrap type="inline"/><v:imagedata r:id="rId7" o:title=""/></v:shape></w:pict></w:r></w:p><w:p/><w:p><w:pPr><w:pStyle w:val="Heading3"/></w:pPr><w:bookmarkStart w:id="5" w:name="_Toc5"/><w:r><w:t>2. Halaman Tampilan Tabel Data Kursus (`table` Bootstrap)</w:t></w:r><w:bookmarkEnd w:id="5"/></w:p><w:p><w:pPr/><w:r><w:rPr><w:rFonts w:ascii="Calibri" w:hAnsi="Calibri" w:eastAsia="Calibri" w:cs="Calibri"/><w:color w:val="666666"/><w:sz w:val="20"/><w:szCs w:val="20"/><w:i w:val="1"/><w:iCs w:val="1"/></w:rPr><w:t xml:space="preserve">Menampilkan data tabel courses menggunakan komponen Bootstrap table table-hover table-striped lengkap dengan thumbnail, kategori badge, harga, dan tombol detail.</w:t></w:r></w:p><w:p><w:pPr><w:jc w:val="center"/></w:pPr><w:r><w:pict><v:shape type="#_x0000_t75" stroked="f" style="width:470pt; height:376pt; margin-left:0pt; margin-top:0pt; mso-position-horizontal:left; mso-position-vertical:top; mso-position-horizontal-relative:char; mso-position-vertical-relative:line;"><w10:wrap type="inline"/><v:imagedata r:id="rId8" o:title=""/></v:shape></w:pict></w:r></w:p><w:p><w:r><w:br w:type="page"/></w:r></w:p><w:p><w:pPr><w:pStyle w:val="Heading3"/></w:pPr><w:bookmarkStart w:id="6" w:name="_Toc6"/><w:r><w:t>3. Halaman Detail Kursus (Show View)</w:t></w:r><w:bookmarkEnd w:id="6"/></w:p><w:p><w:pPr/><w:r><w:rPr><w:rFonts w:ascii="Calibri" w:hAnsi="Calibri" w:eastAsia="Calibri" w:cs="Calibri"/><w:color w:val="666666"/><w:sz w:val="20"/><w:szCs w:val="20"/><w:i w:val="1"/><w:iCs w:val="1"/></w:rPr><w:t xml:space="preserve">Menampilkan rincian materi lengkap, breadcrumb navigasi, profil instruktur, silabus modul pembelajaran (Accordion Bootstrap), fasilitas, serta modal pendaftaran.</w:t></w:r></w:p><w:p><w:pPr><w:jc w:val="center"/></w:pPr><w:r><w:pict><v:shape type="#_x0000_t75" stroked="f" style="width:470pt; height:376pt; margin-left:0pt; margin-top:0pt; mso-position-horizontal:left; mso-position-vertical:top; mso-position-horizontal-relative:char; mso-position-vertical-relative:line;"><w10:wrap type="inline"/><v:imagedata r:id="rId9" o:title=""/></v:shape></w:pict></w:r></w:p><w:p/><w:p><w:pPr><w:pStyle w:val="Heading3"/></w:pPr><w:bookmarkStart w:id="7" w:name="_Toc7"/><w:r><w:t>4. Halaman Identitas Mahasiswa & Informasi Penugasan UTS</w:t></w:r><w:bookmarkEnd w:id="7"/></w:p><w:p><w:pPr/><w:r><w:rPr><w:rFonts w:ascii="Calibri" w:hAnsi="Calibri" w:eastAsia="Calibri" w:cs="Calibri"/><w:color w:val="666666"/><w:sz w:val="20"/><w:szCs w:val="20"/><w:i w:val="1"/><w:iCs w:val="1"/></w:rPr><w:t xml:space="preserve">Menampilkan identitas lengkap mahasiswa pengembang, rincian teknis penugasan UTS, checklist pemenuhan seluruh butir soal, dan ringkasan statistik database.</w:t></w:r></w:p><w:p><w:pPr><w:jc w:val="center"/></w:pPr><w:r><w:pict><v:shape type="#_x0000_t75" stroked="f" style="width:470pt; height:376pt; margin-left:0pt; margin-top:0pt; mso-position-horizontal:left; mso-position-vertical:top; mso-position-horizontal-relative:char; mso-position-vertical-relative:line;"><w10:wrap type="inline"/><v:imagedata r:id="rId10" o:title=""/></v:shape></w:pict></w:r></w:p><w:p/><w:p><w:pPr><w:pStyle w:val="Heading2"/></w:pPr><w:bookmarkStart w:id="8" w:name="_Toc8"/><w:r><w:t>E. Kesimpulan</w:t></w:r><w:bookmarkEnd w:id="8"/></w:p><w:p><w:pPr><w:jc w:val="both"/><w:spacing w:after="120" w:line="276" w:lineRule="auto"/></w:pPr><w:r><w:rPr><w:rFonts w:ascii="Calibri" w:hAnsi="Calibri" w:eastAsia="Calibri" w:cs="Calibri"/><w:color w:val="333333"/><w:sz w:val="22"/><w:szCs w:val="22"/></w:rPr><w:t xml:space="preserve">Seluruh instruksi dan ketentuan pada soal Ujian Tengah Semester (UTS) mata kuliah Rekayasa Web telah berhasil diimplementasikan dengan baik:</w:t></w:r></w:p><w:p><w:pPr><w:numPr><w:ilvl w:val="0"/><w:numId w:val="5"/></w:numPr></w:pPr><w:r><w:rPr><w:rFonts w:ascii="Calibri" w:hAnsi="Calibri" w:eastAsia="Calibri" w:cs="Calibri"/><w:color w:val="333333"/><w:sz w:val="22"/><w:szCs w:val="22"/></w:rPr><w:t xml:space="preserve">Proyek dibuat menggunakan framework Laravel dengan arsitektur MVC terstruktur.</w:t></w:r></w:p><w:p><w:pPr><w:numPr><w:ilvl w:val="0"/><w:numId w:val="5"/></w:numPr></w:pPr><w:r><w:rPr><w:rFonts w:ascii="Calibri" w:hAnsi="Calibri" w:eastAsia="Calibri" w:cs="Calibri"/><w:color w:val="333333"/><w:sz w:val="22"/><w:szCs w:val="22"/></w:rPr><w:t xml:space="preserve">Tabel courses dan database db_uts_251011700008 berhasil dimigrasikan serta diisi data dummy realistis via Seeder.</w:t></w:r></w:p><w:p><w:pPr><w:numPr><w:ilvl w:val="0"/><w:numId w:val="5"/></w:numPr></w:pPr><w:r><w:rPr><w:rFonts w:ascii="Calibri" w:hAnsi="Calibri" w:eastAsia="Calibri" w:cs="Calibri"/><w:color w:val="333333"/><w:sz w:val="22"/><w:szCs w:val="22"/></w:rPr><w:t xml:space="preserve">Asset Bootstrap 5.3 dan gambar thumbnail tersimpan secara mandiri di folder public aplikasi.</w:t></w:r></w:p><w:p><w:pPr><w:numPr><w:ilvl w:val="0"/><w:numId w:val="5"/></w:numPr></w:pPr><w:r><w:rPr><w:rFonts w:ascii="Calibri" w:hAnsi="Calibri" w:eastAsia="Calibri" w:cs="Calibri"/><w:color w:val="333333"/><w:sz w:val="22"/><w:szCs w:val="22"/></w:rPr><w:t xml:space="preserve">Layout utama Blade Template berhasil diterapkan dengan rapi menggunakan @extends dan @section tanpa perulangan kode.</w:t></w:r></w:p><w:p><w:pPr><w:numPr><w:ilvl w:val="0"/><w:numId w:val="5"/></w:numPr></w:pPr><w:r><w:rPr><w:rFonts w:ascii="Calibri" w:hAnsi="Calibri" w:eastAsia="Calibri" w:cs="Calibri"/><w:color w:val="333333"/><w:sz w:val="22"/><w:szCs w:val="22"/></w:rPr><w:t xml:space="preserve">Tampilan katalog Card Grid, Tampilan Tabel, Halaman Detail Kursus, serta navigasi antar halaman berfungsi dengan lancar dan responsif.</w:t></w:r></w:p><w:sectPr><w:pgSz w:orient="portrait" w:w="11905.511811023622" w:h="16837.79527559055"/><w:pgMar w:top="1200" w:right="1400" w:bottom="1200" w:left="1400" w:header="720" w:footer="720" w:gutter="0"/><w:cols w:num="1" w:space="720"/></w:sectPr></w:body></w:document>
 </file>
 
 <file path=word/comments.xml><?xml version="1.0" encoding="utf-8"?>
@@ -10,7 +10,7 @@
 <file path=word/numbering.xml><?xml version="1.0" encoding="utf-8"?>
 <w:numbering xmlns:ve="http://schemas.openxmlformats.org/markup-compatibility/2006" xmlns:o="urn:schemas-microsoft-com:office:office" xmlns:r="http://schemas.openxmlformats.org/officeDocument/2006/relationships" xmlns:m="http://schemas.openxmlformats.org/officeDocument/2006/math" xmlns:v="urn:schemas-microsoft-com:vml" xmlns:wp="http://schemas.openxmlformats.org/drawingml/2006/wordprocessingDrawing" xmlns:w10="urn:schemas-microsoft-com:office:word" xmlns:w="http://schemas.openxmlformats.org/wordprocessingml/2006/main" xmlns:wne="http://schemas.microsoft.com/office/word/2006/wordml">
   <w:abstractNum w:abstractNumId="5">
-    <w:nsid w:val="4CD2B0C6"/>
+    <w:nsid w:val="10A9FF15"/>
     <w:multiLevelType w:val="hybridMultilevel"/>
     <w:lvl w:ilvl="0">
       <w:start w:val="1"/>

</xml_diff>

<commit_message>
fix(docs): perbaiki format XML dokumen docx agar dapat dibuka dengan normal
</commit_message>
<xml_diff>
--- a/docs/UTS_RekayasaWeb_IlhamPangestu_251011700008.docx
+++ b/docs/UTS_RekayasaWeb_IlhamPangestu_251011700008.docx
@@ -1,6 +1,2000 @@
 
-<file path=word/document.xml><?xml version="1.0" encoding="UTF-8" standalone="yes"?>
-<w:document xmlns:ve="http://schemas.openxmlformats.org/markup-compatibility/2006" xmlns:o="urn:schemas-microsoft-com:office:office" xmlns:r="http://schemas.openxmlformats.org/officeDocument/2006/relationships" xmlns:m="http://schemas.openxmlformats.org/officeDocument/2006/math" xmlns:v="urn:schemas-microsoft-com:vml" xmlns:wp="http://schemas.openxmlformats.org/drawingml/2006/wordprocessingDrawing" xmlns:w10="urn:schemas-microsoft-com:office:word" xmlns:w="http://schemas.openxmlformats.org/wordprocessingml/2006/main" xmlns:wne="http://schemas.microsoft.com/office/word/2006/wordml"><w:body><w:p><w:pPr><w:jc w:val="center"/><w:spacing w:after="120"/></w:pPr><w:r><w:rPr><w:rFonts w:ascii="Calibri" w:hAnsi="Calibri" w:eastAsia="Calibri" w:cs="Calibri"/><w:sz w:val="26"/><w:szCs w:val="26"/><w:b w:val="1"/><w:bCs w:val="1"/></w:rPr><w:t xml:space="preserve">YAYASAN SASMITA JAYA</w:t></w:r></w:p><w:p><w:pPr><w:jc w:val="center"/><w:spacing w:after="120"/></w:pPr><w:r><w:rPr><w:rFonts w:ascii="Calibri" w:hAnsi="Calibri" w:eastAsia="Calibri" w:cs="Calibri"/><w:color w:val="003366"/><w:sz w:val="32"/><w:szCs w:val="32"/><w:b w:val="1"/><w:bCs w:val="1"/></w:rPr><w:t xml:space="preserve">UNIVERSITAS PAMULANG</w:t></w:r></w:p><w:p><w:pPr><w:jc w:val="center"/><w:spacing w:after="120"/></w:pPr><w:r><w:rPr><w:rFonts w:ascii="Calibri" w:hAnsi="Calibri" w:eastAsia="Calibri" w:cs="Calibri"/><w:color w:val="555555"/><w:sz w:val="20"/><w:szCs w:val="20"/><w:b w:val="1"/><w:bCs w:val="1"/></w:rPr><w:t xml:space="preserve">FAKULTAS ILMU KOMPUTER - PROGRAM STUDI SISTEM INFORMASI S-1</w:t></w:r></w:p><w:p><w:pPr><w:jc w:val="center"/><w:spacing w:after="120"/></w:pPr><w:r><w:rPr><w:rFonts w:ascii="Calibri" w:hAnsi="Calibri" w:eastAsia="Calibri" w:cs="Calibri"/><w:color w:val="777777"/><w:sz w:val="18"/><w:szCs w:val="18"/></w:rPr><w:t xml:space="preserve">Jl. Puspitek Raya No. 10, Serpong - Tangerang Selatan | www.unpam.ac.id</w:t></w:r></w:p><w:p><w:pPr/><w:r><w:pict><v:shape id="_x0000_s1005" type="#_x0000_t32" style="width:480pt; height:0pt; margin-left:0pt; margin-top:0pt; mso-position-horizontal:left; mso-position-vertical:top; mso-position-horizontal-relative:char; mso-position-vertical-relative:line;"><w10:wrap type="inline"/><v:stroke weight="2pt" color="003366"/></v:shape></w:pict></w:r></w:p><w:p/><w:p><w:pPr><w:jc w:val="center"/><w:spacing w:after="120"/></w:pPr><w:r><w:rPr><w:rFonts w:ascii="Calibri" w:hAnsi="Calibri" w:eastAsia="Calibri" w:cs="Calibri"/><w:color w:val="003366"/><w:sz w:val="30"/><w:szCs w:val="30"/><w:b w:val="1"/><w:bCs w:val="1"/></w:rPr><w:t xml:space="preserve">LAPORAN DOKUMENTASI HASIL APLIKASI WEB</w:t></w:r></w:p><w:p><w:pPr><w:jc w:val="center"/><w:spacing w:after="120"/></w:pPr><w:r><w:rPr><w:rFonts w:ascii="Calibri" w:hAnsi="Calibri" w:eastAsia="Calibri" w:cs="Calibri"/><w:sz w:val="24"/><w:szCs w:val="24"/><w:b w:val="1"/><w:bCs w:val="1"/></w:rPr><w:t xml:space="preserve">UJIAN TENGAH SEMESTER (UTS) SEMESTER GANJIL T.A. 2026/2027</w:t></w:r></w:p><w:p/><w:p><w:pPr><w:pStyle w:val="Heading2"/></w:pPr><w:bookmarkStart w:id="0" w:name="_Toc0"/><w:r><w:t>A. Identitas Mahasiswa & Penugasan</w:t></w:r><w:bookmarkEnd w:id="0"/></w:p><w:tbl><w:tblGrid><w:gridCol w:w="3000" w:type="dxa"/><w:gridCol w:w="5200" w:type="dxa"/></w:tblGrid><w:tblPr><w:tblStyle w:val="IdentityTable"/></w:tblPr><w:tr><w:trPr/><w:tc><w:tcPr><w:tcW w:w="3000" w:type="dxa"/><w:shd w:val="clear" w:fill="F1F5F9"/><w:noWrap/></w:tcPr><w:p><w:pPr/><w:r><w:rPr><w:rFonts w:ascii="Calibri" w:hAnsi="Calibri" w:eastAsia="Calibri" w:cs="Calibri"/><w:color w:val="111111"/><w:sz w:val="22"/><w:szCs w:val="22"/><w:b w:val="1"/><w:bCs w:val="1"/></w:rPr><w:t xml:space="preserve">Nama Lengkap</w:t></w:r></w:p></w:tc><w:tc><w:tcPr><w:tcW w:w="5200" w:type="dxa"/><w:noWrap/></w:tcPr><w:p><w:pPr/><w:r><w:rPr><w:rFonts w:ascii="Calibri" w:hAnsi="Calibri" w:eastAsia="Calibri" w:cs="Calibri"/><w:color w:val="333333"/><w:sz w:val="22"/><w:szCs w:val="22"/></w:rPr><w:t xml:space="preserve">Ilham Pangestu</w:t></w:r></w:p></w:tc></w:tr><w:tr><w:trPr/><w:tc><w:tcPr><w:tcW w:w="3000" w:type="dxa"/><w:shd w:val="clear" w:fill="F1F5F9"/><w:noWrap/></w:tcPr><w:p><w:pPr/><w:r><w:rPr><w:rFonts w:ascii="Calibri" w:hAnsi="Calibri" w:eastAsia="Calibri" w:cs="Calibri"/><w:color w:val="111111"/><w:sz w:val="22"/><w:szCs w:val="22"/><w:b w:val="1"/><w:bCs w:val="1"/></w:rPr><w:t xml:space="preserve">Nomor Induk Mahasiswa (NIM)</w:t></w:r></w:p></w:tc><w:tc><w:tcPr><w:tcW w:w="5200" w:type="dxa"/><w:noWrap/></w:tcPr><w:p><w:pPr/><w:r><w:rPr><w:rFonts w:ascii="Calibri" w:hAnsi="Calibri" w:eastAsia="Calibri" w:cs="Calibri"/><w:color w:val="333333"/><w:sz w:val="22"/><w:szCs w:val="22"/></w:rPr><w:t xml:space="preserve">251011700008</w:t></w:r></w:p></w:tc></w:tr><w:tr><w:trPr/><w:tc><w:tcPr><w:tcW w:w="3000" w:type="dxa"/><w:shd w:val="clear" w:fill="F1F5F9"/><w:noWrap/></w:tcPr><w:p><w:pPr/><w:r><w:rPr><w:rFonts w:ascii="Calibri" w:hAnsi="Calibri" w:eastAsia="Calibri" w:cs="Calibri"/><w:color w:val="111111"/><w:sz w:val="22"/><w:szCs w:val="22"/><w:b w:val="1"/><w:bCs w:val="1"/></w:rPr><w:t xml:space="preserve">1 Digit Terakhir NIM</w:t></w:r></w:p></w:tc><w:tc><w:tcPr><w:tcW w:w="5200" w:type="dxa"/><w:noWrap/></w:tcPr><w:p><w:pPr/><w:r><w:rPr><w:rFonts w:ascii="Calibri" w:hAnsi="Calibri" w:eastAsia="Calibri" w:cs="Calibri"/><w:color w:val="333333"/><w:sz w:val="22"/><w:szCs w:val="22"/></w:rPr><w:t xml:space="preserve">8</w:t></w:r></w:p></w:tc></w:tr><w:tr><w:trPr/><w:tc><w:tcPr><w:tcW w:w="3000" w:type="dxa"/><w:shd w:val="clear" w:fill="F1F5F9"/><w:noWrap/></w:tcPr><w:p><w:pPr/><w:r><w:rPr><w:rFonts w:ascii="Calibri" w:hAnsi="Calibri" w:eastAsia="Calibri" w:cs="Calibri"/><w:color w:val="111111"/><w:sz w:val="22"/><w:szCs w:val="22"/><w:b w:val="1"/><w:bCs w:val="1"/></w:rPr><w:t xml:space="preserve">Kelas</w:t></w:r></w:p></w:tc><w:tc><w:tcPr><w:tcW w:w="5200" w:type="dxa"/><w:noWrap/></w:tcPr><w:p><w:pPr/><w:r><w:rPr><w:rFonts w:ascii="Calibri" w:hAnsi="Calibri" w:eastAsia="Calibri" w:cs="Calibri"/><w:color w:val="333333"/><w:sz w:val="22"/><w:szCs w:val="22"/></w:rPr><w:t xml:space="preserve">03SIFE003</w:t></w:r></w:p></w:tc></w:tr><w:tr><w:trPr/><w:tc><w:tcPr><w:tcW w:w="3000" w:type="dxa"/><w:shd w:val="clear" w:fill="F1F5F9"/><w:noWrap/></w:tcPr><w:p><w:pPr/><w:r><w:rPr><w:rFonts w:ascii="Calibri" w:hAnsi="Calibri" w:eastAsia="Calibri" w:cs="Calibri"/><w:color w:val="111111"/><w:sz w:val="22"/><w:szCs w:val="22"/><w:b w:val="1"/><w:bCs w:val="1"/></w:rPr><w:t xml:space="preserve">Program Studi</w:t></w:r></w:p></w:tc><w:tc><w:tcPr><w:tcW w:w="5200" w:type="dxa"/><w:noWrap/></w:tcPr><w:p><w:pPr/><w:r><w:rPr><w:rFonts w:ascii="Calibri" w:hAnsi="Calibri" w:eastAsia="Calibri" w:cs="Calibri"/><w:color w:val="333333"/><w:sz w:val="22"/><w:szCs w:val="22"/></w:rPr><w:t xml:space="preserve">Sistem Informasi S-1</w:t></w:r></w:p></w:tc></w:tr><w:tr><w:trPr/><w:tc><w:tcPr><w:tcW w:w="3000" w:type="dxa"/><w:shd w:val="clear" w:fill="F1F5F9"/><w:noWrap/></w:tcPr><w:p><w:pPr/><w:r><w:rPr><w:rFonts w:ascii="Calibri" w:hAnsi="Calibri" w:eastAsia="Calibri" w:cs="Calibri"/><w:color w:val="111111"/><w:sz w:val="22"/><w:szCs w:val="22"/><w:b w:val="1"/><w:bCs w:val="1"/></w:rPr><w:t xml:space="preserve">Fakultas</w:t></w:r></w:p></w:tc><w:tc><w:tcPr><w:tcW w:w="5200" w:type="dxa"/><w:noWrap/></w:tcPr><w:p><w:pPr/><w:r><w:rPr><w:rFonts w:ascii="Calibri" w:hAnsi="Calibri" w:eastAsia="Calibri" w:cs="Calibri"/><w:color w:val="333333"/><w:sz w:val="22"/><w:szCs w:val="22"/></w:rPr><w:t xml:space="preserve">Ilmu Komputer</w:t></w:r></w:p></w:tc></w:tr><w:tr><w:trPr/><w:tc><w:tcPr><w:tcW w:w="3000" w:type="dxa"/><w:shd w:val="clear" w:fill="F1F5F9"/><w:noWrap/></w:tcPr><w:p><w:pPr/><w:r><w:rPr><w:rFonts w:ascii="Calibri" w:hAnsi="Calibri" w:eastAsia="Calibri" w:cs="Calibri"/><w:color w:val="111111"/><w:sz w:val="22"/><w:szCs w:val="22"/><w:b w:val="1"/><w:bCs w:val="1"/></w:rPr><w:t xml:space="preserve">Mata Kuliah</w:t></w:r></w:p></w:tc><w:tc><w:tcPr><w:tcW w:w="5200" w:type="dxa"/><w:noWrap/></w:tcPr><w:p><w:pPr/><w:r><w:rPr><w:rFonts w:ascii="Calibri" w:hAnsi="Calibri" w:eastAsia="Calibri" w:cs="Calibri"/><w:color w:val="333333"/><w:sz w:val="22"/><w:szCs w:val="22"/></w:rPr><w:t xml:space="preserve">Rekayasa Web</w:t></w:r></w:p></w:tc></w:tr><w:tr><w:trPr/><w:tc><w:tcPr><w:tcW w:w="3000" w:type="dxa"/><w:shd w:val="clear" w:fill="F1F5F9"/><w:noWrap/></w:tcPr><w:p><w:pPr/><w:r><w:rPr><w:rFonts w:ascii="Calibri" w:hAnsi="Calibri" w:eastAsia="Calibri" w:cs="Calibri"/><w:color w:val="111111"/><w:sz w:val="22"/><w:szCs w:val="22"/><w:b w:val="1"/><w:bCs w:val="1"/></w:rPr><w:t xml:space="preserve">Dosen Pengampu</w:t></w:r></w:p></w:tc><w:tc><w:tcPr><w:tcW w:w="5200" w:type="dxa"/><w:noWrap/></w:tcPr><w:p><w:pPr/><w:r><w:rPr><w:rFonts w:ascii="Calibri" w:hAnsi="Calibri" w:eastAsia="Calibri" w:cs="Calibri"/><w:color w:val="333333"/><w:sz w:val="22"/><w:szCs w:val="22"/></w:rPr><w:t xml:space="preserve">Afif Efendi, M.Kom.</w:t></w:r></w:p></w:tc></w:tr><w:tr><w:trPr/><w:tc><w:tcPr><w:tcW w:w="3000" w:type="dxa"/><w:shd w:val="clear" w:fill="F1F5F9"/><w:noWrap/></w:tcPr><w:p><w:pPr/><w:r><w:rPr><w:rFonts w:ascii="Calibri" w:hAnsi="Calibri" w:eastAsia="Calibri" w:cs="Calibri"/><w:color w:val="111111"/><w:sz w:val="22"/><w:szCs w:val="22"/><w:b w:val="1"/><w:bCs w:val="1"/></w:rPr><w:t xml:space="preserve">Tema Proyek (Sesuai Digit NIM 8)</w:t></w:r></w:p></w:tc><w:tc><w:tcPr><w:tcW w:w="5200" w:type="dxa"/><w:noWrap/></w:tcPr><w:p><w:pPr/><w:r><w:rPr><w:rFonts w:ascii="Calibri" w:hAnsi="Calibri" w:eastAsia="Calibri" w:cs="Calibri"/><w:color w:val="333333"/><w:sz w:val="22"/><w:szCs w:val="22"/></w:rPr><w:t xml:space="preserve">Platform Belajar Online</w:t></w:r></w:p></w:tc></w:tr><w:tr><w:trPr/><w:tc><w:tcPr><w:tcW w:w="3000" w:type="dxa"/><w:shd w:val="clear" w:fill="F1F5F9"/><w:noWrap/></w:tcPr><w:p><w:pPr/><w:r><w:rPr><w:rFonts w:ascii="Calibri" w:hAnsi="Calibri" w:eastAsia="Calibri" w:cs="Calibri"/><w:color w:val="111111"/><w:sz w:val="22"/><w:szCs w:val="22"/><w:b w:val="1"/><w:bCs w:val="1"/></w:rPr><w:t xml:space="preserve">Nama Tabel Database</w:t></w:r></w:p></w:tc><w:tc><w:tcPr><w:tcW w:w="5200" w:type="dxa"/><w:noWrap/></w:tcPr><w:p><w:pPr/><w:r><w:rPr><w:rFonts w:ascii="Calibri" w:hAnsi="Calibri" w:eastAsia="Calibri" w:cs="Calibri"/><w:color w:val="333333"/><w:sz w:val="22"/><w:szCs w:val="22"/></w:rPr><w:t xml:space="preserve">courses</w:t></w:r></w:p></w:tc></w:tr><w:tr><w:trPr/><w:tc><w:tcPr><w:tcW w:w="3000" w:type="dxa"/><w:shd w:val="clear" w:fill="F1F5F9"/><w:noWrap/></w:tcPr><w:p><w:pPr/><w:r><w:rPr><w:rFonts w:ascii="Calibri" w:hAnsi="Calibri" w:eastAsia="Calibri" w:cs="Calibri"/><w:color w:val="111111"/><w:sz w:val="22"/><w:szCs w:val="22"/><w:b w:val="1"/><w:bCs w:val="1"/></w:rPr><w:t xml:space="preserve">Nama Database</w:t></w:r></w:p></w:tc><w:tc><w:tcPr><w:tcW w:w="5200" w:type="dxa"/><w:noWrap/></w:tcPr><w:p><w:pPr/><w:r><w:rPr><w:rFonts w:ascii="Calibri" w:hAnsi="Calibri" w:eastAsia="Calibri" w:cs="Calibri"/><w:color w:val="333333"/><w:sz w:val="22"/><w:szCs w:val="22"/></w:rPr><w:t xml:space="preserve">db_uts_251011700008</w:t></w:r></w:p></w:tc></w:tr><w:tr><w:trPr/><w:tc><w:tcPr><w:tcW w:w="3000" w:type="dxa"/><w:shd w:val="clear" w:fill="F1F5F9"/><w:noWrap/></w:tcPr><w:p><w:pPr/><w:r><w:rPr><w:rFonts w:ascii="Calibri" w:hAnsi="Calibri" w:eastAsia="Calibri" w:cs="Calibri"/><w:color w:val="111111"/><w:sz w:val="22"/><w:szCs w:val="22"/><w:b w:val="1"/><w:bCs w:val="1"/></w:rPr><w:t xml:space="preserve">Framework & Versi</w:t></w:r></w:p></w:tc><w:tc><w:tcPr><w:tcW w:w="5200" w:type="dxa"/><w:noWrap/></w:tcPr><w:p><w:pPr/><w:r><w:rPr><w:rFonts w:ascii="Calibri" w:hAnsi="Calibri" w:eastAsia="Calibri" w:cs="Calibri"/><w:color w:val="333333"/><w:sz w:val="22"/><w:szCs w:val="22"/></w:rPr><w:t xml:space="preserve">Laravel 11 / 12, PHP 8.4, Bootstrap 5.3 (Lokal)</w:t></w:r></w:p></w:tc></w:tr><w:tr><w:trPr/><w:tc><w:tcPr><w:tcW w:w="3000" w:type="dxa"/><w:shd w:val="clear" w:fill="F1F5F9"/><w:noWrap/></w:tcPr><w:p><w:pPr/><w:r><w:rPr><w:rFonts w:ascii="Calibri" w:hAnsi="Calibri" w:eastAsia="Calibri" w:cs="Calibri"/><w:color w:val="111111"/><w:sz w:val="22"/><w:szCs w:val="22"/><w:b w:val="1"/><w:bCs w:val="1"/></w:rPr><w:t xml:space="preserve">Web Server / Database Engine</w:t></w:r></w:p></w:tc><w:tc><w:tcPr><w:tcW w:w="5200" w:type="dxa"/><w:noWrap/></w:tcPr><w:p><w:pPr/><w:r><w:rPr><w:rFonts w:ascii="Calibri" w:hAnsi="Calibri" w:eastAsia="Calibri" w:cs="Calibri"/><w:color w:val="333333"/><w:sz w:val="22"/><w:szCs w:val="22"/></w:rPr><w:t xml:space="preserve">MySQL 8.4 (Docker)</w:t></w:r></w:p></w:tc></w:tr></w:tbl><w:p/><w:p><w:pPr><w:pStyle w:val="Heading2"/></w:pPr><w:bookmarkStart w:id="1" w:name="_Toc1"/><w:r><w:t>B. Tautan Repositori GitHub</w:t></w:r><w:bookmarkEnd w:id="1"/></w:p><w:p><w:pPr><w:jc w:val="both"/><w:spacing w:after="120" w:line="276" w:lineRule="auto"/></w:pPr><w:r><w:rPr><w:rFonts w:ascii="Calibri" w:hAnsi="Calibri" w:eastAsia="Calibri" w:cs="Calibri"/><w:color w:val="333333"/><w:sz w:val="22"/><w:szCs w:val="22"/></w:rPr><w:t xml:space="preserve">Sesuai ketentuan soal pada Poin D.10 ("Upload source code ke GitHub dengan nama project UTS_NAMA_NIM_KODEKELAS"), berikut adalah informasi repositori proyek:</w:t></w:r></w:p><w:tbl><w:tblGrid><w:gridCol w:w="3000" w:type="dxa"/><w:gridCol w:w="5200" w:type="dxa"/></w:tblGrid><w:tblPr><w:tblStyle w:val="IdentityTable"/></w:tblPr><w:tr><w:trPr/><w:tc><w:tcPr><w:tcW w:w="3000" w:type="dxa"/><w:shd w:val="clear" w:fill="F1F5F9"/><w:noWrap/></w:tcPr><w:p><w:pPr/><w:r><w:rPr><w:rFonts w:ascii="Calibri" w:hAnsi="Calibri" w:eastAsia="Calibri" w:cs="Calibri"/><w:color w:val="111111"/><w:sz w:val="22"/><w:szCs w:val="22"/><w:b w:val="1"/><w:bCs w:val="1"/></w:rPr><w:t xml:space="preserve">Nama Repositori</w:t></w:r></w:p></w:tc><w:tc><w:tcPr><w:tcW w:w="5200" w:type="dxa"/><w:noWrap/></w:tcPr><w:p><w:pPr/><w:r><w:rPr><w:color w:val="003366"/><w:b w:val="1"/><w:bCs w:val="1"/></w:rPr><w:t xml:space="preserve">UTS_RekayasaWeb_251011700008</w:t></w:r></w:p></w:tc></w:tr><w:tr><w:trPr/><w:tc><w:tcPr><w:tcW w:w="3000" w:type="dxa"/><w:shd w:val="clear" w:fill="F1F5F9"/><w:noWrap/></w:tcPr><w:p><w:pPr/><w:r><w:rPr><w:rFonts w:ascii="Calibri" w:hAnsi="Calibri" w:eastAsia="Calibri" w:cs="Calibri"/><w:color w:val="111111"/><w:sz w:val="22"/><w:szCs w:val="22"/><w:b w:val="1"/><w:bCs w:val="1"/></w:rPr><w:t xml:space="preserve">Link URL GitHub</w:t></w:r></w:p></w:tc><w:tc><w:tcPr><w:tcW w:w="5200" w:type="dxa"/><w:noWrap/></w:tcPr><w:p><w:pPr/><w:r><w:rPr><w:color w:val="0D6EFD"/><w:u w:val="single"/></w:rPr><w:t xml:space="preserve">https://github.com/ilhmpngstu/UTS_RekayasaWeb_251011700008</w:t></w:r></w:p></w:tc></w:tr></w:tbl><w:p/><w:p><w:pPr><w:pStyle w:val="Heading2"/></w:pPr><w:bookmarkStart w:id="2" w:name="_Toc2"/><w:r><w:t>C. Struktur Tabel Database (`courses`)</w:t></w:r><w:bookmarkEnd w:id="2"/></w:p><w:p><w:pPr><w:jc w:val="both"/><w:spacing w:after="120" w:line="276" w:lineRule="auto"/></w:pPr><w:r><w:rPr><w:rFonts w:ascii="Calibri" w:hAnsi="Calibri" w:eastAsia="Calibri" w:cs="Calibri"/><w:color w:val="333333"/><w:sz w:val="22"/><w:szCs w:val="22"/></w:rPr><w:t xml:space="preserve">Tabel courses dibuat menggunakan migration Laravel dan diisi dengan data dummy realistis melalui seeder (Database: `db_uts_251011700008`):</w:t></w:r></w:p><w:tbl><w:tblGrid><w:gridCol w:w="800" w:type="dxa"/><w:gridCol w:w="2000" w:type="dxa"/><w:gridCol w:w="2200" w:type="dxa"/><w:gridCol w:w="3200" w:type="dxa"/></w:tblGrid><w:tblPr><w:tblStyle w:val="IdentityTable"/></w:tblPr><w:tr><w:trPr/><w:tc><w:tcPr><w:tcW w:w="800" w:type="dxa"/><w:shd w:val="clear" w:fill="003366"/><w:noWrap/></w:tcPr><w:p><w:pPr/><w:r><w:rPr><w:rFonts w:ascii="Calibri" w:hAnsi="Calibri" w:eastAsia="Calibri" w:cs="Calibri"/><w:color w:val="FFFFFF"/><w:b w:val="1"/><w:bCs w:val="1"/></w:rPr><w:t xml:space="preserve">No</w:t></w:r></w:p></w:tc><w:tc><w:tcPr><w:tcW w:w="2000" w:type="dxa"/><w:shd w:val="clear" w:fill="003366"/><w:noWrap/></w:tcPr><w:p><w:pPr/><w:r><w:rPr><w:rFonts w:ascii="Calibri" w:hAnsi="Calibri" w:eastAsia="Calibri" w:cs="Calibri"/><w:color w:val="FFFFFF"/><w:b w:val="1"/><w:bCs w:val="1"/></w:rPr><w:t xml:space="preserve">Nama Kolom</w:t></w:r></w:p></w:tc><w:tc><w:tcPr><w:tcW w:w="2200" w:type="dxa"/><w:shd w:val="clear" w:fill="003366"/><w:noWrap/></w:tcPr><w:p><w:pPr/><w:r><w:rPr><w:rFonts w:ascii="Calibri" w:hAnsi="Calibri" w:eastAsia="Calibri" w:cs="Calibri"/><w:color w:val="FFFFFF"/><w:b w:val="1"/><w:bCs w:val="1"/></w:rPr><w:t xml:space="preserve">Tipe Data</w:t></w:r></w:p></w:tc><w:tc><w:tcPr><w:tcW w:w="3200" w:type="dxa"/><w:shd w:val="clear" w:fill="003366"/><w:noWrap/></w:tcPr><w:p><w:pPr/><w:r><w:rPr><w:rFonts w:ascii="Calibri" w:hAnsi="Calibri" w:eastAsia="Calibri" w:cs="Calibri"/><w:color w:val="FFFFFF"/><w:b w:val="1"/><w:bCs w:val="1"/></w:rPr><w:t xml:space="preserve">Keterangan</w:t></w:r></w:p></w:tc></w:tr><w:tr><w:trPr/><w:tc><w:tcPr><w:tcW w:w="800" w:type="dxa"/><w:noWrap/></w:tcPr><w:p><w:pPr/><w:r><w:rPr><w:rFonts w:ascii="Calibri" w:hAnsi="Calibri" w:eastAsia="Calibri" w:cs="Calibri"/><w:color w:val="333333"/><w:sz w:val="22"/><w:szCs w:val="22"/></w:rPr><w:t xml:space="preserve">1</w:t></w:r></w:p></w:tc><w:tc><w:tcPr><w:tcW w:w="2000" w:type="dxa"/><w:noWrap/></w:tcPr><w:p><w:pPr/><w:r><w:rPr><w:rFonts w:ascii="Calibri" w:hAnsi="Calibri" w:eastAsia="Calibri" w:cs="Calibri"/><w:color w:val="111111"/><w:sz w:val="22"/><w:szCs w:val="22"/><w:b w:val="1"/><w:bCs w:val="1"/></w:rPr><w:t xml:space="preserve">id</w:t></w:r></w:p></w:tc><w:tc><w:tcPr><w:tcW w:w="2200" w:type="dxa"/><w:noWrap/></w:tcPr><w:p><w:pPr/><w:r><w:rPr><w:rFonts w:ascii="Calibri" w:hAnsi="Calibri" w:eastAsia="Calibri" w:cs="Calibri"/><w:color w:val="333333"/><w:sz w:val="22"/><w:szCs w:val="22"/></w:rPr><w:t xml:space="preserve">BIGINT AUTO_INCREMENT</w:t></w:r></w:p></w:tc><w:tc><w:tcPr><w:tcW w:w="3200" w:type="dxa"/><w:noWrap/></w:tcPr><w:p><w:pPr/><w:r><w:rPr><w:rFonts w:ascii="Calibri" w:hAnsi="Calibri" w:eastAsia="Calibri" w:cs="Calibri"/><w:color w:val="333333"/><w:sz w:val="22"/><w:szCs w:val="22"/></w:rPr><w:t xml:space="preserve">Primary Key</w:t></w:r></w:p></w:tc></w:tr><w:tr><w:trPr/><w:tc><w:tcPr><w:tcW w:w="800" w:type="dxa"/><w:noWrap/></w:tcPr><w:p><w:pPr/><w:r><w:rPr><w:rFonts w:ascii="Calibri" w:hAnsi="Calibri" w:eastAsia="Calibri" w:cs="Calibri"/><w:color w:val="333333"/><w:sz w:val="22"/><w:szCs w:val="22"/></w:rPr><w:t xml:space="preserve">2</w:t></w:r></w:p></w:tc><w:tc><w:tcPr><w:tcW w:w="2000" w:type="dxa"/><w:noWrap/></w:tcPr><w:p><w:pPr/><w:r><w:rPr><w:rFonts w:ascii="Calibri" w:hAnsi="Calibri" w:eastAsia="Calibri" w:cs="Calibri"/><w:color w:val="111111"/><w:sz w:val="22"/><w:szCs w:val="22"/><w:b w:val="1"/><w:bCs w:val="1"/></w:rPr><w:t xml:space="preserve">title</w:t></w:r></w:p></w:tc><w:tc><w:tcPr><w:tcW w:w="2200" w:type="dxa"/><w:noWrap/></w:tcPr><w:p><w:pPr/><w:r><w:rPr><w:rFonts w:ascii="Calibri" w:hAnsi="Calibri" w:eastAsia="Calibri" w:cs="Calibri"/><w:color w:val="333333"/><w:sz w:val="22"/><w:szCs w:val="22"/></w:rPr><w:t xml:space="preserve">VARCHAR(255)</w:t></w:r></w:p></w:tc><w:tc><w:tcPr><w:tcW w:w="3200" w:type="dxa"/><w:noWrap/></w:tcPr><w:p><w:pPr/><w:r><w:rPr><w:rFonts w:ascii="Calibri" w:hAnsi="Calibri" w:eastAsia="Calibri" w:cs="Calibri"/><w:color w:val="333333"/><w:sz w:val="22"/><w:szCs w:val="22"/></w:rPr><w:t xml:space="preserve">Judul kursus online</w:t></w:r></w:p></w:tc></w:tr><w:tr><w:trPr/><w:tc><w:tcPr><w:tcW w:w="800" w:type="dxa"/><w:noWrap/></w:tcPr><w:p><w:pPr/><w:r><w:rPr><w:rFonts w:ascii="Calibri" w:hAnsi="Calibri" w:eastAsia="Calibri" w:cs="Calibri"/><w:color w:val="333333"/><w:sz w:val="22"/><w:szCs w:val="22"/></w:rPr><w:t xml:space="preserve">3</w:t></w:r></w:p></w:tc><w:tc><w:tcPr><w:tcW w:w="2000" w:type="dxa"/><w:noWrap/></w:tcPr><w:p><w:pPr/><w:r><w:rPr><w:rFonts w:ascii="Calibri" w:hAnsi="Calibri" w:eastAsia="Calibri" w:cs="Calibri"/><w:color w:val="111111"/><w:sz w:val="22"/><w:szCs w:val="22"/><w:b w:val="1"/><w:bCs w:val="1"/></w:rPr><w:t xml:space="preserve">instructor</w:t></w:r></w:p></w:tc><w:tc><w:tcPr><w:tcW w:w="2200" w:type="dxa"/><w:noWrap/></w:tcPr><w:p><w:pPr/><w:r><w:rPr><w:rFonts w:ascii="Calibri" w:hAnsi="Calibri" w:eastAsia="Calibri" w:cs="Calibri"/><w:color w:val="333333"/><w:sz w:val="22"/><w:szCs w:val="22"/></w:rPr><w:t xml:space="preserve">VARCHAR(255)</w:t></w:r></w:p></w:tc><w:tc><w:tcPr><w:tcW w:w="3200" w:type="dxa"/><w:noWrap/></w:tcPr><w:p><w:pPr/><w:r><w:rPr><w:rFonts w:ascii="Calibri" w:hAnsi="Calibri" w:eastAsia="Calibri" w:cs="Calibri"/><w:color w:val="333333"/><w:sz w:val="22"/><w:szCs w:val="22"/></w:rPr><w:t xml:space="preserve">Nama instruktur kursus</w:t></w:r></w:p></w:tc></w:tr><w:tr><w:trPr/><w:tc><w:tcPr><w:tcW w:w="800" w:type="dxa"/><w:noWrap/></w:tcPr><w:p><w:pPr/><w:r><w:rPr><w:rFonts w:ascii="Calibri" w:hAnsi="Calibri" w:eastAsia="Calibri" w:cs="Calibri"/><w:color w:val="333333"/><w:sz w:val="22"/><w:szCs w:val="22"/></w:rPr><w:t xml:space="preserve">4</w:t></w:r></w:p></w:tc><w:tc><w:tcPr><w:tcW w:w="2000" w:type="dxa"/><w:noWrap/></w:tcPr><w:p><w:pPr/><w:r><w:rPr><w:rFonts w:ascii="Calibri" w:hAnsi="Calibri" w:eastAsia="Calibri" w:cs="Calibri"/><w:color w:val="111111"/><w:sz w:val="22"/><w:szCs w:val="22"/><w:b w:val="1"/><w:bCs w:val="1"/></w:rPr><w:t xml:space="preserve">duration</w:t></w:r></w:p></w:tc><w:tc><w:tcPr><w:tcW w:w="2200" w:type="dxa"/><w:noWrap/></w:tcPr><w:p><w:pPr/><w:r><w:rPr><w:rFonts w:ascii="Calibri" w:hAnsi="Calibri" w:eastAsia="Calibri" w:cs="Calibri"/><w:color w:val="333333"/><w:sz w:val="22"/><w:szCs w:val="22"/></w:rPr><w:t xml:space="preserve">VARCHAR(255)</w:t></w:r></w:p></w:tc><w:tc><w:tcPr><w:tcW w:w="3200" w:type="dxa"/><w:noWrap/></w:tcPr><w:p><w:pPr/><w:r><w:rPr><w:rFonts w:ascii="Calibri" w:hAnsi="Calibri" w:eastAsia="Calibri" w:cs="Calibri"/><w:color w:val="333333"/><w:sz w:val="22"/><w:szCs w:val="22"/></w:rPr><w:t xml:space="preserve">Durasi materi (misal: "24 Jam Video")</w:t></w:r></w:p></w:tc></w:tr><w:tr><w:trPr/><w:tc><w:tcPr><w:tcW w:w="800" w:type="dxa"/><w:noWrap/></w:tcPr><w:p><w:pPr/><w:r><w:rPr><w:rFonts w:ascii="Calibri" w:hAnsi="Calibri" w:eastAsia="Calibri" w:cs="Calibri"/><w:color w:val="333333"/><w:sz w:val="22"/><w:szCs w:val="22"/></w:rPr><w:t xml:space="preserve">5</w:t></w:r></w:p></w:tc><w:tc><w:tcPr><w:tcW w:w="2000" w:type="dxa"/><w:noWrap/></w:tcPr><w:p><w:pPr/><w:r><w:rPr><w:rFonts w:ascii="Calibri" w:hAnsi="Calibri" w:eastAsia="Calibri" w:cs="Calibri"/><w:color w:val="111111"/><w:sz w:val="22"/><w:szCs w:val="22"/><w:b w:val="1"/><w:bCs w:val="1"/></w:rPr><w:t xml:space="preserve">image</w:t></w:r></w:p></w:tc><w:tc><w:tcPr><w:tcW w:w="2200" w:type="dxa"/><w:noWrap/></w:tcPr><w:p><w:pPr/><w:r><w:rPr><w:rFonts w:ascii="Calibri" w:hAnsi="Calibri" w:eastAsia="Calibri" w:cs="Calibri"/><w:color w:val="333333"/><w:sz w:val="22"/><w:szCs w:val="22"/></w:rPr><w:t xml:space="preserve">VARCHAR(255)</w:t></w:r></w:p></w:tc><w:tc><w:tcPr><w:tcW w:w="3200" w:type="dxa"/><w:noWrap/></w:tcPr><w:p><w:pPr/><w:r><w:rPr><w:rFonts w:ascii="Calibri" w:hAnsi="Calibri" w:eastAsia="Calibri" w:cs="Calibri"/><w:color w:val="333333"/><w:sz w:val="22"/><w:szCs w:val="22"/></w:rPr><w:t xml:space="preserve">Nama file di public/assets/images/</w:t></w:r></w:p></w:tc></w:tr><w:tr><w:trPr/><w:tc><w:tcPr><w:tcW w:w="800" w:type="dxa"/><w:noWrap/></w:tcPr><w:p><w:pPr/><w:r><w:rPr><w:rFonts w:ascii="Calibri" w:hAnsi="Calibri" w:eastAsia="Calibri" w:cs="Calibri"/><w:color w:val="333333"/><w:sz w:val="22"/><w:szCs w:val="22"/></w:rPr><w:t xml:space="preserve">6</w:t></w:r></w:p></w:tc><w:tc><w:tcPr><w:tcW w:w="2000" w:type="dxa"/><w:noWrap/></w:tcPr><w:p><w:pPr/><w:r><w:rPr><w:rFonts w:ascii="Calibri" w:hAnsi="Calibri" w:eastAsia="Calibri" w:cs="Calibri"/><w:color w:val="111111"/><w:sz w:val="22"/><w:szCs w:val="22"/><w:b w:val="1"/><w:bCs w:val="1"/></w:rPr><w:t xml:space="preserve">price</w:t></w:r></w:p></w:tc><w:tc><w:tcPr><w:tcW w:w="2200" w:type="dxa"/><w:noWrap/></w:tcPr><w:p><w:pPr/><w:r><w:rPr><w:rFonts w:ascii="Calibri" w:hAnsi="Calibri" w:eastAsia="Calibri" w:cs="Calibri"/><w:color w:val="333333"/><w:sz w:val="22"/><w:szCs w:val="22"/></w:rPr><w:t xml:space="preserve">DECIMAL(12, 2)</w:t></w:r></w:p></w:tc><w:tc><w:tcPr><w:tcW w:w="3200" w:type="dxa"/><w:noWrap/></w:tcPr><w:p><w:pPr/><w:r><w:rPr><w:rFonts w:ascii="Calibri" w:hAnsi="Calibri" w:eastAsia="Calibri" w:cs="Calibri"/><w:color w:val="333333"/><w:sz w:val="22"/><w:szCs w:val="22"/></w:rPr><w:t xml:space="preserve">Harga kursus dalam Rupiah</w:t></w:r></w:p></w:tc></w:tr><w:tr><w:trPr/><w:tc><w:tcPr><w:tcW w:w="800" w:type="dxa"/><w:noWrap/></w:tcPr><w:p><w:pPr/><w:r><w:rPr><w:rFonts w:ascii="Calibri" w:hAnsi="Calibri" w:eastAsia="Calibri" w:cs="Calibri"/><w:color w:val="333333"/><w:sz w:val="22"/><w:szCs w:val="22"/></w:rPr><w:t xml:space="preserve">7</w:t></w:r></w:p></w:tc><w:tc><w:tcPr><w:tcW w:w="2000" w:type="dxa"/><w:noWrap/></w:tcPr><w:p><w:pPr/><w:r><w:rPr><w:rFonts w:ascii="Calibri" w:hAnsi="Calibri" w:eastAsia="Calibri" w:cs="Calibri"/><w:color w:val="111111"/><w:sz w:val="22"/><w:szCs w:val="22"/><w:b w:val="1"/><w:bCs w:val="1"/></w:rPr><w:t xml:space="preserve">category</w:t></w:r></w:p></w:tc><w:tc><w:tcPr><w:tcW w:w="2200" w:type="dxa"/><w:noWrap/></w:tcPr><w:p><w:pPr/><w:r><w:rPr><w:rFonts w:ascii="Calibri" w:hAnsi="Calibri" w:eastAsia="Calibri" w:cs="Calibri"/><w:color w:val="333333"/><w:sz w:val="22"/><w:szCs w:val="22"/></w:rPr><w:t xml:space="preserve">VARCHAR(255)</w:t></w:r></w:p></w:tc><w:tc><w:tcPr><w:tcW w:w="3200" w:type="dxa"/><w:noWrap/></w:tcPr><w:p><w:pPr/><w:r><w:rPr><w:rFonts w:ascii="Calibri" w:hAnsi="Calibri" w:eastAsia="Calibri" w:cs="Calibri"/><w:color w:val="333333"/><w:sz w:val="22"/><w:szCs w:val="22"/></w:rPr><w:t xml:space="preserve">Kategori materi kursus</w:t></w:r></w:p></w:tc></w:tr><w:tr><w:trPr/><w:tc><w:tcPr><w:tcW w:w="800" w:type="dxa"/><w:noWrap/></w:tcPr><w:p><w:pPr/><w:r><w:rPr><w:rFonts w:ascii="Calibri" w:hAnsi="Calibri" w:eastAsia="Calibri" w:cs="Calibri"/><w:color w:val="333333"/><w:sz w:val="22"/><w:szCs w:val="22"/></w:rPr><w:t xml:space="preserve">8</w:t></w:r></w:p></w:tc><w:tc><w:tcPr><w:tcW w:w="2000" w:type="dxa"/><w:noWrap/></w:tcPr><w:p><w:pPr/><w:r><w:rPr><w:rFonts w:ascii="Calibri" w:hAnsi="Calibri" w:eastAsia="Calibri" w:cs="Calibri"/><w:color w:val="111111"/><w:sz w:val="22"/><w:szCs w:val="22"/><w:b w:val="1"/><w:bCs w:val="1"/></w:rPr><w:t xml:space="preserve">description</w:t></w:r></w:p></w:tc><w:tc><w:tcPr><w:tcW w:w="2200" w:type="dxa"/><w:noWrap/></w:tcPr><w:p><w:pPr/><w:r><w:rPr><w:rFonts w:ascii="Calibri" w:hAnsi="Calibri" w:eastAsia="Calibri" w:cs="Calibri"/><w:color w:val="333333"/><w:sz w:val="22"/><w:szCs w:val="22"/></w:rPr><w:t xml:space="preserve">TEXT (Nullable)</w:t></w:r></w:p></w:tc><w:tc><w:tcPr><w:tcW w:w="3200" w:type="dxa"/><w:noWrap/></w:tcPr><w:p><w:pPr/><w:r><w:rPr><w:rFonts w:ascii="Calibri" w:hAnsi="Calibri" w:eastAsia="Calibri" w:cs="Calibri"/><w:color w:val="333333"/><w:sz w:val="22"/><w:szCs w:val="22"/></w:rPr><w:t xml:space="preserve">Deskripsi lengkap silabus kursus</w:t></w:r></w:p></w:tc></w:tr><w:tr><w:trPr/><w:tc><w:tcPr><w:tcW w:w="800" w:type="dxa"/><w:noWrap/></w:tcPr><w:p><w:pPr/><w:r><w:rPr><w:rFonts w:ascii="Calibri" w:hAnsi="Calibri" w:eastAsia="Calibri" w:cs="Calibri"/><w:color w:val="333333"/><w:sz w:val="22"/><w:szCs w:val="22"/></w:rPr><w:t xml:space="preserve">9</w:t></w:r></w:p></w:tc><w:tc><w:tcPr><w:tcW w:w="2000" w:type="dxa"/><w:noWrap/></w:tcPr><w:p><w:pPr/><w:r><w:rPr><w:rFonts w:ascii="Calibri" w:hAnsi="Calibri" w:eastAsia="Calibri" w:cs="Calibri"/><w:color w:val="111111"/><w:sz w:val="22"/><w:szCs w:val="22"/><w:b w:val="1"/><w:bCs w:val="1"/></w:rPr><w:t xml:space="preserve">created_at</w:t></w:r></w:p></w:tc><w:tc><w:tcPr><w:tcW w:w="2200" w:type="dxa"/><w:noWrap/></w:tcPr><w:p><w:pPr/><w:r><w:rPr><w:rFonts w:ascii="Calibri" w:hAnsi="Calibri" w:eastAsia="Calibri" w:cs="Calibri"/><w:color w:val="333333"/><w:sz w:val="22"/><w:szCs w:val="22"/></w:rPr><w:t xml:space="preserve">TIMESTAMP</w:t></w:r></w:p></w:tc><w:tc><w:tcPr><w:tcW w:w="3200" w:type="dxa"/><w:noWrap/></w:tcPr><w:p><w:pPr/><w:r><w:rPr><w:rFonts w:ascii="Calibri" w:hAnsi="Calibri" w:eastAsia="Calibri" w:cs="Calibri"/><w:color w:val="333333"/><w:sz w:val="22"/><w:szCs w:val="22"/></w:rPr><w:t xml:space="preserve">Waktu pembuatan data</w:t></w:r></w:p></w:tc></w:tr><w:tr><w:trPr/><w:tc><w:tcPr><w:tcW w:w="800" w:type="dxa"/><w:noWrap/></w:tcPr><w:p><w:pPr/><w:r><w:rPr><w:rFonts w:ascii="Calibri" w:hAnsi="Calibri" w:eastAsia="Calibri" w:cs="Calibri"/><w:color w:val="333333"/><w:sz w:val="22"/><w:szCs w:val="22"/></w:rPr><w:t xml:space="preserve">10</w:t></w:r></w:p></w:tc><w:tc><w:tcPr><w:tcW w:w="2000" w:type="dxa"/><w:noWrap/></w:tcPr><w:p><w:pPr/><w:r><w:rPr><w:rFonts w:ascii="Calibri" w:hAnsi="Calibri" w:eastAsia="Calibri" w:cs="Calibri"/><w:color w:val="111111"/><w:sz w:val="22"/><w:szCs w:val="22"/><w:b w:val="1"/><w:bCs w:val="1"/></w:rPr><w:t xml:space="preserve">updated_at</w:t></w:r></w:p></w:tc><w:tc><w:tcPr><w:tcW w:w="2200" w:type="dxa"/><w:noWrap/></w:tcPr><w:p><w:pPr/><w:r><w:rPr><w:rFonts w:ascii="Calibri" w:hAnsi="Calibri" w:eastAsia="Calibri" w:cs="Calibri"/><w:color w:val="333333"/><w:sz w:val="22"/><w:szCs w:val="22"/></w:rPr><w:t xml:space="preserve">TIMESTAMP</w:t></w:r></w:p></w:tc><w:tc><w:tcPr><w:tcW w:w="3200" w:type="dxa"/><w:noWrap/></w:tcPr><w:p><w:pPr/><w:r><w:rPr><w:rFonts w:ascii="Calibri" w:hAnsi="Calibri" w:eastAsia="Calibri" w:cs="Calibri"/><w:color w:val="333333"/><w:sz w:val="22"/><w:szCs w:val="22"/></w:rPr><w:t xml:space="preserve">Waktu perbaruan data</w:t></w:r></w:p></w:tc></w:tr></w:tbl><w:p><w:r><w:br w:type="page"/></w:r></w:p><w:p><w:pPr><w:pStyle w:val="Heading2"/></w:pPr><w:bookmarkStart w:id="3" w:name="_Toc3"/><w:r><w:t>D. Screenshot Hasil Implementasi Aplikasi Web</w:t></w:r><w:bookmarkEnd w:id="3"/></w:p><w:p><w:pPr><w:jc w:val="both"/><w:spacing w:after="120" w:line="276" w:lineRule="auto"/></w:pPr><w:r><w:rPr><w:rFonts w:ascii="Calibri" w:hAnsi="Calibri" w:eastAsia="Calibri" w:cs="Calibri"/><w:color w:val="333333"/><w:sz w:val="22"/><w:szCs w:val="22"/></w:rPr><w:t xml:space="preserve">Berikut adalah tangkapan layar tampilan antarmuka web yang dibangun dengan framework Laravel, Blade Template, dan Bootstrap 5:</w:t></w:r></w:p><w:p><w:pPr><w:pStyle w:val="Heading3"/></w:pPr><w:bookmarkStart w:id="4" w:name="_Toc4"/><w:r><w:t>1. Halaman Katalog Kursus (Card Grid & Header Banner UNPAM)</w:t></w:r><w:bookmarkEnd w:id="4"/></w:p><w:p><w:pPr/><w:r><w:rPr><w:rFonts w:ascii="Calibri" w:hAnsi="Calibri" w:eastAsia="Calibri" w:cs="Calibri"/><w:color w:val="666666"/><w:sz w:val="20"/><w:szCs w:val="20"/><w:i w:val="1"/><w:iCs w:val="1"/></w:rPr><w:t xml:space="preserve">Menampilkan header resmi Yayasan Sasmita Jaya dan UNPAM, identitas mahasiswa, fitur filter kategori, pencarian, dan daftar kartu kursus responsif.</w:t></w:r></w:p><w:p><w:pPr><w:jc w:val="center"/></w:pPr><w:r><w:pict><v:shape type="#_x0000_t75" stroked="f" style="width:470pt; height:376pt; margin-left:0pt; margin-top:0pt; mso-position-horizontal:left; mso-position-vertical:top; mso-position-horizontal-relative:char; mso-position-vertical-relative:line;"><w10:wrap type="inline"/><v:imagedata r:id="rId7" o:title=""/></v:shape></w:pict></w:r></w:p><w:p/><w:p><w:pPr><w:pStyle w:val="Heading3"/></w:pPr><w:bookmarkStart w:id="5" w:name="_Toc5"/><w:r><w:t>2. Halaman Tampilan Tabel Data Kursus (`table` Bootstrap)</w:t></w:r><w:bookmarkEnd w:id="5"/></w:p><w:p><w:pPr/><w:r><w:rPr><w:rFonts w:ascii="Calibri" w:hAnsi="Calibri" w:eastAsia="Calibri" w:cs="Calibri"/><w:color w:val="666666"/><w:sz w:val="20"/><w:szCs w:val="20"/><w:i w:val="1"/><w:iCs w:val="1"/></w:rPr><w:t xml:space="preserve">Menampilkan data tabel courses menggunakan komponen Bootstrap table table-hover table-striped lengkap dengan thumbnail, kategori badge, harga, dan tombol detail.</w:t></w:r></w:p><w:p><w:pPr><w:jc w:val="center"/></w:pPr><w:r><w:pict><v:shape type="#_x0000_t75" stroked="f" style="width:470pt; height:376pt; margin-left:0pt; margin-top:0pt; mso-position-horizontal:left; mso-position-vertical:top; mso-position-horizontal-relative:char; mso-position-vertical-relative:line;"><w10:wrap type="inline"/><v:imagedata r:id="rId8" o:title=""/></v:shape></w:pict></w:r></w:p><w:p><w:r><w:br w:type="page"/></w:r></w:p><w:p><w:pPr><w:pStyle w:val="Heading3"/></w:pPr><w:bookmarkStart w:id="6" w:name="_Toc6"/><w:r><w:t>3. Halaman Detail Kursus (Show View)</w:t></w:r><w:bookmarkEnd w:id="6"/></w:p><w:p><w:pPr/><w:r><w:rPr><w:rFonts w:ascii="Calibri" w:hAnsi="Calibri" w:eastAsia="Calibri" w:cs="Calibri"/><w:color w:val="666666"/><w:sz w:val="20"/><w:szCs w:val="20"/><w:i w:val="1"/><w:iCs w:val="1"/></w:rPr><w:t xml:space="preserve">Menampilkan rincian materi lengkap, breadcrumb navigasi, profil instruktur, silabus modul pembelajaran (Accordion Bootstrap), fasilitas, serta modal pendaftaran.</w:t></w:r></w:p><w:p><w:pPr><w:jc w:val="center"/></w:pPr><w:r><w:pict><v:shape type="#_x0000_t75" stroked="f" style="width:470pt; height:376pt; margin-left:0pt; margin-top:0pt; mso-position-horizontal:left; mso-position-vertical:top; mso-position-horizontal-relative:char; mso-position-vertical-relative:line;"><w10:wrap type="inline"/><v:imagedata r:id="rId9" o:title=""/></v:shape></w:pict></w:r></w:p><w:p/><w:p><w:pPr><w:pStyle w:val="Heading3"/></w:pPr><w:bookmarkStart w:id="7" w:name="_Toc7"/><w:r><w:t>4. Halaman Identitas Mahasiswa & Informasi Penugasan UTS</w:t></w:r><w:bookmarkEnd w:id="7"/></w:p><w:p><w:pPr/><w:r><w:rPr><w:rFonts w:ascii="Calibri" w:hAnsi="Calibri" w:eastAsia="Calibri" w:cs="Calibri"/><w:color w:val="666666"/><w:sz w:val="20"/><w:szCs w:val="20"/><w:i w:val="1"/><w:iCs w:val="1"/></w:rPr><w:t xml:space="preserve">Menampilkan identitas lengkap mahasiswa pengembang, rincian teknis penugasan UTS, checklist pemenuhan seluruh butir soal, dan ringkasan statistik database.</w:t></w:r></w:p><w:p><w:pPr><w:jc w:val="center"/></w:pPr><w:r><w:pict><v:shape type="#_x0000_t75" stroked="f" style="width:470pt; height:376pt; margin-left:0pt; margin-top:0pt; mso-position-horizontal:left; mso-position-vertical:top; mso-position-horizontal-relative:char; mso-position-vertical-relative:line;"><w10:wrap type="inline"/><v:imagedata r:id="rId10" o:title=""/></v:shape></w:pict></w:r></w:p><w:p/><w:p><w:pPr><w:pStyle w:val="Heading2"/></w:pPr><w:bookmarkStart w:id="8" w:name="_Toc8"/><w:r><w:t>E. Kesimpulan</w:t></w:r><w:bookmarkEnd w:id="8"/></w:p><w:p><w:pPr><w:jc w:val="both"/><w:spacing w:after="120" w:line="276" w:lineRule="auto"/></w:pPr><w:r><w:rPr><w:rFonts w:ascii="Calibri" w:hAnsi="Calibri" w:eastAsia="Calibri" w:cs="Calibri"/><w:color w:val="333333"/><w:sz w:val="22"/><w:szCs w:val="22"/></w:rPr><w:t xml:space="preserve">Seluruh instruksi dan ketentuan pada soal Ujian Tengah Semester (UTS) mata kuliah Rekayasa Web telah berhasil diimplementasikan dengan baik:</w:t></w:r></w:p><w:p><w:pPr><w:numPr><w:ilvl w:val="0"/><w:numId w:val="5"/></w:numPr></w:pPr><w:r><w:rPr><w:rFonts w:ascii="Calibri" w:hAnsi="Calibri" w:eastAsia="Calibri" w:cs="Calibri"/><w:color w:val="333333"/><w:sz w:val="22"/><w:szCs w:val="22"/></w:rPr><w:t xml:space="preserve">Proyek dibuat menggunakan framework Laravel dengan arsitektur MVC terstruktur.</w:t></w:r></w:p><w:p><w:pPr><w:numPr><w:ilvl w:val="0"/><w:numId w:val="5"/></w:numPr></w:pPr><w:r><w:rPr><w:rFonts w:ascii="Calibri" w:hAnsi="Calibri" w:eastAsia="Calibri" w:cs="Calibri"/><w:color w:val="333333"/><w:sz w:val="22"/><w:szCs w:val="22"/></w:rPr><w:t xml:space="preserve">Tabel courses dan database db_uts_251011700008 berhasil dimigrasikan serta diisi data dummy realistis via Seeder.</w:t></w:r></w:p><w:p><w:pPr><w:numPr><w:ilvl w:val="0"/><w:numId w:val="5"/></w:numPr></w:pPr><w:r><w:rPr><w:rFonts w:ascii="Calibri" w:hAnsi="Calibri" w:eastAsia="Calibri" w:cs="Calibri"/><w:color w:val="333333"/><w:sz w:val="22"/><w:szCs w:val="22"/></w:rPr><w:t xml:space="preserve">Asset Bootstrap 5.3 dan gambar thumbnail tersimpan secara mandiri di folder public aplikasi.</w:t></w:r></w:p><w:p><w:pPr><w:numPr><w:ilvl w:val="0"/><w:numId w:val="5"/></w:numPr></w:pPr><w:r><w:rPr><w:rFonts w:ascii="Calibri" w:hAnsi="Calibri" w:eastAsia="Calibri" w:cs="Calibri"/><w:color w:val="333333"/><w:sz w:val="22"/><w:szCs w:val="22"/></w:rPr><w:t xml:space="preserve">Layout utama Blade Template berhasil diterapkan dengan rapi menggunakan @extends dan @section tanpa perulangan kode.</w:t></w:r></w:p><w:p><w:pPr><w:numPr><w:ilvl w:val="0"/><w:numId w:val="5"/></w:numPr></w:pPr><w:r><w:rPr><w:rFonts w:ascii="Calibri" w:hAnsi="Calibri" w:eastAsia="Calibri" w:cs="Calibri"/><w:color w:val="333333"/><w:sz w:val="22"/><w:szCs w:val="22"/></w:rPr><w:t xml:space="preserve">Tampilan katalog Card Grid, Tampilan Tabel, Halaman Detail Kursus, serta navigasi antar halaman berfungsi dengan lancar dan responsif.</w:t></w:r></w:p><w:sectPr><w:pgSz w:orient="portrait" w:w="11905.511811023622" w:h="16837.79527559055"/><w:pgMar w:top="1200" w:right="1400" w:bottom="1200" w:left="1400" w:header="720" w:footer="720" w:gutter="0"/><w:cols w:num="1" w:space="720"/></w:sectPr></w:body></w:document>
+<file path=word/document.xml><?xml version="1.0" encoding="utf-8"?>
+<w:document xmlns:ve="http://schemas.openxmlformats.org/markup-compatibility/2006" xmlns:o="urn:schemas-microsoft-com:office:office" xmlns:r="http://schemas.openxmlformats.org/officeDocument/2006/relationships" xmlns:m="http://schemas.openxmlformats.org/officeDocument/2006/math" xmlns:v="urn:schemas-microsoft-com:vml" xmlns:wp="http://schemas.openxmlformats.org/drawingml/2006/wordprocessingDrawing" xmlns:w10="urn:schemas-microsoft-com:office:word" xmlns:w="http://schemas.openxmlformats.org/wordprocessingml/2006/main" xmlns:wne="http://schemas.microsoft.com/office/word/2006/wordml">
+  <w:body>
+    <w:p>
+      <w:pPr>
+        <w:jc w:val="center"/>
+        <w:spacing w:after="100"/>
+      </w:pPr>
+      <w:r>
+        <w:rPr>
+          <w:rFonts w:ascii="Calibri" w:hAnsi="Calibri" w:eastAsia="Calibri" w:cs="Calibri"/>
+          <w:sz w:val="24"/>
+          <w:szCs w:val="24"/>
+          <w:b w:val="1"/>
+          <w:bCs w:val="1"/>
+        </w:rPr>
+        <w:t xml:space="preserve">YAYASAN SASMITA JAYA</w:t>
+      </w:r>
+    </w:p>
+    <w:p>
+      <w:pPr>
+        <w:jc w:val="center"/>
+        <w:spacing w:after="100"/>
+      </w:pPr>
+      <w:r>
+        <w:rPr>
+          <w:rFonts w:ascii="Calibri" w:hAnsi="Calibri" w:eastAsia="Calibri" w:cs="Calibri"/>
+          <w:color w:val="003366"/>
+          <w:sz w:val="32"/>
+          <w:szCs w:val="32"/>
+          <w:b w:val="1"/>
+          <w:bCs w:val="1"/>
+        </w:rPr>
+        <w:t xml:space="preserve">UNIVERSITAS PAMULANG</w:t>
+      </w:r>
+    </w:p>
+    <w:p>
+      <w:pPr>
+        <w:jc w:val="center"/>
+        <w:spacing w:after="100"/>
+      </w:pPr>
+      <w:r>
+        <w:rPr>
+          <w:rFonts w:ascii="Calibri" w:hAnsi="Calibri" w:eastAsia="Calibri" w:cs="Calibri"/>
+          <w:color w:val="555555"/>
+          <w:sz w:val="20"/>
+          <w:szCs w:val="20"/>
+          <w:b w:val="1"/>
+          <w:bCs w:val="1"/>
+        </w:rPr>
+        <w:t xml:space="preserve">FAKULTAS ILMU KOMPUTER - PROGRAM STUDI SISTEM INFORMASI S-1</w:t>
+      </w:r>
+    </w:p>
+    <w:p>
+      <w:pPr>
+        <w:jc w:val="center"/>
+        <w:spacing w:after="100"/>
+      </w:pPr>
+      <w:r>
+        <w:rPr>
+          <w:rFonts w:ascii="Calibri" w:hAnsi="Calibri" w:eastAsia="Calibri" w:cs="Calibri"/>
+          <w:color w:val="777777"/>
+          <w:sz w:val="18"/>
+          <w:szCs w:val="18"/>
+        </w:rPr>
+        <w:t xml:space="preserve">Jl. Puspitek Raya No. 10, Serpong - Tangerang Selatan | www.unpam.ac.id</w:t>
+      </w:r>
+    </w:p>
+    <w:tbl>
+      <w:tblGrid>
+        <w:gridCol w:w="8200" w:type="dxa"/>
+      </w:tblGrid>
+      <w:tblPr>
+        <w:jc w:val="center"/>
+        <w:tblW w:w="0" w:type="auto"/>
+        <w:tblLayout w:type="autofit"/>
+      </w:tblPr>
+      <w:tr>
+        <w:trPr/>
+        <w:tc>
+          <w:tcPr>
+            <w:tcW w:w="8200" w:type="dxa"/>
+            <w:tcBorders>
+              <w:bottom w:val="single" w:sz="18" w:color="003366"/>
+            </w:tcBorders>
+            <w:noWrap/>
+          </w:tcPr>
+          <w:p/>
+        </w:tc>
+      </w:tr>
+    </w:tbl>
+    <w:p/>
+    <w:p>
+      <w:pPr>
+        <w:jc w:val="center"/>
+        <w:spacing w:after="100"/>
+      </w:pPr>
+      <w:r>
+        <w:rPr>
+          <w:rFonts w:ascii="Calibri" w:hAnsi="Calibri" w:eastAsia="Calibri" w:cs="Calibri"/>
+          <w:color w:val="003366"/>
+          <w:sz w:val="28"/>
+          <w:szCs w:val="28"/>
+          <w:b w:val="1"/>
+          <w:bCs w:val="1"/>
+        </w:rPr>
+        <w:t xml:space="preserve">LAPORAN DOKUMENTASI HASIL APLIKASI WEB</w:t>
+      </w:r>
+    </w:p>
+    <w:p>
+      <w:pPr>
+        <w:jc w:val="center"/>
+        <w:spacing w:after="100"/>
+      </w:pPr>
+      <w:r>
+        <w:rPr>
+          <w:rFonts w:ascii="Calibri" w:hAnsi="Calibri" w:eastAsia="Calibri" w:cs="Calibri"/>
+          <w:sz w:val="24"/>
+          <w:szCs w:val="24"/>
+          <w:b w:val="1"/>
+          <w:bCs w:val="1"/>
+        </w:rPr>
+        <w:t xml:space="preserve">UJIAN TENGAH SEMESTER (UTS) SEMESTER GANJIL T.A. 2026/2027</w:t>
+      </w:r>
+    </w:p>
+    <w:p/>
+    <w:p>
+      <w:pPr>
+        <w:pStyle w:val="Heading2"/>
+      </w:pPr>
+      <w:bookmarkStart w:id="0" w:name="_Toc0"/>
+      <w:r>
+        <w:t>A. Identitas Mahasiswa dan Penugasan</w:t>
+      </w:r>
+      <w:bookmarkEnd w:id="0"/>
+    </w:p>
+    <w:tbl>
+      <w:tblGrid>
+        <w:gridCol w:w="3000" w:type="dxa"/>
+        <w:gridCol w:w="5200" w:type="dxa"/>
+      </w:tblGrid>
+      <w:tblPr>
+        <w:tblStyle w:val="IdentityTable"/>
+      </w:tblPr>
+      <w:tr>
+        <w:trPr/>
+        <w:tc>
+          <w:tcPr>
+            <w:tcW w:w="3000" w:type="dxa"/>
+            <w:shd w:val="clear" w:fill="F1F5F9"/>
+            <w:noWrap/>
+          </w:tcPr>
+          <w:p>
+            <w:pPr/>
+            <w:r>
+              <w:rPr>
+                <w:rFonts w:ascii="Calibri" w:hAnsi="Calibri" w:eastAsia="Calibri" w:cs="Calibri"/>
+                <w:color w:val="111111"/>
+                <w:sz w:val="22"/>
+                <w:szCs w:val="22"/>
+                <w:b w:val="1"/>
+                <w:bCs w:val="1"/>
+              </w:rPr>
+              <w:t xml:space="preserve">Nama Lengkap</w:t>
+            </w:r>
+          </w:p>
+        </w:tc>
+        <w:tc>
+          <w:tcPr>
+            <w:tcW w:w="5200" w:type="dxa"/>
+            <w:noWrap/>
+          </w:tcPr>
+          <w:p>
+            <w:pPr/>
+            <w:r>
+              <w:rPr>
+                <w:rFonts w:ascii="Calibri" w:hAnsi="Calibri" w:eastAsia="Calibri" w:cs="Calibri"/>
+                <w:color w:val="333333"/>
+                <w:sz w:val="22"/>
+                <w:szCs w:val="22"/>
+              </w:rPr>
+              <w:t xml:space="preserve">Ilham Pangestu</w:t>
+            </w:r>
+          </w:p>
+        </w:tc>
+      </w:tr>
+      <w:tr>
+        <w:trPr/>
+        <w:tc>
+          <w:tcPr>
+            <w:tcW w:w="3000" w:type="dxa"/>
+            <w:shd w:val="clear" w:fill="F1F5F9"/>
+            <w:noWrap/>
+          </w:tcPr>
+          <w:p>
+            <w:pPr/>
+            <w:r>
+              <w:rPr>
+                <w:rFonts w:ascii="Calibri" w:hAnsi="Calibri" w:eastAsia="Calibri" w:cs="Calibri"/>
+                <w:color w:val="111111"/>
+                <w:sz w:val="22"/>
+                <w:szCs w:val="22"/>
+                <w:b w:val="1"/>
+                <w:bCs w:val="1"/>
+              </w:rPr>
+              <w:t xml:space="preserve">Nomor Induk Mahasiswa (NIM)</w:t>
+            </w:r>
+          </w:p>
+        </w:tc>
+        <w:tc>
+          <w:tcPr>
+            <w:tcW w:w="5200" w:type="dxa"/>
+            <w:noWrap/>
+          </w:tcPr>
+          <w:p>
+            <w:pPr/>
+            <w:r>
+              <w:rPr>
+                <w:rFonts w:ascii="Calibri" w:hAnsi="Calibri" w:eastAsia="Calibri" w:cs="Calibri"/>
+                <w:color w:val="333333"/>
+                <w:sz w:val="22"/>
+                <w:szCs w:val="22"/>
+              </w:rPr>
+              <w:t xml:space="preserve">251011700008</w:t>
+            </w:r>
+          </w:p>
+        </w:tc>
+      </w:tr>
+      <w:tr>
+        <w:trPr/>
+        <w:tc>
+          <w:tcPr>
+            <w:tcW w:w="3000" w:type="dxa"/>
+            <w:shd w:val="clear" w:fill="F1F5F9"/>
+            <w:noWrap/>
+          </w:tcPr>
+          <w:p>
+            <w:pPr/>
+            <w:r>
+              <w:rPr>
+                <w:rFonts w:ascii="Calibri" w:hAnsi="Calibri" w:eastAsia="Calibri" w:cs="Calibri"/>
+                <w:color w:val="111111"/>
+                <w:sz w:val="22"/>
+                <w:szCs w:val="22"/>
+                <w:b w:val="1"/>
+                <w:bCs w:val="1"/>
+              </w:rPr>
+              <w:t xml:space="preserve">1 Digit Terakhir NIM</w:t>
+            </w:r>
+          </w:p>
+        </w:tc>
+        <w:tc>
+          <w:tcPr>
+            <w:tcW w:w="5200" w:type="dxa"/>
+            <w:noWrap/>
+          </w:tcPr>
+          <w:p>
+            <w:pPr/>
+            <w:r>
+              <w:rPr>
+                <w:rFonts w:ascii="Calibri" w:hAnsi="Calibri" w:eastAsia="Calibri" w:cs="Calibri"/>
+                <w:color w:val="333333"/>
+                <w:sz w:val="22"/>
+                <w:szCs w:val="22"/>
+              </w:rPr>
+              <w:t xml:space="preserve">8</w:t>
+            </w:r>
+          </w:p>
+        </w:tc>
+      </w:tr>
+      <w:tr>
+        <w:trPr/>
+        <w:tc>
+          <w:tcPr>
+            <w:tcW w:w="3000" w:type="dxa"/>
+            <w:shd w:val="clear" w:fill="F1F5F9"/>
+            <w:noWrap/>
+          </w:tcPr>
+          <w:p>
+            <w:pPr/>
+            <w:r>
+              <w:rPr>
+                <w:rFonts w:ascii="Calibri" w:hAnsi="Calibri" w:eastAsia="Calibri" w:cs="Calibri"/>
+                <w:color w:val="111111"/>
+                <w:sz w:val="22"/>
+                <w:szCs w:val="22"/>
+                <w:b w:val="1"/>
+                <w:bCs w:val="1"/>
+              </w:rPr>
+              <w:t xml:space="preserve">Kelas</w:t>
+            </w:r>
+          </w:p>
+        </w:tc>
+        <w:tc>
+          <w:tcPr>
+            <w:tcW w:w="5200" w:type="dxa"/>
+            <w:noWrap/>
+          </w:tcPr>
+          <w:p>
+            <w:pPr/>
+            <w:r>
+              <w:rPr>
+                <w:rFonts w:ascii="Calibri" w:hAnsi="Calibri" w:eastAsia="Calibri" w:cs="Calibri"/>
+                <w:color w:val="333333"/>
+                <w:sz w:val="22"/>
+                <w:szCs w:val="22"/>
+              </w:rPr>
+              <w:t xml:space="preserve">03SIFE003</w:t>
+            </w:r>
+          </w:p>
+        </w:tc>
+      </w:tr>
+      <w:tr>
+        <w:trPr/>
+        <w:tc>
+          <w:tcPr>
+            <w:tcW w:w="3000" w:type="dxa"/>
+            <w:shd w:val="clear" w:fill="F1F5F9"/>
+            <w:noWrap/>
+          </w:tcPr>
+          <w:p>
+            <w:pPr/>
+            <w:r>
+              <w:rPr>
+                <w:rFonts w:ascii="Calibri" w:hAnsi="Calibri" w:eastAsia="Calibri" w:cs="Calibri"/>
+                <w:color w:val="111111"/>
+                <w:sz w:val="22"/>
+                <w:szCs w:val="22"/>
+                <w:b w:val="1"/>
+                <w:bCs w:val="1"/>
+              </w:rPr>
+              <w:t xml:space="preserve">Program Studi</w:t>
+            </w:r>
+          </w:p>
+        </w:tc>
+        <w:tc>
+          <w:tcPr>
+            <w:tcW w:w="5200" w:type="dxa"/>
+            <w:noWrap/>
+          </w:tcPr>
+          <w:p>
+            <w:pPr/>
+            <w:r>
+              <w:rPr>
+                <w:rFonts w:ascii="Calibri" w:hAnsi="Calibri" w:eastAsia="Calibri" w:cs="Calibri"/>
+                <w:color w:val="333333"/>
+                <w:sz w:val="22"/>
+                <w:szCs w:val="22"/>
+              </w:rPr>
+              <w:t xml:space="preserve">Sistem Informasi S-1</w:t>
+            </w:r>
+          </w:p>
+        </w:tc>
+      </w:tr>
+      <w:tr>
+        <w:trPr/>
+        <w:tc>
+          <w:tcPr>
+            <w:tcW w:w="3000" w:type="dxa"/>
+            <w:shd w:val="clear" w:fill="F1F5F9"/>
+            <w:noWrap/>
+          </w:tcPr>
+          <w:p>
+            <w:pPr/>
+            <w:r>
+              <w:rPr>
+                <w:rFonts w:ascii="Calibri" w:hAnsi="Calibri" w:eastAsia="Calibri" w:cs="Calibri"/>
+                <w:color w:val="111111"/>
+                <w:sz w:val="22"/>
+                <w:szCs w:val="22"/>
+                <w:b w:val="1"/>
+                <w:bCs w:val="1"/>
+              </w:rPr>
+              <w:t xml:space="preserve">Fakultas</w:t>
+            </w:r>
+          </w:p>
+        </w:tc>
+        <w:tc>
+          <w:tcPr>
+            <w:tcW w:w="5200" w:type="dxa"/>
+            <w:noWrap/>
+          </w:tcPr>
+          <w:p>
+            <w:pPr/>
+            <w:r>
+              <w:rPr>
+                <w:rFonts w:ascii="Calibri" w:hAnsi="Calibri" w:eastAsia="Calibri" w:cs="Calibri"/>
+                <w:color w:val="333333"/>
+                <w:sz w:val="22"/>
+                <w:szCs w:val="22"/>
+              </w:rPr>
+              <w:t xml:space="preserve">Ilmu Komputer</w:t>
+            </w:r>
+          </w:p>
+        </w:tc>
+      </w:tr>
+      <w:tr>
+        <w:trPr/>
+        <w:tc>
+          <w:tcPr>
+            <w:tcW w:w="3000" w:type="dxa"/>
+            <w:shd w:val="clear" w:fill="F1F5F9"/>
+            <w:noWrap/>
+          </w:tcPr>
+          <w:p>
+            <w:pPr/>
+            <w:r>
+              <w:rPr>
+                <w:rFonts w:ascii="Calibri" w:hAnsi="Calibri" w:eastAsia="Calibri" w:cs="Calibri"/>
+                <w:color w:val="111111"/>
+                <w:sz w:val="22"/>
+                <w:szCs w:val="22"/>
+                <w:b w:val="1"/>
+                <w:bCs w:val="1"/>
+              </w:rPr>
+              <w:t xml:space="preserve">Mata Kuliah</w:t>
+            </w:r>
+          </w:p>
+        </w:tc>
+        <w:tc>
+          <w:tcPr>
+            <w:tcW w:w="5200" w:type="dxa"/>
+            <w:noWrap/>
+          </w:tcPr>
+          <w:p>
+            <w:pPr/>
+            <w:r>
+              <w:rPr>
+                <w:rFonts w:ascii="Calibri" w:hAnsi="Calibri" w:eastAsia="Calibri" w:cs="Calibri"/>
+                <w:color w:val="333333"/>
+                <w:sz w:val="22"/>
+                <w:szCs w:val="22"/>
+              </w:rPr>
+              <w:t xml:space="preserve">Rekayasa Web</w:t>
+            </w:r>
+          </w:p>
+        </w:tc>
+      </w:tr>
+      <w:tr>
+        <w:trPr/>
+        <w:tc>
+          <w:tcPr>
+            <w:tcW w:w="3000" w:type="dxa"/>
+            <w:shd w:val="clear" w:fill="F1F5F9"/>
+            <w:noWrap/>
+          </w:tcPr>
+          <w:p>
+            <w:pPr/>
+            <w:r>
+              <w:rPr>
+                <w:rFonts w:ascii="Calibri" w:hAnsi="Calibri" w:eastAsia="Calibri" w:cs="Calibri"/>
+                <w:color w:val="111111"/>
+                <w:sz w:val="22"/>
+                <w:szCs w:val="22"/>
+                <w:b w:val="1"/>
+                <w:bCs w:val="1"/>
+              </w:rPr>
+              <w:t xml:space="preserve">Dosen Pengampu</w:t>
+            </w:r>
+          </w:p>
+        </w:tc>
+        <w:tc>
+          <w:tcPr>
+            <w:tcW w:w="5200" w:type="dxa"/>
+            <w:noWrap/>
+          </w:tcPr>
+          <w:p>
+            <w:pPr/>
+            <w:r>
+              <w:rPr>
+                <w:rFonts w:ascii="Calibri" w:hAnsi="Calibri" w:eastAsia="Calibri" w:cs="Calibri"/>
+                <w:color w:val="333333"/>
+                <w:sz w:val="22"/>
+                <w:szCs w:val="22"/>
+              </w:rPr>
+              <w:t xml:space="preserve">Afif Efendi, M.Kom.</w:t>
+            </w:r>
+          </w:p>
+        </w:tc>
+      </w:tr>
+      <w:tr>
+        <w:trPr/>
+        <w:tc>
+          <w:tcPr>
+            <w:tcW w:w="3000" w:type="dxa"/>
+            <w:shd w:val="clear" w:fill="F1F5F9"/>
+            <w:noWrap/>
+          </w:tcPr>
+          <w:p>
+            <w:pPr/>
+            <w:r>
+              <w:rPr>
+                <w:rFonts w:ascii="Calibri" w:hAnsi="Calibri" w:eastAsia="Calibri" w:cs="Calibri"/>
+                <w:color w:val="111111"/>
+                <w:sz w:val="22"/>
+                <w:szCs w:val="22"/>
+                <w:b w:val="1"/>
+                <w:bCs w:val="1"/>
+              </w:rPr>
+              <w:t xml:space="preserve">Tema Proyek (Sesuai Digit NIM 8)</w:t>
+            </w:r>
+          </w:p>
+        </w:tc>
+        <w:tc>
+          <w:tcPr>
+            <w:tcW w:w="5200" w:type="dxa"/>
+            <w:noWrap/>
+          </w:tcPr>
+          <w:p>
+            <w:pPr/>
+            <w:r>
+              <w:rPr>
+                <w:rFonts w:ascii="Calibri" w:hAnsi="Calibri" w:eastAsia="Calibri" w:cs="Calibri"/>
+                <w:color w:val="333333"/>
+                <w:sz w:val="22"/>
+                <w:szCs w:val="22"/>
+              </w:rPr>
+              <w:t xml:space="preserve">Platform Belajar Online</w:t>
+            </w:r>
+          </w:p>
+        </w:tc>
+      </w:tr>
+      <w:tr>
+        <w:trPr/>
+        <w:tc>
+          <w:tcPr>
+            <w:tcW w:w="3000" w:type="dxa"/>
+            <w:shd w:val="clear" w:fill="F1F5F9"/>
+            <w:noWrap/>
+          </w:tcPr>
+          <w:p>
+            <w:pPr/>
+            <w:r>
+              <w:rPr>
+                <w:rFonts w:ascii="Calibri" w:hAnsi="Calibri" w:eastAsia="Calibri" w:cs="Calibri"/>
+                <w:color w:val="111111"/>
+                <w:sz w:val="22"/>
+                <w:szCs w:val="22"/>
+                <w:b w:val="1"/>
+                <w:bCs w:val="1"/>
+              </w:rPr>
+              <w:t xml:space="preserve">Nama Tabel Database</w:t>
+            </w:r>
+          </w:p>
+        </w:tc>
+        <w:tc>
+          <w:tcPr>
+            <w:tcW w:w="5200" w:type="dxa"/>
+            <w:noWrap/>
+          </w:tcPr>
+          <w:p>
+            <w:pPr/>
+            <w:r>
+              <w:rPr>
+                <w:rFonts w:ascii="Calibri" w:hAnsi="Calibri" w:eastAsia="Calibri" w:cs="Calibri"/>
+                <w:color w:val="333333"/>
+                <w:sz w:val="22"/>
+                <w:szCs w:val="22"/>
+              </w:rPr>
+              <w:t xml:space="preserve">courses</w:t>
+            </w:r>
+          </w:p>
+        </w:tc>
+      </w:tr>
+      <w:tr>
+        <w:trPr/>
+        <w:tc>
+          <w:tcPr>
+            <w:tcW w:w="3000" w:type="dxa"/>
+            <w:shd w:val="clear" w:fill="F1F5F9"/>
+            <w:noWrap/>
+          </w:tcPr>
+          <w:p>
+            <w:pPr/>
+            <w:r>
+              <w:rPr>
+                <w:rFonts w:ascii="Calibri" w:hAnsi="Calibri" w:eastAsia="Calibri" w:cs="Calibri"/>
+                <w:color w:val="111111"/>
+                <w:sz w:val="22"/>
+                <w:szCs w:val="22"/>
+                <w:b w:val="1"/>
+                <w:bCs w:val="1"/>
+              </w:rPr>
+              <w:t xml:space="preserve">Nama Database</w:t>
+            </w:r>
+          </w:p>
+        </w:tc>
+        <w:tc>
+          <w:tcPr>
+            <w:tcW w:w="5200" w:type="dxa"/>
+            <w:noWrap/>
+          </w:tcPr>
+          <w:p>
+            <w:pPr/>
+            <w:r>
+              <w:rPr>
+                <w:rFonts w:ascii="Calibri" w:hAnsi="Calibri" w:eastAsia="Calibri" w:cs="Calibri"/>
+                <w:color w:val="333333"/>
+                <w:sz w:val="22"/>
+                <w:szCs w:val="22"/>
+              </w:rPr>
+              <w:t xml:space="preserve">db_uts_251011700008</w:t>
+            </w:r>
+          </w:p>
+        </w:tc>
+      </w:tr>
+      <w:tr>
+        <w:trPr/>
+        <w:tc>
+          <w:tcPr>
+            <w:tcW w:w="3000" w:type="dxa"/>
+            <w:shd w:val="clear" w:fill="F1F5F9"/>
+            <w:noWrap/>
+          </w:tcPr>
+          <w:p>
+            <w:pPr/>
+            <w:r>
+              <w:rPr>
+                <w:rFonts w:ascii="Calibri" w:hAnsi="Calibri" w:eastAsia="Calibri" w:cs="Calibri"/>
+                <w:color w:val="111111"/>
+                <w:sz w:val="22"/>
+                <w:szCs w:val="22"/>
+                <w:b w:val="1"/>
+                <w:bCs w:val="1"/>
+              </w:rPr>
+              <w:t xml:space="preserve">Framework dan Versi</w:t>
+            </w:r>
+          </w:p>
+        </w:tc>
+        <w:tc>
+          <w:tcPr>
+            <w:tcW w:w="5200" w:type="dxa"/>
+            <w:noWrap/>
+          </w:tcPr>
+          <w:p>
+            <w:pPr/>
+            <w:r>
+              <w:rPr>
+                <w:rFonts w:ascii="Calibri" w:hAnsi="Calibri" w:eastAsia="Calibri" w:cs="Calibri"/>
+                <w:color w:val="333333"/>
+                <w:sz w:val="22"/>
+                <w:szCs w:val="22"/>
+              </w:rPr>
+              <w:t xml:space="preserve">Laravel 11 / 12, PHP 8.4, Bootstrap 5.3 (Lokal)</w:t>
+            </w:r>
+          </w:p>
+        </w:tc>
+      </w:tr>
+      <w:tr>
+        <w:trPr/>
+        <w:tc>
+          <w:tcPr>
+            <w:tcW w:w="3000" w:type="dxa"/>
+            <w:shd w:val="clear" w:fill="F1F5F9"/>
+            <w:noWrap/>
+          </w:tcPr>
+          <w:p>
+            <w:pPr/>
+            <w:r>
+              <w:rPr>
+                <w:rFonts w:ascii="Calibri" w:hAnsi="Calibri" w:eastAsia="Calibri" w:cs="Calibri"/>
+                <w:color w:val="111111"/>
+                <w:sz w:val="22"/>
+                <w:szCs w:val="22"/>
+                <w:b w:val="1"/>
+                <w:bCs w:val="1"/>
+              </w:rPr>
+              <w:t xml:space="preserve">Web Server dan Database Engine</w:t>
+            </w:r>
+          </w:p>
+        </w:tc>
+        <w:tc>
+          <w:tcPr>
+            <w:tcW w:w="5200" w:type="dxa"/>
+            <w:noWrap/>
+          </w:tcPr>
+          <w:p>
+            <w:pPr/>
+            <w:r>
+              <w:rPr>
+                <w:rFonts w:ascii="Calibri" w:hAnsi="Calibri" w:eastAsia="Calibri" w:cs="Calibri"/>
+                <w:color w:val="333333"/>
+                <w:sz w:val="22"/>
+                <w:szCs w:val="22"/>
+              </w:rPr>
+              <w:t xml:space="preserve">MySQL 8.4 (Docker)</w:t>
+            </w:r>
+          </w:p>
+        </w:tc>
+      </w:tr>
+    </w:tbl>
+    <w:p/>
+    <w:p>
+      <w:pPr>
+        <w:pStyle w:val="Heading2"/>
+      </w:pPr>
+      <w:bookmarkStart w:id="1" w:name="_Toc1"/>
+      <w:r>
+        <w:t>B. Tautan Repositori GitHub</w:t>
+      </w:r>
+      <w:bookmarkEnd w:id="1"/>
+    </w:p>
+    <w:p>
+      <w:pPr>
+        <w:jc w:val="both"/>
+        <w:spacing w:after="100" w:line="276" w:lineRule="auto"/>
+      </w:pPr>
+      <w:r>
+        <w:rPr>
+          <w:rFonts w:ascii="Calibri" w:hAnsi="Calibri" w:eastAsia="Calibri" w:cs="Calibri"/>
+          <w:color w:val="333333"/>
+          <w:sz w:val="22"/>
+          <w:szCs w:val="22"/>
+        </w:rPr>
+        <w:t xml:space="preserve">Sesuai ketentuan soal pada Poin D.10 (Upload source code ke GitHub dengan nama project UTS_NAMA_NIM_KODEKELAS), berikut adalah rincian repositori:</w:t>
+      </w:r>
+    </w:p>
+    <w:tbl>
+      <w:tblGrid>
+        <w:gridCol w:w="3000" w:type="dxa"/>
+        <w:gridCol w:w="5200" w:type="dxa"/>
+      </w:tblGrid>
+      <w:tblPr>
+        <w:tblStyle w:val="IdentityTable"/>
+      </w:tblPr>
+      <w:tr>
+        <w:trPr/>
+        <w:tc>
+          <w:tcPr>
+            <w:tcW w:w="3000" w:type="dxa"/>
+            <w:shd w:val="clear" w:fill="F1F5F9"/>
+            <w:noWrap/>
+          </w:tcPr>
+          <w:p>
+            <w:pPr/>
+            <w:r>
+              <w:rPr>
+                <w:rFonts w:ascii="Calibri" w:hAnsi="Calibri" w:eastAsia="Calibri" w:cs="Calibri"/>
+                <w:color w:val="111111"/>
+                <w:sz w:val="22"/>
+                <w:szCs w:val="22"/>
+                <w:b w:val="1"/>
+                <w:bCs w:val="1"/>
+              </w:rPr>
+              <w:t xml:space="preserve">Nama Repositori</w:t>
+            </w:r>
+          </w:p>
+        </w:tc>
+        <w:tc>
+          <w:tcPr>
+            <w:tcW w:w="5200" w:type="dxa"/>
+            <w:noWrap/>
+          </w:tcPr>
+          <w:p>
+            <w:pPr/>
+            <w:r>
+              <w:rPr>
+                <w:color w:val="003366"/>
+                <w:b w:val="1"/>
+                <w:bCs w:val="1"/>
+              </w:rPr>
+              <w:t xml:space="preserve">UTS_RekayasaWeb_251011700008</w:t>
+            </w:r>
+          </w:p>
+        </w:tc>
+      </w:tr>
+      <w:tr>
+        <w:trPr/>
+        <w:tc>
+          <w:tcPr>
+            <w:tcW w:w="3000" w:type="dxa"/>
+            <w:shd w:val="clear" w:fill="F1F5F9"/>
+            <w:noWrap/>
+          </w:tcPr>
+          <w:p>
+            <w:pPr/>
+            <w:r>
+              <w:rPr>
+                <w:rFonts w:ascii="Calibri" w:hAnsi="Calibri" w:eastAsia="Calibri" w:cs="Calibri"/>
+                <w:color w:val="111111"/>
+                <w:sz w:val="22"/>
+                <w:szCs w:val="22"/>
+                <w:b w:val="1"/>
+                <w:bCs w:val="1"/>
+              </w:rPr>
+              <w:t xml:space="preserve">Link URL GitHub</w:t>
+            </w:r>
+          </w:p>
+        </w:tc>
+        <w:tc>
+          <w:tcPr>
+            <w:tcW w:w="5200" w:type="dxa"/>
+            <w:noWrap/>
+          </w:tcPr>
+          <w:p>
+            <w:pPr/>
+            <w:r>
+              <w:rPr>
+                <w:color w:val="0D6EFD"/>
+                <w:u w:val="single"/>
+              </w:rPr>
+              <w:t xml:space="preserve">https://github.com/ilhmpngstu/UTS_RekayasaWeb_251011700008</w:t>
+            </w:r>
+          </w:p>
+        </w:tc>
+      </w:tr>
+    </w:tbl>
+    <w:p/>
+    <w:p>
+      <w:pPr>
+        <w:pStyle w:val="Heading2"/>
+      </w:pPr>
+      <w:bookmarkStart w:id="2" w:name="_Toc2"/>
+      <w:r>
+        <w:t>C. Struktur Tabel Database (courses)</w:t>
+      </w:r>
+      <w:bookmarkEnd w:id="2"/>
+    </w:p>
+    <w:p>
+      <w:pPr>
+        <w:jc w:val="both"/>
+        <w:spacing w:after="100" w:line="276" w:lineRule="auto"/>
+      </w:pPr>
+      <w:r>
+        <w:rPr>
+          <w:rFonts w:ascii="Calibri" w:hAnsi="Calibri" w:eastAsia="Calibri" w:cs="Calibri"/>
+          <w:color w:val="333333"/>
+          <w:sz w:val="22"/>
+          <w:szCs w:val="22"/>
+        </w:rPr>
+        <w:t xml:space="preserve">Tabel courses dibuat menggunakan migration Laravel dan diisi dengan data dummy realistis melalui seeder (Database: db_uts_251011700008):</w:t>
+      </w:r>
+    </w:p>
+    <w:tbl>
+      <w:tblGrid>
+        <w:gridCol w:w="800" w:type="dxa"/>
+        <w:gridCol w:w="2000" w:type="dxa"/>
+        <w:gridCol w:w="2200" w:type="dxa"/>
+        <w:gridCol w:w="3200" w:type="dxa"/>
+      </w:tblGrid>
+      <w:tblPr>
+        <w:tblStyle w:val="IdentityTable"/>
+      </w:tblPr>
+      <w:tr>
+        <w:trPr/>
+        <w:tc>
+          <w:tcPr>
+            <w:tcW w:w="800" w:type="dxa"/>
+            <w:shd w:val="clear" w:fill="003366"/>
+            <w:noWrap/>
+          </w:tcPr>
+          <w:p>
+            <w:pPr/>
+            <w:r>
+              <w:rPr>
+                <w:rFonts w:ascii="Calibri" w:hAnsi="Calibri" w:eastAsia="Calibri" w:cs="Calibri"/>
+                <w:color w:val="FFFFFF"/>
+                <w:b w:val="1"/>
+                <w:bCs w:val="1"/>
+              </w:rPr>
+              <w:t xml:space="preserve">No</w:t>
+            </w:r>
+          </w:p>
+        </w:tc>
+        <w:tc>
+          <w:tcPr>
+            <w:tcW w:w="2000" w:type="dxa"/>
+            <w:shd w:val="clear" w:fill="003366"/>
+            <w:noWrap/>
+          </w:tcPr>
+          <w:p>
+            <w:pPr/>
+            <w:r>
+              <w:rPr>
+                <w:rFonts w:ascii="Calibri" w:hAnsi="Calibri" w:eastAsia="Calibri" w:cs="Calibri"/>
+                <w:color w:val="FFFFFF"/>
+                <w:b w:val="1"/>
+                <w:bCs w:val="1"/>
+              </w:rPr>
+              <w:t xml:space="preserve">Nama Kolom</w:t>
+            </w:r>
+          </w:p>
+        </w:tc>
+        <w:tc>
+          <w:tcPr>
+            <w:tcW w:w="2200" w:type="dxa"/>
+            <w:shd w:val="clear" w:fill="003366"/>
+            <w:noWrap/>
+          </w:tcPr>
+          <w:p>
+            <w:pPr/>
+            <w:r>
+              <w:rPr>
+                <w:rFonts w:ascii="Calibri" w:hAnsi="Calibri" w:eastAsia="Calibri" w:cs="Calibri"/>
+                <w:color w:val="FFFFFF"/>
+                <w:b w:val="1"/>
+                <w:bCs w:val="1"/>
+              </w:rPr>
+              <w:t xml:space="preserve">Tipe Data</w:t>
+            </w:r>
+          </w:p>
+        </w:tc>
+        <w:tc>
+          <w:tcPr>
+            <w:tcW w:w="3200" w:type="dxa"/>
+            <w:shd w:val="clear" w:fill="003366"/>
+            <w:noWrap/>
+          </w:tcPr>
+          <w:p>
+            <w:pPr/>
+            <w:r>
+              <w:rPr>
+                <w:rFonts w:ascii="Calibri" w:hAnsi="Calibri" w:eastAsia="Calibri" w:cs="Calibri"/>
+                <w:color w:val="FFFFFF"/>
+                <w:b w:val="1"/>
+                <w:bCs w:val="1"/>
+              </w:rPr>
+              <w:t xml:space="preserve">Keterangan</w:t>
+            </w:r>
+          </w:p>
+        </w:tc>
+      </w:tr>
+      <w:tr>
+        <w:trPr/>
+        <w:tc>
+          <w:tcPr>
+            <w:tcW w:w="800" w:type="dxa"/>
+            <w:noWrap/>
+          </w:tcPr>
+          <w:p>
+            <w:pPr/>
+            <w:r>
+              <w:rPr>
+                <w:rFonts w:ascii="Calibri" w:hAnsi="Calibri" w:eastAsia="Calibri" w:cs="Calibri"/>
+                <w:color w:val="333333"/>
+                <w:sz w:val="22"/>
+                <w:szCs w:val="22"/>
+              </w:rPr>
+              <w:t xml:space="preserve">1</w:t>
+            </w:r>
+          </w:p>
+        </w:tc>
+        <w:tc>
+          <w:tcPr>
+            <w:tcW w:w="2000" w:type="dxa"/>
+            <w:noWrap/>
+          </w:tcPr>
+          <w:p>
+            <w:pPr/>
+            <w:r>
+              <w:rPr>
+                <w:rFonts w:ascii="Calibri" w:hAnsi="Calibri" w:eastAsia="Calibri" w:cs="Calibri"/>
+                <w:color w:val="111111"/>
+                <w:sz w:val="22"/>
+                <w:szCs w:val="22"/>
+                <w:b w:val="1"/>
+                <w:bCs w:val="1"/>
+              </w:rPr>
+              <w:t xml:space="preserve">id</w:t>
+            </w:r>
+          </w:p>
+        </w:tc>
+        <w:tc>
+          <w:tcPr>
+            <w:tcW w:w="2200" w:type="dxa"/>
+            <w:noWrap/>
+          </w:tcPr>
+          <w:p>
+            <w:pPr/>
+            <w:r>
+              <w:rPr>
+                <w:rFonts w:ascii="Calibri" w:hAnsi="Calibri" w:eastAsia="Calibri" w:cs="Calibri"/>
+                <w:color w:val="333333"/>
+                <w:sz w:val="22"/>
+                <w:szCs w:val="22"/>
+              </w:rPr>
+              <w:t xml:space="preserve">BIGINT AUTO_INCREMENT</w:t>
+            </w:r>
+          </w:p>
+        </w:tc>
+        <w:tc>
+          <w:tcPr>
+            <w:tcW w:w="3200" w:type="dxa"/>
+            <w:noWrap/>
+          </w:tcPr>
+          <w:p>
+            <w:pPr/>
+            <w:r>
+              <w:rPr>
+                <w:rFonts w:ascii="Calibri" w:hAnsi="Calibri" w:eastAsia="Calibri" w:cs="Calibri"/>
+                <w:color w:val="333333"/>
+                <w:sz w:val="22"/>
+                <w:szCs w:val="22"/>
+              </w:rPr>
+              <w:t xml:space="preserve">Primary Key</w:t>
+            </w:r>
+          </w:p>
+        </w:tc>
+      </w:tr>
+      <w:tr>
+        <w:trPr/>
+        <w:tc>
+          <w:tcPr>
+            <w:tcW w:w="800" w:type="dxa"/>
+            <w:noWrap/>
+          </w:tcPr>
+          <w:p>
+            <w:pPr/>
+            <w:r>
+              <w:rPr>
+                <w:rFonts w:ascii="Calibri" w:hAnsi="Calibri" w:eastAsia="Calibri" w:cs="Calibri"/>
+                <w:color w:val="333333"/>
+                <w:sz w:val="22"/>
+                <w:szCs w:val="22"/>
+              </w:rPr>
+              <w:t xml:space="preserve">2</w:t>
+            </w:r>
+          </w:p>
+        </w:tc>
+        <w:tc>
+          <w:tcPr>
+            <w:tcW w:w="2000" w:type="dxa"/>
+            <w:noWrap/>
+          </w:tcPr>
+          <w:p>
+            <w:pPr/>
+            <w:r>
+              <w:rPr>
+                <w:rFonts w:ascii="Calibri" w:hAnsi="Calibri" w:eastAsia="Calibri" w:cs="Calibri"/>
+                <w:color w:val="111111"/>
+                <w:sz w:val="22"/>
+                <w:szCs w:val="22"/>
+                <w:b w:val="1"/>
+                <w:bCs w:val="1"/>
+              </w:rPr>
+              <w:t xml:space="preserve">title</w:t>
+            </w:r>
+          </w:p>
+        </w:tc>
+        <w:tc>
+          <w:tcPr>
+            <w:tcW w:w="2200" w:type="dxa"/>
+            <w:noWrap/>
+          </w:tcPr>
+          <w:p>
+            <w:pPr/>
+            <w:r>
+              <w:rPr>
+                <w:rFonts w:ascii="Calibri" w:hAnsi="Calibri" w:eastAsia="Calibri" w:cs="Calibri"/>
+                <w:color w:val="333333"/>
+                <w:sz w:val="22"/>
+                <w:szCs w:val="22"/>
+              </w:rPr>
+              <w:t xml:space="preserve">VARCHAR(255)</w:t>
+            </w:r>
+          </w:p>
+        </w:tc>
+        <w:tc>
+          <w:tcPr>
+            <w:tcW w:w="3200" w:type="dxa"/>
+            <w:noWrap/>
+          </w:tcPr>
+          <w:p>
+            <w:pPr/>
+            <w:r>
+              <w:rPr>
+                <w:rFonts w:ascii="Calibri" w:hAnsi="Calibri" w:eastAsia="Calibri" w:cs="Calibri"/>
+                <w:color w:val="333333"/>
+                <w:sz w:val="22"/>
+                <w:szCs w:val="22"/>
+              </w:rPr>
+              <w:t xml:space="preserve">Judul kursus online</w:t>
+            </w:r>
+          </w:p>
+        </w:tc>
+      </w:tr>
+      <w:tr>
+        <w:trPr/>
+        <w:tc>
+          <w:tcPr>
+            <w:tcW w:w="800" w:type="dxa"/>
+            <w:noWrap/>
+          </w:tcPr>
+          <w:p>
+            <w:pPr/>
+            <w:r>
+              <w:rPr>
+                <w:rFonts w:ascii="Calibri" w:hAnsi="Calibri" w:eastAsia="Calibri" w:cs="Calibri"/>
+                <w:color w:val="333333"/>
+                <w:sz w:val="22"/>
+                <w:szCs w:val="22"/>
+              </w:rPr>
+              <w:t xml:space="preserve">3</w:t>
+            </w:r>
+          </w:p>
+        </w:tc>
+        <w:tc>
+          <w:tcPr>
+            <w:tcW w:w="2000" w:type="dxa"/>
+            <w:noWrap/>
+          </w:tcPr>
+          <w:p>
+            <w:pPr/>
+            <w:r>
+              <w:rPr>
+                <w:rFonts w:ascii="Calibri" w:hAnsi="Calibri" w:eastAsia="Calibri" w:cs="Calibri"/>
+                <w:color w:val="111111"/>
+                <w:sz w:val="22"/>
+                <w:szCs w:val="22"/>
+                <w:b w:val="1"/>
+                <w:bCs w:val="1"/>
+              </w:rPr>
+              <w:t xml:space="preserve">instructor</w:t>
+            </w:r>
+          </w:p>
+        </w:tc>
+        <w:tc>
+          <w:tcPr>
+            <w:tcW w:w="2200" w:type="dxa"/>
+            <w:noWrap/>
+          </w:tcPr>
+          <w:p>
+            <w:pPr/>
+            <w:r>
+              <w:rPr>
+                <w:rFonts w:ascii="Calibri" w:hAnsi="Calibri" w:eastAsia="Calibri" w:cs="Calibri"/>
+                <w:color w:val="333333"/>
+                <w:sz w:val="22"/>
+                <w:szCs w:val="22"/>
+              </w:rPr>
+              <w:t xml:space="preserve">VARCHAR(255)</w:t>
+            </w:r>
+          </w:p>
+        </w:tc>
+        <w:tc>
+          <w:tcPr>
+            <w:tcW w:w="3200" w:type="dxa"/>
+            <w:noWrap/>
+          </w:tcPr>
+          <w:p>
+            <w:pPr/>
+            <w:r>
+              <w:rPr>
+                <w:rFonts w:ascii="Calibri" w:hAnsi="Calibri" w:eastAsia="Calibri" w:cs="Calibri"/>
+                <w:color w:val="333333"/>
+                <w:sz w:val="22"/>
+                <w:szCs w:val="22"/>
+              </w:rPr>
+              <w:t xml:space="preserve">Nama instruktur kursus</w:t>
+            </w:r>
+          </w:p>
+        </w:tc>
+      </w:tr>
+      <w:tr>
+        <w:trPr/>
+        <w:tc>
+          <w:tcPr>
+            <w:tcW w:w="800" w:type="dxa"/>
+            <w:noWrap/>
+          </w:tcPr>
+          <w:p>
+            <w:pPr/>
+            <w:r>
+              <w:rPr>
+                <w:rFonts w:ascii="Calibri" w:hAnsi="Calibri" w:eastAsia="Calibri" w:cs="Calibri"/>
+                <w:color w:val="333333"/>
+                <w:sz w:val="22"/>
+                <w:szCs w:val="22"/>
+              </w:rPr>
+              <w:t xml:space="preserve">4</w:t>
+            </w:r>
+          </w:p>
+        </w:tc>
+        <w:tc>
+          <w:tcPr>
+            <w:tcW w:w="2000" w:type="dxa"/>
+            <w:noWrap/>
+          </w:tcPr>
+          <w:p>
+            <w:pPr/>
+            <w:r>
+              <w:rPr>
+                <w:rFonts w:ascii="Calibri" w:hAnsi="Calibri" w:eastAsia="Calibri" w:cs="Calibri"/>
+                <w:color w:val="111111"/>
+                <w:sz w:val="22"/>
+                <w:szCs w:val="22"/>
+                <w:b w:val="1"/>
+                <w:bCs w:val="1"/>
+              </w:rPr>
+              <w:t xml:space="preserve">duration</w:t>
+            </w:r>
+          </w:p>
+        </w:tc>
+        <w:tc>
+          <w:tcPr>
+            <w:tcW w:w="2200" w:type="dxa"/>
+            <w:noWrap/>
+          </w:tcPr>
+          <w:p>
+            <w:pPr/>
+            <w:r>
+              <w:rPr>
+                <w:rFonts w:ascii="Calibri" w:hAnsi="Calibri" w:eastAsia="Calibri" w:cs="Calibri"/>
+                <w:color w:val="333333"/>
+                <w:sz w:val="22"/>
+                <w:szCs w:val="22"/>
+              </w:rPr>
+              <w:t xml:space="preserve">VARCHAR(255)</w:t>
+            </w:r>
+          </w:p>
+        </w:tc>
+        <w:tc>
+          <w:tcPr>
+            <w:tcW w:w="3200" w:type="dxa"/>
+            <w:noWrap/>
+          </w:tcPr>
+          <w:p>
+            <w:pPr/>
+            <w:r>
+              <w:rPr>
+                <w:rFonts w:ascii="Calibri" w:hAnsi="Calibri" w:eastAsia="Calibri" w:cs="Calibri"/>
+                <w:color w:val="333333"/>
+                <w:sz w:val="22"/>
+                <w:szCs w:val="22"/>
+              </w:rPr>
+              <w:t xml:space="preserve">Durasi materi (misal: "24 Jam Video")</w:t>
+            </w:r>
+          </w:p>
+        </w:tc>
+      </w:tr>
+      <w:tr>
+        <w:trPr/>
+        <w:tc>
+          <w:tcPr>
+            <w:tcW w:w="800" w:type="dxa"/>
+            <w:noWrap/>
+          </w:tcPr>
+          <w:p>
+            <w:pPr/>
+            <w:r>
+              <w:rPr>
+                <w:rFonts w:ascii="Calibri" w:hAnsi="Calibri" w:eastAsia="Calibri" w:cs="Calibri"/>
+                <w:color w:val="333333"/>
+                <w:sz w:val="22"/>
+                <w:szCs w:val="22"/>
+              </w:rPr>
+              <w:t xml:space="preserve">5</w:t>
+            </w:r>
+          </w:p>
+        </w:tc>
+        <w:tc>
+          <w:tcPr>
+            <w:tcW w:w="2000" w:type="dxa"/>
+            <w:noWrap/>
+          </w:tcPr>
+          <w:p>
+            <w:pPr/>
+            <w:r>
+              <w:rPr>
+                <w:rFonts w:ascii="Calibri" w:hAnsi="Calibri" w:eastAsia="Calibri" w:cs="Calibri"/>
+                <w:color w:val="111111"/>
+                <w:sz w:val="22"/>
+                <w:szCs w:val="22"/>
+                <w:b w:val="1"/>
+                <w:bCs w:val="1"/>
+              </w:rPr>
+              <w:t xml:space="preserve">image</w:t>
+            </w:r>
+          </w:p>
+        </w:tc>
+        <w:tc>
+          <w:tcPr>
+            <w:tcW w:w="2200" w:type="dxa"/>
+            <w:noWrap/>
+          </w:tcPr>
+          <w:p>
+            <w:pPr/>
+            <w:r>
+              <w:rPr>
+                <w:rFonts w:ascii="Calibri" w:hAnsi="Calibri" w:eastAsia="Calibri" w:cs="Calibri"/>
+                <w:color w:val="333333"/>
+                <w:sz w:val="22"/>
+                <w:szCs w:val="22"/>
+              </w:rPr>
+              <w:t xml:space="preserve">VARCHAR(255)</w:t>
+            </w:r>
+          </w:p>
+        </w:tc>
+        <w:tc>
+          <w:tcPr>
+            <w:tcW w:w="3200" w:type="dxa"/>
+            <w:noWrap/>
+          </w:tcPr>
+          <w:p>
+            <w:pPr/>
+            <w:r>
+              <w:rPr>
+                <w:rFonts w:ascii="Calibri" w:hAnsi="Calibri" w:eastAsia="Calibri" w:cs="Calibri"/>
+                <w:color w:val="333333"/>
+                <w:sz w:val="22"/>
+                <w:szCs w:val="22"/>
+              </w:rPr>
+              <w:t xml:space="preserve">Nama file di public/assets/images/</w:t>
+            </w:r>
+          </w:p>
+        </w:tc>
+      </w:tr>
+      <w:tr>
+        <w:trPr/>
+        <w:tc>
+          <w:tcPr>
+            <w:tcW w:w="800" w:type="dxa"/>
+            <w:noWrap/>
+          </w:tcPr>
+          <w:p>
+            <w:pPr/>
+            <w:r>
+              <w:rPr>
+                <w:rFonts w:ascii="Calibri" w:hAnsi="Calibri" w:eastAsia="Calibri" w:cs="Calibri"/>
+                <w:color w:val="333333"/>
+                <w:sz w:val="22"/>
+                <w:szCs w:val="22"/>
+              </w:rPr>
+              <w:t xml:space="preserve">6</w:t>
+            </w:r>
+          </w:p>
+        </w:tc>
+        <w:tc>
+          <w:tcPr>
+            <w:tcW w:w="2000" w:type="dxa"/>
+            <w:noWrap/>
+          </w:tcPr>
+          <w:p>
+            <w:pPr/>
+            <w:r>
+              <w:rPr>
+                <w:rFonts w:ascii="Calibri" w:hAnsi="Calibri" w:eastAsia="Calibri" w:cs="Calibri"/>
+                <w:color w:val="111111"/>
+                <w:sz w:val="22"/>
+                <w:szCs w:val="22"/>
+                <w:b w:val="1"/>
+                <w:bCs w:val="1"/>
+              </w:rPr>
+              <w:t xml:space="preserve">price</w:t>
+            </w:r>
+          </w:p>
+        </w:tc>
+        <w:tc>
+          <w:tcPr>
+            <w:tcW w:w="2200" w:type="dxa"/>
+            <w:noWrap/>
+          </w:tcPr>
+          <w:p>
+            <w:pPr/>
+            <w:r>
+              <w:rPr>
+                <w:rFonts w:ascii="Calibri" w:hAnsi="Calibri" w:eastAsia="Calibri" w:cs="Calibri"/>
+                <w:color w:val="333333"/>
+                <w:sz w:val="22"/>
+                <w:szCs w:val="22"/>
+              </w:rPr>
+              <w:t xml:space="preserve">DECIMAL(12, 2)</w:t>
+            </w:r>
+          </w:p>
+        </w:tc>
+        <w:tc>
+          <w:tcPr>
+            <w:tcW w:w="3200" w:type="dxa"/>
+            <w:noWrap/>
+          </w:tcPr>
+          <w:p>
+            <w:pPr/>
+            <w:r>
+              <w:rPr>
+                <w:rFonts w:ascii="Calibri" w:hAnsi="Calibri" w:eastAsia="Calibri" w:cs="Calibri"/>
+                <w:color w:val="333333"/>
+                <w:sz w:val="22"/>
+                <w:szCs w:val="22"/>
+              </w:rPr>
+              <w:t xml:space="preserve">Harga kursus dalam Rupiah</w:t>
+            </w:r>
+          </w:p>
+        </w:tc>
+      </w:tr>
+      <w:tr>
+        <w:trPr/>
+        <w:tc>
+          <w:tcPr>
+            <w:tcW w:w="800" w:type="dxa"/>
+            <w:noWrap/>
+          </w:tcPr>
+          <w:p>
+            <w:pPr/>
+            <w:r>
+              <w:rPr>
+                <w:rFonts w:ascii="Calibri" w:hAnsi="Calibri" w:eastAsia="Calibri" w:cs="Calibri"/>
+                <w:color w:val="333333"/>
+                <w:sz w:val="22"/>
+                <w:szCs w:val="22"/>
+              </w:rPr>
+              <w:t xml:space="preserve">7</w:t>
+            </w:r>
+          </w:p>
+        </w:tc>
+        <w:tc>
+          <w:tcPr>
+            <w:tcW w:w="2000" w:type="dxa"/>
+            <w:noWrap/>
+          </w:tcPr>
+          <w:p>
+            <w:pPr/>
+            <w:r>
+              <w:rPr>
+                <w:rFonts w:ascii="Calibri" w:hAnsi="Calibri" w:eastAsia="Calibri" w:cs="Calibri"/>
+                <w:color w:val="111111"/>
+                <w:sz w:val="22"/>
+                <w:szCs w:val="22"/>
+                <w:b w:val="1"/>
+                <w:bCs w:val="1"/>
+              </w:rPr>
+              <w:t xml:space="preserve">category</w:t>
+            </w:r>
+          </w:p>
+        </w:tc>
+        <w:tc>
+          <w:tcPr>
+            <w:tcW w:w="2200" w:type="dxa"/>
+            <w:noWrap/>
+          </w:tcPr>
+          <w:p>
+            <w:pPr/>
+            <w:r>
+              <w:rPr>
+                <w:rFonts w:ascii="Calibri" w:hAnsi="Calibri" w:eastAsia="Calibri" w:cs="Calibri"/>
+                <w:color w:val="333333"/>
+                <w:sz w:val="22"/>
+                <w:szCs w:val="22"/>
+              </w:rPr>
+              <w:t xml:space="preserve">VARCHAR(255)</w:t>
+            </w:r>
+          </w:p>
+        </w:tc>
+        <w:tc>
+          <w:tcPr>
+            <w:tcW w:w="3200" w:type="dxa"/>
+            <w:noWrap/>
+          </w:tcPr>
+          <w:p>
+            <w:pPr/>
+            <w:r>
+              <w:rPr>
+                <w:rFonts w:ascii="Calibri" w:hAnsi="Calibri" w:eastAsia="Calibri" w:cs="Calibri"/>
+                <w:color w:val="333333"/>
+                <w:sz w:val="22"/>
+                <w:szCs w:val="22"/>
+              </w:rPr>
+              <w:t xml:space="preserve">Kategori materi kursus</w:t>
+            </w:r>
+          </w:p>
+        </w:tc>
+      </w:tr>
+      <w:tr>
+        <w:trPr/>
+        <w:tc>
+          <w:tcPr>
+            <w:tcW w:w="800" w:type="dxa"/>
+            <w:noWrap/>
+          </w:tcPr>
+          <w:p>
+            <w:pPr/>
+            <w:r>
+              <w:rPr>
+                <w:rFonts w:ascii="Calibri" w:hAnsi="Calibri" w:eastAsia="Calibri" w:cs="Calibri"/>
+                <w:color w:val="333333"/>
+                <w:sz w:val="22"/>
+                <w:szCs w:val="22"/>
+              </w:rPr>
+              <w:t xml:space="preserve">8</w:t>
+            </w:r>
+          </w:p>
+        </w:tc>
+        <w:tc>
+          <w:tcPr>
+            <w:tcW w:w="2000" w:type="dxa"/>
+            <w:noWrap/>
+          </w:tcPr>
+          <w:p>
+            <w:pPr/>
+            <w:r>
+              <w:rPr>
+                <w:rFonts w:ascii="Calibri" w:hAnsi="Calibri" w:eastAsia="Calibri" w:cs="Calibri"/>
+                <w:color w:val="111111"/>
+                <w:sz w:val="22"/>
+                <w:szCs w:val="22"/>
+                <w:b w:val="1"/>
+                <w:bCs w:val="1"/>
+              </w:rPr>
+              <w:t xml:space="preserve">description</w:t>
+            </w:r>
+          </w:p>
+        </w:tc>
+        <w:tc>
+          <w:tcPr>
+            <w:tcW w:w="2200" w:type="dxa"/>
+            <w:noWrap/>
+          </w:tcPr>
+          <w:p>
+            <w:pPr/>
+            <w:r>
+              <w:rPr>
+                <w:rFonts w:ascii="Calibri" w:hAnsi="Calibri" w:eastAsia="Calibri" w:cs="Calibri"/>
+                <w:color w:val="333333"/>
+                <w:sz w:val="22"/>
+                <w:szCs w:val="22"/>
+              </w:rPr>
+              <w:t xml:space="preserve">TEXT (Nullable)</w:t>
+            </w:r>
+          </w:p>
+        </w:tc>
+        <w:tc>
+          <w:tcPr>
+            <w:tcW w:w="3200" w:type="dxa"/>
+            <w:noWrap/>
+          </w:tcPr>
+          <w:p>
+            <w:pPr/>
+            <w:r>
+              <w:rPr>
+                <w:rFonts w:ascii="Calibri" w:hAnsi="Calibri" w:eastAsia="Calibri" w:cs="Calibri"/>
+                <w:color w:val="333333"/>
+                <w:sz w:val="22"/>
+                <w:szCs w:val="22"/>
+              </w:rPr>
+              <w:t xml:space="preserve">Deskripsi lengkap silabus kursus</w:t>
+            </w:r>
+          </w:p>
+        </w:tc>
+      </w:tr>
+      <w:tr>
+        <w:trPr/>
+        <w:tc>
+          <w:tcPr>
+            <w:tcW w:w="800" w:type="dxa"/>
+            <w:noWrap/>
+          </w:tcPr>
+          <w:p>
+            <w:pPr/>
+            <w:r>
+              <w:rPr>
+                <w:rFonts w:ascii="Calibri" w:hAnsi="Calibri" w:eastAsia="Calibri" w:cs="Calibri"/>
+                <w:color w:val="333333"/>
+                <w:sz w:val="22"/>
+                <w:szCs w:val="22"/>
+              </w:rPr>
+              <w:t xml:space="preserve">9</w:t>
+            </w:r>
+          </w:p>
+        </w:tc>
+        <w:tc>
+          <w:tcPr>
+            <w:tcW w:w="2000" w:type="dxa"/>
+            <w:noWrap/>
+          </w:tcPr>
+          <w:p>
+            <w:pPr/>
+            <w:r>
+              <w:rPr>
+                <w:rFonts w:ascii="Calibri" w:hAnsi="Calibri" w:eastAsia="Calibri" w:cs="Calibri"/>
+                <w:color w:val="111111"/>
+                <w:sz w:val="22"/>
+                <w:szCs w:val="22"/>
+                <w:b w:val="1"/>
+                <w:bCs w:val="1"/>
+              </w:rPr>
+              <w:t xml:space="preserve">created_at</w:t>
+            </w:r>
+          </w:p>
+        </w:tc>
+        <w:tc>
+          <w:tcPr>
+            <w:tcW w:w="2200" w:type="dxa"/>
+            <w:noWrap/>
+          </w:tcPr>
+          <w:p>
+            <w:pPr/>
+            <w:r>
+              <w:rPr>
+                <w:rFonts w:ascii="Calibri" w:hAnsi="Calibri" w:eastAsia="Calibri" w:cs="Calibri"/>
+                <w:color w:val="333333"/>
+                <w:sz w:val="22"/>
+                <w:szCs w:val="22"/>
+              </w:rPr>
+              <w:t xml:space="preserve">TIMESTAMP</w:t>
+            </w:r>
+          </w:p>
+        </w:tc>
+        <w:tc>
+          <w:tcPr>
+            <w:tcW w:w="3200" w:type="dxa"/>
+            <w:noWrap/>
+          </w:tcPr>
+          <w:p>
+            <w:pPr/>
+            <w:r>
+              <w:rPr>
+                <w:rFonts w:ascii="Calibri" w:hAnsi="Calibri" w:eastAsia="Calibri" w:cs="Calibri"/>
+                <w:color w:val="333333"/>
+                <w:sz w:val="22"/>
+                <w:szCs w:val="22"/>
+              </w:rPr>
+              <w:t xml:space="preserve">Waktu pembuatan data</w:t>
+            </w:r>
+          </w:p>
+        </w:tc>
+      </w:tr>
+      <w:tr>
+        <w:trPr/>
+        <w:tc>
+          <w:tcPr>
+            <w:tcW w:w="800" w:type="dxa"/>
+            <w:noWrap/>
+          </w:tcPr>
+          <w:p>
+            <w:pPr/>
+            <w:r>
+              <w:rPr>
+                <w:rFonts w:ascii="Calibri" w:hAnsi="Calibri" w:eastAsia="Calibri" w:cs="Calibri"/>
+                <w:color w:val="333333"/>
+                <w:sz w:val="22"/>
+                <w:szCs w:val="22"/>
+              </w:rPr>
+              <w:t xml:space="preserve">10</w:t>
+            </w:r>
+          </w:p>
+        </w:tc>
+        <w:tc>
+          <w:tcPr>
+            <w:tcW w:w="2000" w:type="dxa"/>
+            <w:noWrap/>
+          </w:tcPr>
+          <w:p>
+            <w:pPr/>
+            <w:r>
+              <w:rPr>
+                <w:rFonts w:ascii="Calibri" w:hAnsi="Calibri" w:eastAsia="Calibri" w:cs="Calibri"/>
+                <w:color w:val="111111"/>
+                <w:sz w:val="22"/>
+                <w:szCs w:val="22"/>
+                <w:b w:val="1"/>
+                <w:bCs w:val="1"/>
+              </w:rPr>
+              <w:t xml:space="preserve">updated_at</w:t>
+            </w:r>
+          </w:p>
+        </w:tc>
+        <w:tc>
+          <w:tcPr>
+            <w:tcW w:w="2200" w:type="dxa"/>
+            <w:noWrap/>
+          </w:tcPr>
+          <w:p>
+            <w:pPr/>
+            <w:r>
+              <w:rPr>
+                <w:rFonts w:ascii="Calibri" w:hAnsi="Calibri" w:eastAsia="Calibri" w:cs="Calibri"/>
+                <w:color w:val="333333"/>
+                <w:sz w:val="22"/>
+                <w:szCs w:val="22"/>
+              </w:rPr>
+              <w:t xml:space="preserve">TIMESTAMP</w:t>
+            </w:r>
+          </w:p>
+        </w:tc>
+        <w:tc>
+          <w:tcPr>
+            <w:tcW w:w="3200" w:type="dxa"/>
+            <w:noWrap/>
+          </w:tcPr>
+          <w:p>
+            <w:pPr/>
+            <w:r>
+              <w:rPr>
+                <w:rFonts w:ascii="Calibri" w:hAnsi="Calibri" w:eastAsia="Calibri" w:cs="Calibri"/>
+                <w:color w:val="333333"/>
+                <w:sz w:val="22"/>
+                <w:szCs w:val="22"/>
+              </w:rPr>
+              <w:t xml:space="preserve">Waktu perbaruan data</w:t>
+            </w:r>
+          </w:p>
+        </w:tc>
+      </w:tr>
+    </w:tbl>
+    <w:p>
+      <w:r>
+        <w:br w:type="page"/>
+      </w:r>
+    </w:p>
+    <w:p>
+      <w:pPr>
+        <w:pStyle w:val="Heading2"/>
+      </w:pPr>
+      <w:bookmarkStart w:id="3" w:name="_Toc3"/>
+      <w:r>
+        <w:t>D. Screenshot Hasil Implementasi Aplikasi Web</w:t>
+      </w:r>
+      <w:bookmarkEnd w:id="3"/>
+    </w:p>
+    <w:p>
+      <w:pPr>
+        <w:jc w:val="both"/>
+        <w:spacing w:after="100" w:line="276" w:lineRule="auto"/>
+      </w:pPr>
+      <w:r>
+        <w:rPr>
+          <w:rFonts w:ascii="Calibri" w:hAnsi="Calibri" w:eastAsia="Calibri" w:cs="Calibri"/>
+          <w:color w:val="333333"/>
+          <w:sz w:val="22"/>
+          <w:szCs w:val="22"/>
+        </w:rPr>
+        <w:t xml:space="preserve">Berikut adalah tangkapan layar antarmuka web yang dibangun dengan framework Laravel, Blade Template, dan Bootstrap 5:</w:t>
+      </w:r>
+    </w:p>
+    <w:p>
+      <w:pPr>
+        <w:pStyle w:val="Heading3"/>
+      </w:pPr>
+      <w:bookmarkStart w:id="4" w:name="_Toc4"/>
+      <w:r>
+        <w:t>1. Halaman Katalog Kursus (Card Grid dan Header Banner UNPAM)</w:t>
+      </w:r>
+      <w:bookmarkEnd w:id="4"/>
+    </w:p>
+    <w:p>
+      <w:pPr/>
+      <w:r>
+        <w:rPr>
+          <w:rFonts w:ascii="Calibri" w:hAnsi="Calibri" w:eastAsia="Calibri" w:cs="Calibri"/>
+          <w:color w:val="666666"/>
+          <w:sz w:val="20"/>
+          <w:szCs w:val="20"/>
+          <w:i w:val="1"/>
+          <w:iCs w:val="1"/>
+        </w:rPr>
+        <w:t xml:space="preserve">Menampilkan header resmi Yayasan Sasmita Jaya dan UNPAM, identitas mahasiswa, fitur filter kategori, pencarian, dan daftar kartu kursus responsif.</w:t>
+      </w:r>
+    </w:p>
+    <w:p>
+      <w:pPr>
+        <w:jc w:val="center"/>
+      </w:pPr>
+      <w:r>
+        <w:pict>
+          <v:shape type="#_x0000_t75" stroked="f" style="width:470pt; height:376pt; margin-left:0pt; margin-top:0pt; mso-position-horizontal:left; mso-position-vertical:top; mso-position-horizontal-relative:char; mso-position-vertical-relative:line;">
+            <w10:wrap type="inline"/>
+            <v:imagedata r:id="rId7" o:title=""/>
+          </v:shape>
+        </w:pict>
+      </w:r>
+    </w:p>
+    <w:p/>
+    <w:p>
+      <w:pPr>
+        <w:pStyle w:val="Heading3"/>
+      </w:pPr>
+      <w:bookmarkStart w:id="5" w:name="_Toc5"/>
+      <w:r>
+        <w:t>2. Halaman Tampilan Tabel Data Kursus (Table Bootstrap)</w:t>
+      </w:r>
+      <w:bookmarkEnd w:id="5"/>
+    </w:p>
+    <w:p>
+      <w:pPr/>
+      <w:r>
+        <w:rPr>
+          <w:rFonts w:ascii="Calibri" w:hAnsi="Calibri" w:eastAsia="Calibri" w:cs="Calibri"/>
+          <w:color w:val="666666"/>
+          <w:sz w:val="20"/>
+          <w:szCs w:val="20"/>
+          <w:i w:val="1"/>
+          <w:iCs w:val="1"/>
+        </w:rPr>
+        <w:t xml:space="preserve">Menampilkan data tabel courses menggunakan komponen Bootstrap table table-hover table-striped lengkap dengan thumbnail, kategori badge, harga, dan tombol detail.</w:t>
+      </w:r>
+    </w:p>
+    <w:p>
+      <w:pPr>
+        <w:jc w:val="center"/>
+      </w:pPr>
+      <w:r>
+        <w:pict>
+          <v:shape type="#_x0000_t75" stroked="f" style="width:470pt; height:376pt; margin-left:0pt; margin-top:0pt; mso-position-horizontal:left; mso-position-vertical:top; mso-position-horizontal-relative:char; mso-position-vertical-relative:line;">
+            <w10:wrap type="inline"/>
+            <v:imagedata r:id="rId8" o:title=""/>
+          </v:shape>
+        </w:pict>
+      </w:r>
+    </w:p>
+    <w:p>
+      <w:r>
+        <w:br w:type="page"/>
+      </w:r>
+    </w:p>
+    <w:p>
+      <w:pPr>
+        <w:pStyle w:val="Heading3"/>
+      </w:pPr>
+      <w:bookmarkStart w:id="6" w:name="_Toc6"/>
+      <w:r>
+        <w:t>3. Halaman Detail Kursus (Show View)</w:t>
+      </w:r>
+      <w:bookmarkEnd w:id="6"/>
+    </w:p>
+    <w:p>
+      <w:pPr/>
+      <w:r>
+        <w:rPr>
+          <w:rFonts w:ascii="Calibri" w:hAnsi="Calibri" w:eastAsia="Calibri" w:cs="Calibri"/>
+          <w:color w:val="666666"/>
+          <w:sz w:val="20"/>
+          <w:szCs w:val="20"/>
+          <w:i w:val="1"/>
+          <w:iCs w:val="1"/>
+        </w:rPr>
+        <w:t xml:space="preserve">Menampilkan rincian materi lengkap, breadcrumb navigasi, profil instruktur, silabus modul pembelajaran (Accordion Bootstrap), fasilitas, serta modal pendaftaran.</w:t>
+      </w:r>
+    </w:p>
+    <w:p>
+      <w:pPr>
+        <w:jc w:val="center"/>
+      </w:pPr>
+      <w:r>
+        <w:pict>
+          <v:shape type="#_x0000_t75" stroked="f" style="width:470pt; height:376pt; margin-left:0pt; margin-top:0pt; mso-position-horizontal:left; mso-position-vertical:top; mso-position-horizontal-relative:char; mso-position-vertical-relative:line;">
+            <w10:wrap type="inline"/>
+            <v:imagedata r:id="rId9" o:title=""/>
+          </v:shape>
+        </w:pict>
+      </w:r>
+    </w:p>
+    <w:p/>
+    <w:p>
+      <w:pPr>
+        <w:pStyle w:val="Heading3"/>
+      </w:pPr>
+      <w:bookmarkStart w:id="7" w:name="_Toc7"/>
+      <w:r>
+        <w:t>4. Halaman Identitas Mahasiswa dan Informasi Penugasan UTS</w:t>
+      </w:r>
+      <w:bookmarkEnd w:id="7"/>
+    </w:p>
+    <w:p>
+      <w:pPr/>
+      <w:r>
+        <w:rPr>
+          <w:rFonts w:ascii="Calibri" w:hAnsi="Calibri" w:eastAsia="Calibri" w:cs="Calibri"/>
+          <w:color w:val="666666"/>
+          <w:sz w:val="20"/>
+          <w:szCs w:val="20"/>
+          <w:i w:val="1"/>
+          <w:iCs w:val="1"/>
+        </w:rPr>
+        <w:t xml:space="preserve">Menampilkan identitas lengkap mahasiswa pengembang, rincian teknis penugasan UTS, checklist pemenuhan seluruh butir soal, dan ringkasan statistik database.</w:t>
+      </w:r>
+    </w:p>
+    <w:p>
+      <w:pPr>
+        <w:jc w:val="center"/>
+      </w:pPr>
+      <w:r>
+        <w:pict>
+          <v:shape type="#_x0000_t75" stroked="f" style="width:470pt; height:376pt; margin-left:0pt; margin-top:0pt; mso-position-horizontal:left; mso-position-vertical:top; mso-position-horizontal-relative:char; mso-position-vertical-relative:line;">
+            <w10:wrap type="inline"/>
+            <v:imagedata r:id="rId10" o:title=""/>
+          </v:shape>
+        </w:pict>
+      </w:r>
+    </w:p>
+    <w:p/>
+    <w:p>
+      <w:pPr>
+        <w:pStyle w:val="Heading2"/>
+      </w:pPr>
+      <w:bookmarkStart w:id="8" w:name="_Toc8"/>
+      <w:r>
+        <w:t>E. Kesimpulan</w:t>
+      </w:r>
+      <w:bookmarkEnd w:id="8"/>
+    </w:p>
+    <w:p>
+      <w:pPr>
+        <w:jc w:val="both"/>
+        <w:spacing w:after="100" w:line="276" w:lineRule="auto"/>
+      </w:pPr>
+      <w:r>
+        <w:rPr>
+          <w:rFonts w:ascii="Calibri" w:hAnsi="Calibri" w:eastAsia="Calibri" w:cs="Calibri"/>
+          <w:color w:val="333333"/>
+          <w:sz w:val="22"/>
+          <w:szCs w:val="22"/>
+        </w:rPr>
+        <w:t xml:space="preserve">Seluruh instruksi dan ketentuan pada soal Ujian Tengah Semester (UTS) mata kuliah Rekayasa Web telah berhasil diimplementasikan dengan baik:</w:t>
+      </w:r>
+    </w:p>
+    <w:p>
+      <w:pPr>
+        <w:numPr>
+          <w:ilvl w:val="0"/>
+          <w:numId w:val="5"/>
+        </w:numPr>
+      </w:pPr>
+      <w:r>
+        <w:rPr>
+          <w:rFonts w:ascii="Calibri" w:hAnsi="Calibri" w:eastAsia="Calibri" w:cs="Calibri"/>
+          <w:color w:val="333333"/>
+          <w:sz w:val="22"/>
+          <w:szCs w:val="22"/>
+        </w:rPr>
+        <w:t xml:space="preserve">Proyek dibuat menggunakan framework Laravel dengan arsitektur MVC terstruktur.</w:t>
+      </w:r>
+    </w:p>
+    <w:p>
+      <w:pPr>
+        <w:numPr>
+          <w:ilvl w:val="0"/>
+          <w:numId w:val="5"/>
+        </w:numPr>
+      </w:pPr>
+      <w:r>
+        <w:rPr>
+          <w:rFonts w:ascii="Calibri" w:hAnsi="Calibri" w:eastAsia="Calibri" w:cs="Calibri"/>
+          <w:color w:val="333333"/>
+          <w:sz w:val="22"/>
+          <w:szCs w:val="22"/>
+        </w:rPr>
+        <w:t xml:space="preserve">Tabel courses dan database db_uts_251011700008 berhasil dimigrasikan serta diisi data dummy realistis via Seeder.</w:t>
+      </w:r>
+    </w:p>
+    <w:p>
+      <w:pPr>
+        <w:numPr>
+          <w:ilvl w:val="0"/>
+          <w:numId w:val="5"/>
+        </w:numPr>
+      </w:pPr>
+      <w:r>
+        <w:rPr>
+          <w:rFonts w:ascii="Calibri" w:hAnsi="Calibri" w:eastAsia="Calibri" w:cs="Calibri"/>
+          <w:color w:val="333333"/>
+          <w:sz w:val="22"/>
+          <w:szCs w:val="22"/>
+        </w:rPr>
+        <w:t xml:space="preserve">Asset Bootstrap 5.3 dan gambar thumbnail tersimpan secara mandiri di folder public aplikasi.</w:t>
+      </w:r>
+    </w:p>
+    <w:p>
+      <w:pPr>
+        <w:numPr>
+          <w:ilvl w:val="0"/>
+          <w:numId w:val="5"/>
+        </w:numPr>
+      </w:pPr>
+      <w:r>
+        <w:rPr>
+          <w:rFonts w:ascii="Calibri" w:hAnsi="Calibri" w:eastAsia="Calibri" w:cs="Calibri"/>
+          <w:color w:val="333333"/>
+          <w:sz w:val="22"/>
+          <w:szCs w:val="22"/>
+        </w:rPr>
+        <w:t xml:space="preserve">Layout utama Blade Template berhasil diterapkan dengan rapi menggunakan @extends dan @section tanpa perulangan kode.</w:t>
+      </w:r>
+    </w:p>
+    <w:p>
+      <w:pPr>
+        <w:numPr>
+          <w:ilvl w:val="0"/>
+          <w:numId w:val="5"/>
+        </w:numPr>
+      </w:pPr>
+      <w:r>
+        <w:rPr>
+          <w:rFonts w:ascii="Calibri" w:hAnsi="Calibri" w:eastAsia="Calibri" w:cs="Calibri"/>
+          <w:color w:val="333333"/>
+          <w:sz w:val="22"/>
+          <w:szCs w:val="22"/>
+        </w:rPr>
+        <w:t xml:space="preserve">Tampilan katalog Card Grid, Tampilan Tabel, Halaman Detail Kursus, serta navigasi antar halaman berfungsi dengan lancar dan responsif.</w:t>
+      </w:r>
+    </w:p>
+    <w:sectPr>
+      <w:pgSz w:orient="portrait" w:w="11905.511811023622" w:h="16837.79527559055"/>
+      <w:pgMar w:top="1200" w:right="1400" w:bottom="1200" w:left="1400" w:header="720" w:footer="720" w:gutter="0"/>
+      <w:cols w:num="1" w:space="720"/>
+    </w:sectPr>
+  </w:body>
+</w:document>
 </file>
 
 <file path=word/comments.xml><?xml version="1.0" encoding="utf-8"?>
@@ -10,7 +2004,7 @@
 <file path=word/numbering.xml><?xml version="1.0" encoding="utf-8"?>
 <w:numbering xmlns:ve="http://schemas.openxmlformats.org/markup-compatibility/2006" xmlns:o="urn:schemas-microsoft-com:office:office" xmlns:r="http://schemas.openxmlformats.org/officeDocument/2006/relationships" xmlns:m="http://schemas.openxmlformats.org/officeDocument/2006/math" xmlns:v="urn:schemas-microsoft-com:vml" xmlns:wp="http://schemas.openxmlformats.org/drawingml/2006/wordprocessingDrawing" xmlns:w10="urn:schemas-microsoft-com:office:word" xmlns:w="http://schemas.openxmlformats.org/wordprocessingml/2006/main" xmlns:wne="http://schemas.microsoft.com/office/word/2006/wordml">
   <w:abstractNum w:abstractNumId="5">
-    <w:nsid w:val="10A9FF15"/>
+    <w:nsid w:val="01D22FE4"/>
     <w:multiLevelType w:val="hybridMultilevel"/>
     <w:lvl w:ilvl="0">
       <w:start w:val="1"/>
@@ -192,13 +2186,13 @@
     <w:name w:val="heading 1"/>
     <w:basedOn w:val="Normal"/>
     <w:pPr>
-      <w:spacing w:after="240"/>
+      <w:spacing w:after="200"/>
     </w:pPr>
     <w:rPr>
       <w:rFonts w:ascii="Calibri" w:hAnsi="Calibri" w:eastAsia="Calibri" w:cs="Calibri"/>
       <w:color w:val="003366"/>
-      <w:sz w:val="36"/>
-      <w:szCs w:val="36"/>
+      <w:sz w:val="32"/>
+      <w:szCs w:val="32"/>
       <w:b w:val="1"/>
       <w:bCs w:val="1"/>
     </w:rPr>
@@ -208,13 +2202,13 @@
     <w:name w:val="heading 2"/>
     <w:basedOn w:val="Normal"/>
     <w:pPr>
-      <w:spacing w:before="240" w:after="120"/>
+      <w:spacing w:before="200" w:after="100"/>
     </w:pPr>
     <w:rPr>
       <w:rFonts w:ascii="Calibri" w:hAnsi="Calibri" w:eastAsia="Calibri" w:cs="Calibri"/>
       <w:color w:val="003366"/>
-      <w:sz w:val="28"/>
-      <w:szCs w:val="28"/>
+      <w:sz w:val="26"/>
+      <w:szCs w:val="26"/>
       <w:b w:val="1"/>
       <w:bCs w:val="1"/>
     </w:rPr>
@@ -224,13 +2218,13 @@
     <w:name w:val="heading 3"/>
     <w:basedOn w:val="Normal"/>
     <w:pPr>
-      <w:spacing w:before="180" w:after="80"/>
+      <w:spacing w:before="140" w:after="60"/>
     </w:pPr>
     <w:rPr>
       <w:rFonts w:ascii="Calibri" w:hAnsi="Calibri" w:eastAsia="Calibri" w:cs="Calibri"/>
       <w:color w:val="1E293B"/>
-      <w:sz w:val="24"/>
-      <w:szCs w:val="24"/>
+      <w:sz w:val="22"/>
+      <w:szCs w:val="22"/>
       <w:b w:val="1"/>
       <w:bCs w:val="1"/>
     </w:rPr>

</xml_diff>